<commit_message>
Add social media field in submti.html page and update admin panel for showing all the details about live fraud events, pending events, deleted events, and other information
</commit_message>
<xml_diff>
--- a/Fraud-checker promt.docx
+++ b/Fraud-checker promt.docx
@@ -924,6 +924,7 @@
       <w:pPr>
         <w:pStyle w:val="6"/>
         <w:numPr>
+          <w:ilvl w:val="0"/>
           <w:numId w:val="0"/>
         </w:numPr>
         <w:shd w:val="clear" w:color="auto" w:fill="FFFFFF"/>
@@ -940,6 +941,7 @@
       <w:pPr>
         <w:pStyle w:val="6"/>
         <w:numPr>
+          <w:ilvl w:val="0"/>
           <w:numId w:val="0"/>
         </w:numPr>
         <w:shd w:val="clear" w:color="auto" w:fill="FFFFFF"/>
@@ -1164,21 +1166,23 @@
       <w:pPr>
         <w:pStyle w:val="6"/>
         <w:numPr>
-          <w:numId w:val="0"/>
-        </w:numPr>
-        <w:shd w:val="clear" w:color="auto" w:fill="FFFFFF"/>
-        <w:spacing w:before="0" w:beforeAutospacing="0" w:after="0" w:afterAutospacing="0" w:line="240" w:lineRule="auto"/>
-        <w:rPr>
-          <w:rFonts w:hint="default" w:ascii="Arial" w:hAnsi="Arial" w:cs="Arial"/>
-          <w:color w:val="1F1F1F"/>
-          <w:lang w:val="en-US"/>
-        </w:rPr>
-      </w:pPr>
-    </w:p>
-    <w:p>
-      <w:pPr>
-        <w:pStyle w:val="6"/>
-        <w:numPr>
+          <w:ilvl w:val="0"/>
+          <w:numId w:val="0"/>
+        </w:numPr>
+        <w:shd w:val="clear" w:color="auto" w:fill="FFFFFF"/>
+        <w:spacing w:before="0" w:beforeAutospacing="0" w:after="0" w:afterAutospacing="0" w:line="240" w:lineRule="auto"/>
+        <w:rPr>
+          <w:rFonts w:hint="default" w:ascii="Arial" w:hAnsi="Arial" w:cs="Arial"/>
+          <w:color w:val="1F1F1F"/>
+          <w:lang w:val="en-US"/>
+        </w:rPr>
+      </w:pPr>
+    </w:p>
+    <w:p>
+      <w:pPr>
+        <w:pStyle w:val="6"/>
+        <w:numPr>
+          <w:ilvl w:val="0"/>
           <w:numId w:val="0"/>
         </w:numPr>
         <w:shd w:val="clear" w:color="auto" w:fill="FFFFFF"/>
@@ -1298,36 +1302,39 @@
       <w:pPr>
         <w:pStyle w:val="6"/>
         <w:numPr>
-          <w:numId w:val="0"/>
-        </w:numPr>
-        <w:shd w:val="clear" w:color="auto" w:fill="FFFFFF"/>
-        <w:spacing w:before="0" w:beforeAutospacing="0" w:after="0" w:afterAutospacing="0" w:line="240" w:lineRule="auto"/>
-        <w:rPr>
-          <w:rFonts w:hint="default" w:ascii="Arial" w:hAnsi="Arial" w:cs="Arial"/>
-          <w:color w:val="1F1F1F"/>
-          <w:lang w:val="en-US"/>
-        </w:rPr>
-      </w:pPr>
-    </w:p>
-    <w:p>
-      <w:pPr>
-        <w:pStyle w:val="6"/>
-        <w:numPr>
-          <w:numId w:val="0"/>
-        </w:numPr>
-        <w:shd w:val="clear" w:color="auto" w:fill="FFFFFF"/>
-        <w:spacing w:before="0" w:beforeAutospacing="0" w:after="0" w:afterAutospacing="0" w:line="240" w:lineRule="auto"/>
-        <w:rPr>
-          <w:rFonts w:hint="default" w:ascii="Arial" w:hAnsi="Arial" w:cs="Arial"/>
-          <w:color w:val="1F1F1F"/>
-          <w:lang w:val="en-US"/>
-        </w:rPr>
-      </w:pPr>
-    </w:p>
-    <w:p>
-      <w:pPr>
-        <w:pStyle w:val="6"/>
-        <w:numPr>
+          <w:ilvl w:val="0"/>
+          <w:numId w:val="0"/>
+        </w:numPr>
+        <w:shd w:val="clear" w:color="auto" w:fill="FFFFFF"/>
+        <w:spacing w:before="0" w:beforeAutospacing="0" w:after="0" w:afterAutospacing="0" w:line="240" w:lineRule="auto"/>
+        <w:rPr>
+          <w:rFonts w:hint="default" w:ascii="Arial" w:hAnsi="Arial" w:cs="Arial"/>
+          <w:color w:val="1F1F1F"/>
+          <w:lang w:val="en-US"/>
+        </w:rPr>
+      </w:pPr>
+    </w:p>
+    <w:p>
+      <w:pPr>
+        <w:pStyle w:val="6"/>
+        <w:numPr>
+          <w:ilvl w:val="0"/>
+          <w:numId w:val="0"/>
+        </w:numPr>
+        <w:shd w:val="clear" w:color="auto" w:fill="FFFFFF"/>
+        <w:spacing w:before="0" w:beforeAutospacing="0" w:after="0" w:afterAutospacing="0" w:line="240" w:lineRule="auto"/>
+        <w:rPr>
+          <w:rFonts w:hint="default" w:ascii="Arial" w:hAnsi="Arial" w:cs="Arial"/>
+          <w:color w:val="1F1F1F"/>
+          <w:lang w:val="en-US"/>
+        </w:rPr>
+      </w:pPr>
+    </w:p>
+    <w:p>
+      <w:pPr>
+        <w:pStyle w:val="6"/>
+        <w:numPr>
+          <w:ilvl w:val="0"/>
           <w:numId w:val="0"/>
         </w:numPr>
         <w:shd w:val="clear" w:color="auto" w:fill="FFFFFF"/>
@@ -1351,6 +1358,7 @@
       <w:pPr>
         <w:pStyle w:val="6"/>
         <w:numPr>
+          <w:ilvl w:val="0"/>
           <w:numId w:val="0"/>
         </w:numPr>
         <w:shd w:val="clear" w:color="auto" w:fill="FFFFFF"/>
@@ -1374,6 +1382,7 @@
       <w:pPr>
         <w:pStyle w:val="6"/>
         <w:numPr>
+          <w:ilvl w:val="0"/>
           <w:numId w:val="0"/>
         </w:numPr>
         <w:shd w:val="clear" w:color="auto" w:fill="FFFFFF"/>
@@ -1397,6 +1406,7 @@
       <w:pPr>
         <w:pStyle w:val="6"/>
         <w:numPr>
+          <w:ilvl w:val="0"/>
           <w:numId w:val="0"/>
         </w:numPr>
         <w:shd w:val="clear" w:color="auto" w:fill="FFFFFF"/>
@@ -1420,6 +1430,7 @@
       <w:pPr>
         <w:pStyle w:val="6"/>
         <w:numPr>
+          <w:ilvl w:val="0"/>
           <w:numId w:val="0"/>
         </w:numPr>
         <w:shd w:val="clear" w:color="auto" w:fill="FFFFFF"/>
@@ -1443,6 +1454,7 @@
       <w:pPr>
         <w:pStyle w:val="6"/>
         <w:numPr>
+          <w:ilvl w:val="0"/>
           <w:numId w:val="0"/>
         </w:numPr>
         <w:shd w:val="clear" w:color="auto" w:fill="FFFFFF"/>
@@ -1466,6 +1478,7 @@
       <w:pPr>
         <w:pStyle w:val="6"/>
         <w:numPr>
+          <w:ilvl w:val="0"/>
           <w:numId w:val="0"/>
         </w:numPr>
         <w:shd w:val="clear" w:color="auto" w:fill="FFFFFF"/>
@@ -1489,6 +1502,7 @@
       <w:pPr>
         <w:pStyle w:val="6"/>
         <w:numPr>
+          <w:ilvl w:val="0"/>
           <w:numId w:val="0"/>
         </w:numPr>
         <w:shd w:val="clear" w:color="auto" w:fill="FFFFFF"/>
@@ -1512,6 +1526,7 @@
       <w:pPr>
         <w:pStyle w:val="6"/>
         <w:numPr>
+          <w:ilvl w:val="0"/>
           <w:numId w:val="0"/>
         </w:numPr>
         <w:shd w:val="clear" w:color="auto" w:fill="FFFFFF"/>
@@ -1535,51 +1550,55 @@
       <w:pPr>
         <w:pStyle w:val="6"/>
         <w:numPr>
-          <w:numId w:val="0"/>
-        </w:numPr>
-        <w:shd w:val="clear" w:color="auto" w:fill="FFFFFF"/>
-        <w:spacing w:before="0" w:beforeAutospacing="0" w:after="0" w:afterAutospacing="0" w:line="240" w:lineRule="auto"/>
-        <w:rPr>
-          <w:rFonts w:hint="default" w:ascii="Arial" w:hAnsi="Arial" w:cs="Arial"/>
-          <w:color w:val="1F1F1F"/>
-          <w:lang w:val="en-US"/>
-        </w:rPr>
-      </w:pPr>
-    </w:p>
-    <w:p>
-      <w:pPr>
-        <w:pStyle w:val="6"/>
-        <w:numPr>
-          <w:numId w:val="0"/>
-        </w:numPr>
-        <w:shd w:val="clear" w:color="auto" w:fill="FFFFFF"/>
-        <w:spacing w:before="0" w:beforeAutospacing="0" w:after="0" w:afterAutospacing="0" w:line="240" w:lineRule="auto"/>
-        <w:rPr>
-          <w:rFonts w:hint="default" w:ascii="Arial" w:hAnsi="Arial" w:cs="Arial"/>
-          <w:color w:val="1F1F1F"/>
-          <w:lang w:val="en-US"/>
-        </w:rPr>
-      </w:pPr>
-    </w:p>
-    <w:p>
-      <w:pPr>
-        <w:pStyle w:val="6"/>
-        <w:numPr>
-          <w:numId w:val="0"/>
-        </w:numPr>
-        <w:shd w:val="clear" w:color="auto" w:fill="FFFFFF"/>
-        <w:spacing w:before="0" w:beforeAutospacing="0" w:after="0" w:afterAutospacing="0" w:line="240" w:lineRule="auto"/>
-        <w:rPr>
-          <w:rFonts w:hint="default" w:ascii="Arial" w:hAnsi="Arial" w:cs="Arial"/>
-          <w:color w:val="1F1F1F"/>
-          <w:lang w:val="en-US"/>
-        </w:rPr>
-      </w:pPr>
-    </w:p>
-    <w:p>
-      <w:pPr>
-        <w:pStyle w:val="6"/>
-        <w:numPr>
+          <w:ilvl w:val="0"/>
+          <w:numId w:val="0"/>
+        </w:numPr>
+        <w:shd w:val="clear" w:color="auto" w:fill="FFFFFF"/>
+        <w:spacing w:before="0" w:beforeAutospacing="0" w:after="0" w:afterAutospacing="0" w:line="240" w:lineRule="auto"/>
+        <w:rPr>
+          <w:rFonts w:hint="default" w:ascii="Arial" w:hAnsi="Arial" w:cs="Arial"/>
+          <w:color w:val="1F1F1F"/>
+          <w:lang w:val="en-US"/>
+        </w:rPr>
+      </w:pPr>
+    </w:p>
+    <w:p>
+      <w:pPr>
+        <w:pStyle w:val="6"/>
+        <w:numPr>
+          <w:ilvl w:val="0"/>
+          <w:numId w:val="0"/>
+        </w:numPr>
+        <w:shd w:val="clear" w:color="auto" w:fill="FFFFFF"/>
+        <w:spacing w:before="0" w:beforeAutospacing="0" w:after="0" w:afterAutospacing="0" w:line="240" w:lineRule="auto"/>
+        <w:rPr>
+          <w:rFonts w:hint="default" w:ascii="Arial" w:hAnsi="Arial" w:cs="Arial"/>
+          <w:color w:val="1F1F1F"/>
+          <w:lang w:val="en-US"/>
+        </w:rPr>
+      </w:pPr>
+    </w:p>
+    <w:p>
+      <w:pPr>
+        <w:pStyle w:val="6"/>
+        <w:numPr>
+          <w:ilvl w:val="0"/>
+          <w:numId w:val="0"/>
+        </w:numPr>
+        <w:shd w:val="clear" w:color="auto" w:fill="FFFFFF"/>
+        <w:spacing w:before="0" w:beforeAutospacing="0" w:after="0" w:afterAutospacing="0" w:line="240" w:lineRule="auto"/>
+        <w:rPr>
+          <w:rFonts w:hint="default" w:ascii="Arial" w:hAnsi="Arial" w:cs="Arial"/>
+          <w:color w:val="1F1F1F"/>
+          <w:lang w:val="en-US"/>
+        </w:rPr>
+      </w:pPr>
+    </w:p>
+    <w:p>
+      <w:pPr>
+        <w:pStyle w:val="6"/>
+        <w:numPr>
+          <w:ilvl w:val="0"/>
           <w:numId w:val="0"/>
         </w:numPr>
         <w:shd w:val="clear" w:color="auto" w:fill="FFFFFF"/>
@@ -1603,6 +1622,7 @@
       <w:pPr>
         <w:pStyle w:val="6"/>
         <w:numPr>
+          <w:ilvl w:val="0"/>
           <w:numId w:val="0"/>
         </w:numPr>
         <w:shd w:val="clear" w:color="auto" w:fill="FFFFFF"/>
@@ -1620,16 +1640,387 @@
           <w:lang w:val="en-US"/>
         </w:rPr>
         <w:t>All the fields are perfectly implemented without some exceptions. Fix the following issues -</w:t>
+      </w:r>
+    </w:p>
+    <w:p>
+      <w:pPr>
+        <w:pStyle w:val="6"/>
+        <w:numPr>
+          <w:ilvl w:val="0"/>
+          <w:numId w:val="8"/>
+        </w:numPr>
+        <w:shd w:val="clear" w:color="auto" w:fill="FFFFFF"/>
+        <w:spacing w:before="0" w:beforeAutospacing="0" w:after="0" w:afterAutospacing="0" w:line="240" w:lineRule="auto"/>
+        <w:ind w:firstLine="720" w:firstLineChars="0"/>
+        <w:rPr>
+          <w:rFonts w:hint="default" w:ascii="Arial" w:hAnsi="Arial" w:cs="Arial"/>
+          <w:color w:val="1F1F1F"/>
+          <w:lang w:val="en-US"/>
+        </w:rPr>
+      </w:pPr>
+      <w:r>
+        <w:rPr>
+          <w:rFonts w:hint="default" w:ascii="Arial" w:hAnsi="Arial" w:cs="Arial"/>
+          <w:color w:val="1F1F1F"/>
+          <w:lang w:val="en-US"/>
+        </w:rPr>
+        <w:t>For ‘imposter picture’ field, user can remove the image from the preview section (if not want to upload)</w:t>
+      </w:r>
+    </w:p>
+    <w:p>
+      <w:pPr>
+        <w:pStyle w:val="6"/>
+        <w:numPr>
+          <w:ilvl w:val="0"/>
+          <w:numId w:val="8"/>
+        </w:numPr>
+        <w:shd w:val="clear" w:color="auto" w:fill="FFFFFF"/>
+        <w:spacing w:before="0" w:beforeAutospacing="0" w:after="0" w:afterAutospacing="0" w:line="240" w:lineRule="auto"/>
+        <w:ind w:firstLine="720" w:firstLineChars="0"/>
+        <w:rPr>
+          <w:rFonts w:hint="default" w:ascii="Arial" w:hAnsi="Arial" w:cs="Arial"/>
+          <w:color w:val="1F1F1F"/>
+          <w:lang w:val="en-US"/>
+        </w:rPr>
+      </w:pPr>
+      <w:r>
+        <w:rPr>
+          <w:rFonts w:hint="default" w:ascii="Arial" w:hAnsi="Arial" w:cs="Arial"/>
+          <w:color w:val="1F1F1F"/>
+          <w:lang w:val="en-US"/>
+        </w:rPr>
+        <w:t xml:space="preserve">For the ‘prof of the scam’ field, user can add multiple files altogether (at once) and also can add one after another (multiple times). Also the image/files can be removed from preview section (if user not want to upload the image/file). Note: total files must not more than 20. </w:t>
+      </w:r>
+    </w:p>
+    <w:p>
+      <w:pPr>
+        <w:pStyle w:val="6"/>
+        <w:numPr>
+          <w:ilvl w:val="0"/>
+          <w:numId w:val="8"/>
+        </w:numPr>
+        <w:shd w:val="clear" w:color="auto" w:fill="FFFFFF"/>
+        <w:spacing w:before="0" w:beforeAutospacing="0" w:after="0" w:afterAutospacing="0" w:line="240" w:lineRule="auto"/>
+        <w:ind w:firstLine="720" w:firstLineChars="0"/>
+        <w:rPr>
+          <w:rFonts w:hint="default" w:ascii="Arial" w:hAnsi="Arial" w:cs="Arial"/>
+          <w:color w:val="1F1F1F"/>
+          <w:lang w:val="en-US"/>
+        </w:rPr>
+      </w:pPr>
+      <w:r>
+        <w:rPr>
+          <w:rFonts w:hint="default" w:ascii="Arial" w:hAnsi="Arial" w:cs="Arial"/>
+          <w:color w:val="1F1F1F"/>
+          <w:lang w:val="en-US"/>
+        </w:rPr>
+        <w:t>For “alternate phone number of the scammer” filed, add a (+) button for adding multiple alternative phone number.</w:t>
+      </w:r>
+    </w:p>
+    <w:p>
+      <w:pPr>
+        <w:pStyle w:val="6"/>
+        <w:numPr>
+          <w:ilvl w:val="0"/>
+          <w:numId w:val="0"/>
+        </w:numPr>
+        <w:shd w:val="clear" w:color="auto" w:fill="FFFFFF"/>
+        <w:spacing w:before="0" w:beforeAutospacing="0" w:after="0" w:afterAutospacing="0" w:line="240" w:lineRule="auto"/>
+        <w:rPr>
+          <w:rFonts w:hint="default" w:ascii="Arial" w:hAnsi="Arial" w:cs="Arial"/>
+          <w:color w:val="1F1F1F"/>
+          <w:lang w:val="en-US"/>
+        </w:rPr>
+      </w:pPr>
+    </w:p>
+    <w:p>
+      <w:pPr>
+        <w:pStyle w:val="6"/>
+        <w:numPr>
+          <w:ilvl w:val="0"/>
+          <w:numId w:val="0"/>
+        </w:numPr>
+        <w:shd w:val="clear" w:color="auto" w:fill="FFFFFF"/>
+        <w:spacing w:before="0" w:beforeAutospacing="0" w:after="0" w:afterAutospacing="0" w:line="240" w:lineRule="auto"/>
+        <w:rPr>
+          <w:rFonts w:hint="default" w:ascii="Arial" w:hAnsi="Arial" w:cs="Arial"/>
+          <w:color w:val="1F1F1F"/>
+          <w:lang w:val="en-US"/>
+        </w:rPr>
+      </w:pPr>
+      <w:r>
+        <w:rPr>
+          <w:rFonts w:hint="default" w:ascii="Arial" w:hAnsi="Arial" w:cs="Arial"/>
+          <w:color w:val="1F1F1F"/>
+          <w:lang w:val="en-US"/>
+        </w:rPr>
+        <w:t>Constraints:</w:t>
+      </w:r>
+    </w:p>
+    <w:p>
+      <w:pPr>
+        <w:pStyle w:val="6"/>
+        <w:numPr>
+          <w:ilvl w:val="0"/>
+          <w:numId w:val="0"/>
+        </w:numPr>
+        <w:shd w:val="clear" w:color="auto" w:fill="FFFFFF"/>
+        <w:spacing w:before="0" w:beforeAutospacing="0" w:after="0" w:afterAutospacing="0" w:line="240" w:lineRule="auto"/>
+        <w:rPr>
+          <w:rFonts w:hint="default" w:ascii="Arial" w:hAnsi="Arial" w:cs="Arial"/>
+          <w:color w:val="1F1F1F"/>
+          <w:lang w:val="en-US"/>
+        </w:rPr>
+      </w:pPr>
+      <w:r>
+        <w:rPr>
+          <w:rFonts w:hint="default" w:ascii="Arial" w:hAnsi="Arial" w:cs="Arial"/>
+          <w:color w:val="1F1F1F"/>
+          <w:lang w:val="en-US"/>
+        </w:rPr>
+        <w:t>Update the database schema for holding the changes.</w:t>
+      </w:r>
+    </w:p>
+    <w:p>
+      <w:pPr>
+        <w:pStyle w:val="6"/>
+        <w:numPr>
+          <w:ilvl w:val="0"/>
+          <w:numId w:val="0"/>
+        </w:numPr>
+        <w:shd w:val="clear" w:color="auto" w:fill="FFFFFF"/>
+        <w:spacing w:before="0" w:beforeAutospacing="0" w:after="0" w:afterAutospacing="0" w:line="240" w:lineRule="auto"/>
+        <w:rPr>
+          <w:rFonts w:hint="default" w:ascii="Arial" w:hAnsi="Arial" w:cs="Arial"/>
+          <w:color w:val="1F1F1F"/>
+          <w:lang w:val="en-US"/>
+        </w:rPr>
+      </w:pPr>
+    </w:p>
+    <w:p>
+      <w:pPr>
+        <w:pStyle w:val="6"/>
+        <w:numPr>
+          <w:ilvl w:val="0"/>
+          <w:numId w:val="0"/>
+        </w:numPr>
+        <w:shd w:val="clear" w:color="auto" w:fill="FFFFFF"/>
+        <w:spacing w:before="0" w:beforeAutospacing="0" w:after="0" w:afterAutospacing="0" w:line="240" w:lineRule="auto"/>
+        <w:rPr>
+          <w:rFonts w:hint="default" w:ascii="Arial" w:hAnsi="Arial" w:cs="Arial"/>
+          <w:color w:val="1F1F1F"/>
+          <w:lang w:val="en-US"/>
+        </w:rPr>
+      </w:pPr>
+    </w:p>
+    <w:p>
+      <w:pPr>
+        <w:pStyle w:val="6"/>
+        <w:numPr>
+          <w:ilvl w:val="0"/>
+          <w:numId w:val="0"/>
+        </w:numPr>
+        <w:shd w:val="clear" w:color="auto" w:fill="FFFFFF"/>
+        <w:spacing w:before="0" w:beforeAutospacing="0" w:after="0" w:afterAutospacing="0" w:line="240" w:lineRule="auto"/>
+        <w:rPr>
+          <w:rFonts w:hint="default" w:ascii="Arial" w:hAnsi="Arial" w:cs="Arial"/>
+          <w:color w:val="1F1F1F"/>
+          <w:lang w:val="en-US"/>
+        </w:rPr>
+      </w:pPr>
+    </w:p>
+    <w:p>
+      <w:pPr>
+        <w:pStyle w:val="6"/>
+        <w:numPr>
+          <w:ilvl w:val="0"/>
+          <w:numId w:val="0"/>
+        </w:numPr>
+        <w:shd w:val="clear" w:color="auto" w:fill="FFFFFF"/>
+        <w:spacing w:before="0" w:beforeAutospacing="0" w:after="0" w:afterAutospacing="0" w:line="240" w:lineRule="auto"/>
+        <w:rPr>
+          <w:rFonts w:hint="default" w:ascii="Arial" w:hAnsi="Arial" w:cs="Arial"/>
+          <w:color w:val="1F1F1F"/>
+          <w:lang w:val="en-US"/>
+        </w:rPr>
+      </w:pPr>
+      <w:r>
+        <w:rPr>
+          <w:rFonts w:hint="default" w:ascii="Arial" w:hAnsi="Arial" w:cs="Arial"/>
+          <w:color w:val="1F1F1F"/>
+          <w:lang w:val="en-US"/>
+        </w:rPr>
+        <w:t>Today we will update our admin.html page.</w:t>
+      </w:r>
+      <w:r>
+        <w:rPr>
+          <w:rFonts w:hint="default" w:ascii="Arial" w:hAnsi="Arial" w:cs="Arial"/>
+          <w:color w:val="1F1F1F"/>
+          <w:lang w:val="en-US"/>
+        </w:rPr>
+        <w:br w:type="textWrapping"/>
+      </w:r>
+      <w:r>
+        <w:rPr>
+          <w:rFonts w:hint="default" w:ascii="Arial" w:hAnsi="Arial" w:cs="Arial"/>
+          <w:color w:val="1F1F1F"/>
+          <w:lang w:val="en-US"/>
+        </w:rPr>
+        <w:t>Context:</w:t>
+      </w:r>
+    </w:p>
+    <w:p>
+      <w:pPr>
+        <w:pStyle w:val="6"/>
+        <w:numPr>
+          <w:ilvl w:val="0"/>
+          <w:numId w:val="0"/>
+        </w:numPr>
+        <w:shd w:val="clear" w:color="auto" w:fill="FFFFFF"/>
+        <w:spacing w:before="0" w:beforeAutospacing="0" w:after="0" w:afterAutospacing="0" w:line="240" w:lineRule="auto"/>
+        <w:rPr>
+          <w:rFonts w:hint="default" w:ascii="Arial" w:hAnsi="Arial" w:cs="Arial"/>
+          <w:color w:val="1F1F1F"/>
+          <w:lang w:val="en-US"/>
+        </w:rPr>
+      </w:pPr>
+      <w:r>
+        <w:rPr>
+          <w:rFonts w:hint="default" w:ascii="Arial" w:hAnsi="Arial" w:cs="Arial"/>
+          <w:color w:val="1F1F1F"/>
+          <w:lang w:val="en-US"/>
+        </w:rPr>
+        <w:t>This page is only accessible to the authorized admin panel. They have the ultimate power to control all the information of the website. They should show all the currently live fraud events, pending fraud events, d</w:t>
       </w:r>
       <w:bookmarkStart w:id="0" w:name="_GoBack"/>
       <w:bookmarkEnd w:id="0"/>
-    </w:p>
-    <w:p>
-      <w:pPr>
-        <w:pStyle w:val="6"/>
-        <w:numPr>
-          <w:ilvl w:val="0"/>
-          <w:numId w:val="8"/>
+      <w:r>
+        <w:rPr>
+          <w:rFonts w:hint="default" w:ascii="Arial" w:hAnsi="Arial" w:cs="Arial"/>
+          <w:color w:val="1F1F1F"/>
+          <w:lang w:val="en-US"/>
+        </w:rPr>
+        <w:t>elete fraud events, imposter list, and reporter list. Also they can take action based on the current situation.</w:t>
+      </w:r>
+    </w:p>
+    <w:p>
+      <w:pPr>
+        <w:pStyle w:val="6"/>
+        <w:numPr>
+          <w:ilvl w:val="0"/>
+          <w:numId w:val="0"/>
+        </w:numPr>
+        <w:shd w:val="clear" w:color="auto" w:fill="FFFFFF"/>
+        <w:spacing w:before="0" w:beforeAutospacing="0" w:after="0" w:afterAutospacing="0" w:line="240" w:lineRule="auto"/>
+        <w:rPr>
+          <w:rFonts w:hint="default" w:ascii="Arial" w:hAnsi="Arial" w:cs="Arial"/>
+          <w:color w:val="1F1F1F"/>
+          <w:lang w:val="en-US"/>
+        </w:rPr>
+      </w:pPr>
+    </w:p>
+    <w:p>
+      <w:pPr>
+        <w:pStyle w:val="6"/>
+        <w:numPr>
+          <w:ilvl w:val="0"/>
+          <w:numId w:val="0"/>
+        </w:numPr>
+        <w:shd w:val="clear" w:color="auto" w:fill="FFFFFF"/>
+        <w:spacing w:before="0" w:beforeAutospacing="0" w:after="0" w:afterAutospacing="0" w:line="240" w:lineRule="auto"/>
+        <w:rPr>
+          <w:rFonts w:hint="default" w:ascii="Arial" w:hAnsi="Arial" w:cs="Arial"/>
+          <w:color w:val="1F1F1F"/>
+          <w:lang w:val="en-US"/>
+        </w:rPr>
+      </w:pPr>
+      <w:r>
+        <w:rPr>
+          <w:rFonts w:hint="default" w:ascii="Arial" w:hAnsi="Arial" w:cs="Arial"/>
+          <w:color w:val="1F1F1F"/>
+          <w:lang w:val="en-US"/>
+        </w:rPr>
+        <w:t>Task:</w:t>
+      </w:r>
+    </w:p>
+    <w:p>
+      <w:pPr>
+        <w:pStyle w:val="6"/>
+        <w:numPr>
+          <w:ilvl w:val="0"/>
+          <w:numId w:val="0"/>
+        </w:numPr>
+        <w:shd w:val="clear" w:color="auto" w:fill="FFFFFF"/>
+        <w:spacing w:before="0" w:beforeAutospacing="0" w:after="0" w:afterAutospacing="0" w:line="240" w:lineRule="auto"/>
+        <w:rPr>
+          <w:rFonts w:hint="default" w:ascii="Arial" w:hAnsi="Arial" w:cs="Arial"/>
+          <w:color w:val="1F1F1F"/>
+          <w:lang w:val="en-US"/>
+        </w:rPr>
+      </w:pPr>
+      <w:r>
+        <w:rPr>
+          <w:rFonts w:hint="default" w:ascii="Arial" w:hAnsi="Arial" w:cs="Arial"/>
+          <w:color w:val="1F1F1F"/>
+          <w:lang w:val="en-US"/>
+        </w:rPr>
+        <w:t>You’ve to update the admin.html page to cover all the cases described in context.</w:t>
+      </w:r>
+    </w:p>
+    <w:p>
+      <w:pPr>
+        <w:pStyle w:val="6"/>
+        <w:numPr>
+          <w:ilvl w:val="0"/>
+          <w:numId w:val="0"/>
+        </w:numPr>
+        <w:shd w:val="clear" w:color="auto" w:fill="FFFFFF"/>
+        <w:spacing w:before="0" w:beforeAutospacing="0" w:after="0" w:afterAutospacing="0" w:line="240" w:lineRule="auto"/>
+        <w:rPr>
+          <w:rFonts w:hint="default" w:ascii="Arial" w:hAnsi="Arial" w:cs="Arial"/>
+          <w:color w:val="1F1F1F"/>
+          <w:lang w:val="en-US"/>
+        </w:rPr>
+      </w:pPr>
+      <w:r>
+        <w:rPr>
+          <w:rFonts w:hint="default" w:ascii="Arial" w:hAnsi="Arial" w:cs="Arial"/>
+          <w:color w:val="1F1F1F"/>
+          <w:lang w:val="en-US"/>
+        </w:rPr>
+        <w:t>For the live fraud events -</w:t>
+      </w:r>
+    </w:p>
+    <w:p>
+      <w:pPr>
+        <w:pStyle w:val="6"/>
+        <w:numPr>
+          <w:ilvl w:val="0"/>
+          <w:numId w:val="0"/>
+        </w:numPr>
+        <w:shd w:val="clear" w:color="auto" w:fill="FFFFFF"/>
+        <w:spacing w:before="0" w:beforeAutospacing="0" w:after="0" w:afterAutospacing="0" w:line="240" w:lineRule="auto"/>
+        <w:rPr>
+          <w:rFonts w:hint="default" w:ascii="Arial" w:hAnsi="Arial" w:cs="Arial"/>
+          <w:color w:val="1F1F1F"/>
+          <w:lang w:val="en-US"/>
+        </w:rPr>
+      </w:pPr>
+      <w:r>
+        <w:rPr>
+          <w:rFonts w:hint="default" w:ascii="Arial" w:hAnsi="Arial" w:cs="Arial"/>
+          <w:color w:val="1F1F1F"/>
+          <w:lang w:val="en-US"/>
+        </w:rPr>
+        <w:t xml:space="preserve">All the events should be showed in a card format with some important information. This can be  - </w:t>
+      </w:r>
+    </w:p>
+    <w:p>
+      <w:pPr>
+        <w:pStyle w:val="6"/>
+        <w:numPr>
+          <w:ilvl w:val="0"/>
+          <w:numId w:val="9"/>
         </w:numPr>
         <w:shd w:val="clear" w:color="auto" w:fill="FFFFFF"/>
         <w:spacing w:before="0" w:beforeAutospacing="0" w:after="0" w:afterAutospacing="0" w:line="240" w:lineRule="auto"/>
@@ -1646,15 +2037,15 @@
           <w:color w:val="1F1F1F"/>
           <w:lang w:val="en-US"/>
         </w:rPr>
-        <w:t>For ‘imposter picture’ field, user can remove the image from the preview section (if not want to upload)</w:t>
-      </w:r>
-    </w:p>
-    <w:p>
-      <w:pPr>
-        <w:pStyle w:val="6"/>
-        <w:numPr>
-          <w:ilvl w:val="0"/>
-          <w:numId w:val="8"/>
+        <w:t>Scam type as title of the event</w:t>
+      </w:r>
+    </w:p>
+    <w:p>
+      <w:pPr>
+        <w:pStyle w:val="6"/>
+        <w:numPr>
+          <w:ilvl w:val="0"/>
+          <w:numId w:val="9"/>
         </w:numPr>
         <w:shd w:val="clear" w:color="auto" w:fill="FFFFFF"/>
         <w:spacing w:before="0" w:beforeAutospacing="0" w:after="0" w:afterAutospacing="0" w:line="240" w:lineRule="auto"/>
@@ -1671,15 +2062,15 @@
           <w:color w:val="1F1F1F"/>
           <w:lang w:val="en-US"/>
         </w:rPr>
-        <w:t xml:space="preserve">For the ‘prof of the scam’ field, user can add multiple files altogether (at once) and also can add one after another (multiple times). Also the image/files can be removed from preview section (if user not want to upload the image/file). Note: total files must not more than 20. </w:t>
-      </w:r>
-    </w:p>
-    <w:p>
-      <w:pPr>
-        <w:pStyle w:val="6"/>
-        <w:numPr>
-          <w:ilvl w:val="0"/>
-          <w:numId w:val="8"/>
+        <w:t>Scam description (within 100 words)</w:t>
+      </w:r>
+    </w:p>
+    <w:p>
+      <w:pPr>
+        <w:pStyle w:val="6"/>
+        <w:numPr>
+          <w:ilvl w:val="0"/>
+          <w:numId w:val="9"/>
         </w:numPr>
         <w:shd w:val="clear" w:color="auto" w:fill="FFFFFF"/>
         <w:spacing w:before="0" w:beforeAutospacing="0" w:after="0" w:afterAutospacing="0" w:line="240" w:lineRule="auto"/>
@@ -1696,7 +2087,1284 @@
           <w:color w:val="1F1F1F"/>
           <w:lang w:val="en-US"/>
         </w:rPr>
-        <w:t>For “alternate phone number of the scammer” filed, add a (+) button for adding multiple alternative phone number.</w:t>
+        <w:t>Loss amount</w:t>
+      </w:r>
+    </w:p>
+    <w:p>
+      <w:pPr>
+        <w:pStyle w:val="6"/>
+        <w:numPr>
+          <w:ilvl w:val="0"/>
+          <w:numId w:val="9"/>
+        </w:numPr>
+        <w:shd w:val="clear" w:color="auto" w:fill="FFFFFF"/>
+        <w:spacing w:before="0" w:beforeAutospacing="0" w:after="0" w:afterAutospacing="0" w:line="240" w:lineRule="auto"/>
+        <w:ind w:firstLine="720" w:firstLineChars="0"/>
+        <w:rPr>
+          <w:rFonts w:hint="default" w:ascii="Arial" w:hAnsi="Arial" w:cs="Arial"/>
+          <w:color w:val="1F1F1F"/>
+          <w:lang w:val="en-US"/>
+        </w:rPr>
+      </w:pPr>
+      <w:r>
+        <w:rPr>
+          <w:rFonts w:hint="default" w:ascii="Arial" w:hAnsi="Arial" w:cs="Arial"/>
+          <w:color w:val="1F1F1F"/>
+          <w:lang w:val="en-US"/>
+        </w:rPr>
+        <w:t>Date and time of submission</w:t>
+      </w:r>
+    </w:p>
+    <w:p>
+      <w:pPr>
+        <w:pStyle w:val="6"/>
+        <w:numPr>
+          <w:ilvl w:val="0"/>
+          <w:numId w:val="9"/>
+        </w:numPr>
+        <w:shd w:val="clear" w:color="auto" w:fill="FFFFFF"/>
+        <w:spacing w:before="0" w:beforeAutospacing="0" w:after="0" w:afterAutospacing="0" w:line="240" w:lineRule="auto"/>
+        <w:ind w:firstLine="720" w:firstLineChars="0"/>
+        <w:rPr>
+          <w:rFonts w:hint="default" w:ascii="Arial" w:hAnsi="Arial" w:cs="Arial"/>
+          <w:color w:val="1F1F1F"/>
+          <w:lang w:val="en-US"/>
+        </w:rPr>
+      </w:pPr>
+      <w:r>
+        <w:rPr>
+          <w:rFonts w:hint="default" w:ascii="Arial" w:hAnsi="Arial" w:cs="Arial"/>
+          <w:color w:val="1F1F1F"/>
+          <w:lang w:val="en-US"/>
+        </w:rPr>
+        <w:t>Date and time of approval</w:t>
+      </w:r>
+    </w:p>
+    <w:p>
+      <w:pPr>
+        <w:pStyle w:val="6"/>
+        <w:numPr>
+          <w:ilvl w:val="0"/>
+          <w:numId w:val="9"/>
+        </w:numPr>
+        <w:shd w:val="clear" w:color="auto" w:fill="FFFFFF"/>
+        <w:spacing w:before="0" w:beforeAutospacing="0" w:after="0" w:afterAutospacing="0" w:line="240" w:lineRule="auto"/>
+        <w:ind w:firstLine="720" w:firstLineChars="0"/>
+        <w:rPr>
+          <w:rFonts w:hint="default" w:ascii="Arial" w:hAnsi="Arial" w:cs="Arial"/>
+          <w:color w:val="1F1F1F"/>
+          <w:lang w:val="en-US"/>
+        </w:rPr>
+      </w:pPr>
+      <w:r>
+        <w:rPr>
+          <w:rFonts w:hint="default" w:ascii="Arial" w:hAnsi="Arial" w:cs="Arial"/>
+          <w:color w:val="1F1F1F"/>
+          <w:lang w:val="en-US"/>
+        </w:rPr>
+        <w:t>Total live day (since time of approval)</w:t>
+      </w:r>
+    </w:p>
+    <w:p>
+      <w:pPr>
+        <w:pStyle w:val="6"/>
+        <w:numPr>
+          <w:ilvl w:val="0"/>
+          <w:numId w:val="9"/>
+        </w:numPr>
+        <w:shd w:val="clear" w:color="auto" w:fill="FFFFFF"/>
+        <w:spacing w:before="0" w:beforeAutospacing="0" w:after="0" w:afterAutospacing="0" w:line="240" w:lineRule="auto"/>
+        <w:ind w:firstLine="720" w:firstLineChars="0"/>
+        <w:rPr>
+          <w:rFonts w:hint="default" w:ascii="Arial" w:hAnsi="Arial" w:cs="Arial"/>
+          <w:color w:val="1F1F1F"/>
+          <w:lang w:val="en-US"/>
+        </w:rPr>
+      </w:pPr>
+      <w:r>
+        <w:rPr>
+          <w:rFonts w:hint="default" w:ascii="Arial" w:hAnsi="Arial" w:cs="Arial"/>
+          <w:color w:val="1F1F1F"/>
+          <w:lang w:val="en-US"/>
+        </w:rPr>
+        <w:t>Imposter name</w:t>
+      </w:r>
+    </w:p>
+    <w:p>
+      <w:pPr>
+        <w:pStyle w:val="6"/>
+        <w:numPr>
+          <w:ilvl w:val="0"/>
+          <w:numId w:val="9"/>
+        </w:numPr>
+        <w:shd w:val="clear" w:color="auto" w:fill="FFFFFF"/>
+        <w:spacing w:before="0" w:beforeAutospacing="0" w:after="0" w:afterAutospacing="0" w:line="240" w:lineRule="auto"/>
+        <w:ind w:firstLine="720" w:firstLineChars="0"/>
+        <w:rPr>
+          <w:rFonts w:hint="default" w:ascii="Arial" w:hAnsi="Arial" w:cs="Arial"/>
+          <w:color w:val="1F1F1F"/>
+          <w:lang w:val="en-US"/>
+        </w:rPr>
+      </w:pPr>
+      <w:r>
+        <w:rPr>
+          <w:rFonts w:hint="default" w:ascii="Arial" w:hAnsi="Arial" w:cs="Arial"/>
+          <w:color w:val="1F1F1F"/>
+          <w:lang w:val="en-US"/>
+        </w:rPr>
+        <w:t>Reporter name</w:t>
+      </w:r>
+    </w:p>
+    <w:p>
+      <w:pPr>
+        <w:pStyle w:val="6"/>
+        <w:numPr>
+          <w:ilvl w:val="0"/>
+          <w:numId w:val="9"/>
+        </w:numPr>
+        <w:shd w:val="clear" w:color="auto" w:fill="FFFFFF"/>
+        <w:spacing w:before="0" w:beforeAutospacing="0" w:after="0" w:afterAutospacing="0" w:line="240" w:lineRule="auto"/>
+        <w:ind w:firstLine="720" w:firstLineChars="0"/>
+        <w:rPr>
+          <w:rFonts w:hint="default" w:ascii="Arial" w:hAnsi="Arial" w:cs="Arial"/>
+          <w:color w:val="1F1F1F"/>
+          <w:lang w:val="en-US"/>
+        </w:rPr>
+      </w:pPr>
+      <w:r>
+        <w:rPr>
+          <w:rFonts w:hint="default" w:ascii="Arial" w:hAnsi="Arial" w:cs="Arial"/>
+          <w:color w:val="1F1F1F"/>
+          <w:lang w:val="en-US"/>
+        </w:rPr>
+        <w:t>Approved admin name (implemented later, since admin panel is not created yet)</w:t>
+      </w:r>
+    </w:p>
+    <w:p>
+      <w:pPr>
+        <w:pStyle w:val="6"/>
+        <w:numPr>
+          <w:ilvl w:val="0"/>
+          <w:numId w:val="9"/>
+        </w:numPr>
+        <w:shd w:val="clear" w:color="auto" w:fill="FFFFFF"/>
+        <w:spacing w:before="0" w:beforeAutospacing="0" w:after="0" w:afterAutospacing="0" w:line="240" w:lineRule="auto"/>
+        <w:ind w:firstLine="720" w:firstLineChars="0"/>
+        <w:rPr>
+          <w:rFonts w:hint="default" w:ascii="Arial" w:hAnsi="Arial" w:cs="Arial"/>
+          <w:color w:val="1F1F1F"/>
+          <w:lang w:val="en-US"/>
+        </w:rPr>
+      </w:pPr>
+      <w:r>
+        <w:rPr>
+          <w:rFonts w:hint="default" w:ascii="Arial" w:hAnsi="Arial" w:cs="Arial"/>
+          <w:color w:val="1F1F1F"/>
+          <w:lang w:val="en-US"/>
+        </w:rPr>
+        <w:t>Event status</w:t>
+      </w:r>
+    </w:p>
+    <w:p>
+      <w:pPr>
+        <w:pStyle w:val="6"/>
+        <w:numPr>
+          <w:ilvl w:val="0"/>
+          <w:numId w:val="9"/>
+        </w:numPr>
+        <w:shd w:val="clear" w:color="auto" w:fill="FFFFFF"/>
+        <w:spacing w:before="0" w:beforeAutospacing="0" w:after="0" w:afterAutospacing="0" w:line="240" w:lineRule="auto"/>
+        <w:ind w:firstLine="720" w:firstLineChars="0"/>
+        <w:rPr>
+          <w:rFonts w:hint="default" w:ascii="Arial" w:hAnsi="Arial" w:cs="Arial"/>
+          <w:color w:val="1F1F1F"/>
+          <w:lang w:val="en-US"/>
+        </w:rPr>
+      </w:pPr>
+      <w:r>
+        <w:rPr>
+          <w:rFonts w:hint="default" w:ascii="Arial" w:hAnsi="Arial" w:cs="Arial"/>
+          <w:color w:val="1F1F1F"/>
+          <w:lang w:val="en-US"/>
+        </w:rPr>
+        <w:t>Button for delete the event</w:t>
+      </w:r>
+    </w:p>
+    <w:p>
+      <w:pPr>
+        <w:pStyle w:val="6"/>
+        <w:numPr>
+          <w:numId w:val="0"/>
+        </w:numPr>
+        <w:shd w:val="clear" w:color="auto" w:fill="FFFFFF"/>
+        <w:spacing w:before="0" w:beforeAutospacing="0" w:after="0" w:afterAutospacing="0" w:line="240" w:lineRule="auto"/>
+        <w:rPr>
+          <w:rFonts w:hint="default" w:ascii="Arial" w:hAnsi="Arial" w:cs="Arial"/>
+          <w:color w:val="1F1F1F"/>
+          <w:lang w:val="en-US"/>
+        </w:rPr>
+      </w:pPr>
+    </w:p>
+    <w:p>
+      <w:pPr>
+        <w:pStyle w:val="6"/>
+        <w:numPr>
+          <w:numId w:val="0"/>
+        </w:numPr>
+        <w:shd w:val="clear" w:color="auto" w:fill="FFFFFF"/>
+        <w:spacing w:before="0" w:beforeAutospacing="0" w:after="0" w:afterAutospacing="0" w:line="240" w:lineRule="auto"/>
+        <w:rPr>
+          <w:rFonts w:hint="default" w:ascii="Arial" w:hAnsi="Arial" w:cs="Arial"/>
+          <w:color w:val="1F1F1F"/>
+          <w:lang w:val="en-US"/>
+        </w:rPr>
+      </w:pPr>
+      <w:r>
+        <w:rPr>
+          <w:rFonts w:hint="default" w:ascii="Arial" w:hAnsi="Arial" w:cs="Arial"/>
+          <w:color w:val="1F1F1F"/>
+          <w:lang w:val="en-US"/>
+        </w:rPr>
+        <w:t xml:space="preserve">After clicking the card, it will show all the details about the event. All the submitted information by the reporter and also some additional information like - </w:t>
+      </w:r>
+    </w:p>
+    <w:p>
+      <w:pPr>
+        <w:pStyle w:val="6"/>
+        <w:numPr>
+          <w:ilvl w:val="0"/>
+          <w:numId w:val="10"/>
+        </w:numPr>
+        <w:shd w:val="clear" w:color="auto" w:fill="FFFFFF"/>
+        <w:spacing w:before="0" w:beforeAutospacing="0" w:after="0" w:afterAutospacing="0" w:line="240" w:lineRule="auto"/>
+        <w:ind w:firstLine="720" w:firstLineChars="0"/>
+        <w:rPr>
+          <w:rFonts w:hint="default" w:ascii="Arial" w:hAnsi="Arial" w:cs="Arial"/>
+          <w:color w:val="1F1F1F"/>
+          <w:lang w:val="en-US"/>
+        </w:rPr>
+      </w:pPr>
+      <w:r>
+        <w:rPr>
+          <w:rFonts w:hint="default" w:ascii="Arial" w:hAnsi="Arial" w:cs="Arial"/>
+          <w:color w:val="1F1F1F"/>
+          <w:lang w:val="en-US"/>
+        </w:rPr>
+        <w:t>Date of submission</w:t>
+      </w:r>
+    </w:p>
+    <w:p>
+      <w:pPr>
+        <w:pStyle w:val="6"/>
+        <w:numPr>
+          <w:ilvl w:val="0"/>
+          <w:numId w:val="10"/>
+        </w:numPr>
+        <w:shd w:val="clear" w:color="auto" w:fill="FFFFFF"/>
+        <w:spacing w:before="0" w:beforeAutospacing="0" w:after="0" w:afterAutospacing="0" w:line="240" w:lineRule="auto"/>
+        <w:ind w:firstLine="720" w:firstLineChars="0"/>
+        <w:rPr>
+          <w:rFonts w:hint="default" w:ascii="Arial" w:hAnsi="Arial" w:cs="Arial"/>
+          <w:color w:val="1F1F1F"/>
+          <w:lang w:val="en-US"/>
+        </w:rPr>
+      </w:pPr>
+      <w:r>
+        <w:rPr>
+          <w:rFonts w:hint="default" w:ascii="Arial" w:hAnsi="Arial" w:cs="Arial"/>
+          <w:color w:val="1F1F1F"/>
+          <w:lang w:val="en-US"/>
+        </w:rPr>
+        <w:t>Other fraud events of the imposter (if exists)</w:t>
+      </w:r>
+    </w:p>
+    <w:p>
+      <w:pPr>
+        <w:pStyle w:val="6"/>
+        <w:numPr>
+          <w:ilvl w:val="0"/>
+          <w:numId w:val="10"/>
+        </w:numPr>
+        <w:shd w:val="clear" w:color="auto" w:fill="FFFFFF"/>
+        <w:spacing w:before="0" w:beforeAutospacing="0" w:after="0" w:afterAutospacing="0" w:line="240" w:lineRule="auto"/>
+        <w:ind w:firstLine="720" w:firstLineChars="0"/>
+        <w:rPr>
+          <w:rFonts w:hint="default" w:ascii="Arial" w:hAnsi="Arial" w:cs="Arial"/>
+          <w:color w:val="1F1F1F"/>
+          <w:lang w:val="en-US"/>
+        </w:rPr>
+      </w:pPr>
+      <w:r>
+        <w:rPr>
+          <w:rFonts w:hint="default" w:ascii="Arial" w:hAnsi="Arial" w:cs="Arial"/>
+          <w:color w:val="1F1F1F"/>
+          <w:lang w:val="en-US"/>
+        </w:rPr>
+        <w:t>Approval details (will be implemented later)</w:t>
+      </w:r>
+    </w:p>
+    <w:p>
+      <w:pPr>
+        <w:pStyle w:val="6"/>
+        <w:numPr>
+          <w:numId w:val="0"/>
+        </w:numPr>
+        <w:shd w:val="clear" w:color="auto" w:fill="FFFFFF"/>
+        <w:spacing w:before="0" w:beforeAutospacing="0" w:after="0" w:afterAutospacing="0" w:line="240" w:lineRule="auto"/>
+        <w:rPr>
+          <w:rFonts w:hint="default" w:ascii="Arial" w:hAnsi="Arial" w:cs="Arial"/>
+          <w:color w:val="1F1F1F"/>
+          <w:lang w:val="en-US"/>
+        </w:rPr>
+      </w:pPr>
+    </w:p>
+    <w:p>
+      <w:pPr>
+        <w:pStyle w:val="6"/>
+        <w:numPr>
+          <w:numId w:val="0"/>
+        </w:numPr>
+        <w:shd w:val="clear" w:color="auto" w:fill="FFFFFF"/>
+        <w:spacing w:before="0" w:beforeAutospacing="0" w:after="0" w:afterAutospacing="0" w:line="240" w:lineRule="auto"/>
+        <w:rPr>
+          <w:rFonts w:hint="default" w:ascii="Arial" w:hAnsi="Arial" w:cs="Arial"/>
+          <w:color w:val="1F1F1F"/>
+          <w:lang w:val="en-US"/>
+        </w:rPr>
+      </w:pPr>
+      <w:r>
+        <w:rPr>
+          <w:rFonts w:hint="default" w:ascii="Arial" w:hAnsi="Arial" w:cs="Arial"/>
+          <w:color w:val="1F1F1F"/>
+          <w:lang w:val="en-US"/>
+        </w:rPr>
+        <w:t>The information in the details should be shown in organized way. Like-</w:t>
+      </w:r>
+    </w:p>
+    <w:p>
+      <w:pPr>
+        <w:pStyle w:val="6"/>
+        <w:numPr>
+          <w:ilvl w:val="0"/>
+          <w:numId w:val="11"/>
+        </w:numPr>
+        <w:shd w:val="clear" w:color="auto" w:fill="FFFFFF"/>
+        <w:spacing w:before="0" w:beforeAutospacing="0" w:after="0" w:afterAutospacing="0" w:line="240" w:lineRule="auto"/>
+        <w:ind w:firstLine="720" w:firstLineChars="0"/>
+        <w:rPr>
+          <w:rFonts w:hint="default" w:ascii="Arial" w:hAnsi="Arial" w:cs="Arial"/>
+          <w:color w:val="1F1F1F"/>
+          <w:lang w:val="en-US"/>
+        </w:rPr>
+      </w:pPr>
+      <w:r>
+        <w:rPr>
+          <w:rFonts w:hint="default" w:ascii="Arial" w:hAnsi="Arial" w:cs="Arial"/>
+          <w:color w:val="1F1F1F"/>
+          <w:lang w:val="en-US"/>
+        </w:rPr>
+        <w:t>Imposter details (With other live fraud events in short card)</w:t>
+      </w:r>
+    </w:p>
+    <w:p>
+      <w:pPr>
+        <w:pStyle w:val="6"/>
+        <w:numPr>
+          <w:ilvl w:val="0"/>
+          <w:numId w:val="11"/>
+        </w:numPr>
+        <w:shd w:val="clear" w:color="auto" w:fill="FFFFFF"/>
+        <w:spacing w:before="0" w:beforeAutospacing="0" w:after="0" w:afterAutospacing="0" w:line="240" w:lineRule="auto"/>
+        <w:ind w:firstLine="720" w:firstLineChars="0"/>
+        <w:rPr>
+          <w:rFonts w:hint="default" w:ascii="Arial" w:hAnsi="Arial" w:cs="Arial"/>
+          <w:color w:val="1F1F1F"/>
+          <w:lang w:val="en-US"/>
+        </w:rPr>
+      </w:pPr>
+      <w:r>
+        <w:rPr>
+          <w:rFonts w:hint="default" w:ascii="Arial" w:hAnsi="Arial" w:cs="Arial"/>
+          <w:color w:val="1F1F1F"/>
+          <w:lang w:val="en-US"/>
+        </w:rPr>
+        <w:t>Scam details</w:t>
+      </w:r>
+    </w:p>
+    <w:p>
+      <w:pPr>
+        <w:pStyle w:val="6"/>
+        <w:numPr>
+          <w:ilvl w:val="0"/>
+          <w:numId w:val="11"/>
+        </w:numPr>
+        <w:shd w:val="clear" w:color="auto" w:fill="FFFFFF"/>
+        <w:spacing w:before="0" w:beforeAutospacing="0" w:after="0" w:afterAutospacing="0" w:line="240" w:lineRule="auto"/>
+        <w:ind w:firstLine="720" w:firstLineChars="0"/>
+        <w:rPr>
+          <w:rFonts w:hint="default" w:ascii="Arial" w:hAnsi="Arial" w:cs="Arial"/>
+          <w:color w:val="1F1F1F"/>
+          <w:lang w:val="en-US"/>
+        </w:rPr>
+      </w:pPr>
+      <w:r>
+        <w:rPr>
+          <w:rFonts w:hint="default" w:ascii="Arial" w:hAnsi="Arial" w:cs="Arial"/>
+          <w:color w:val="1F1F1F"/>
+          <w:lang w:val="en-US"/>
+        </w:rPr>
+        <w:t>Reporter details</w:t>
+      </w:r>
+    </w:p>
+    <w:p>
+      <w:pPr>
+        <w:pStyle w:val="6"/>
+        <w:numPr>
+          <w:ilvl w:val="0"/>
+          <w:numId w:val="11"/>
+        </w:numPr>
+        <w:shd w:val="clear" w:color="auto" w:fill="FFFFFF"/>
+        <w:spacing w:before="0" w:beforeAutospacing="0" w:after="0" w:afterAutospacing="0" w:line="240" w:lineRule="auto"/>
+        <w:ind w:firstLine="720" w:firstLineChars="0"/>
+        <w:rPr>
+          <w:rFonts w:hint="default" w:ascii="Arial" w:hAnsi="Arial" w:cs="Arial"/>
+          <w:color w:val="1F1F1F"/>
+          <w:lang w:val="en-US"/>
+        </w:rPr>
+      </w:pPr>
+      <w:r>
+        <w:rPr>
+          <w:rFonts w:hint="default" w:ascii="Arial" w:hAnsi="Arial" w:cs="Arial"/>
+          <w:color w:val="1F1F1F"/>
+          <w:lang w:val="en-US"/>
+        </w:rPr>
+        <w:t>Apporval details (Implemented later)</w:t>
+      </w:r>
+    </w:p>
+    <w:p>
+      <w:pPr>
+        <w:pStyle w:val="6"/>
+        <w:numPr>
+          <w:numId w:val="0"/>
+        </w:numPr>
+        <w:shd w:val="clear" w:color="auto" w:fill="FFFFFF"/>
+        <w:spacing w:before="0" w:beforeAutospacing="0" w:after="0" w:afterAutospacing="0" w:line="240" w:lineRule="auto"/>
+        <w:rPr>
+          <w:rFonts w:hint="default" w:ascii="Arial" w:hAnsi="Arial" w:cs="Arial"/>
+          <w:color w:val="1F1F1F"/>
+          <w:lang w:val="en-US"/>
+        </w:rPr>
+      </w:pPr>
+      <w:r>
+        <w:rPr>
+          <w:rFonts w:hint="default" w:ascii="Arial" w:hAnsi="Arial" w:cs="Arial"/>
+          <w:color w:val="1F1F1F"/>
+          <w:lang w:val="en-US"/>
+        </w:rPr>
+        <w:t xml:space="preserve">Add button for delete the event or edit request button to send edit request to the reporter. </w:t>
+      </w:r>
+    </w:p>
+    <w:p>
+      <w:pPr>
+        <w:pStyle w:val="6"/>
+        <w:numPr>
+          <w:numId w:val="0"/>
+        </w:numPr>
+        <w:shd w:val="clear" w:color="auto" w:fill="FFFFFF"/>
+        <w:spacing w:before="0" w:beforeAutospacing="0" w:after="0" w:afterAutospacing="0" w:line="240" w:lineRule="auto"/>
+        <w:rPr>
+          <w:rFonts w:hint="default" w:ascii="Arial" w:hAnsi="Arial" w:cs="Arial"/>
+          <w:color w:val="1F1F1F"/>
+          <w:lang w:val="en-US"/>
+        </w:rPr>
+      </w:pPr>
+    </w:p>
+    <w:p>
+      <w:pPr>
+        <w:pStyle w:val="6"/>
+        <w:numPr>
+          <w:numId w:val="0"/>
+        </w:numPr>
+        <w:shd w:val="clear" w:color="auto" w:fill="FFFFFF"/>
+        <w:spacing w:before="0" w:beforeAutospacing="0" w:after="0" w:afterAutospacing="0" w:line="240" w:lineRule="auto"/>
+        <w:rPr>
+          <w:rFonts w:hint="default" w:ascii="Arial" w:hAnsi="Arial" w:cs="Arial"/>
+          <w:color w:val="1F1F1F"/>
+          <w:lang w:val="en-US"/>
+        </w:rPr>
+      </w:pPr>
+    </w:p>
+    <w:p>
+      <w:pPr>
+        <w:pStyle w:val="6"/>
+        <w:numPr>
+          <w:numId w:val="0"/>
+        </w:numPr>
+        <w:shd w:val="clear" w:color="auto" w:fill="FFFFFF"/>
+        <w:spacing w:before="0" w:beforeAutospacing="0" w:after="0" w:afterAutospacing="0" w:line="240" w:lineRule="auto"/>
+        <w:rPr>
+          <w:rFonts w:hint="default" w:ascii="Arial" w:hAnsi="Arial" w:cs="Arial"/>
+          <w:color w:val="1F1F1F"/>
+          <w:lang w:val="en-US"/>
+        </w:rPr>
+      </w:pPr>
+      <w:r>
+        <w:rPr>
+          <w:rFonts w:hint="default" w:ascii="Arial" w:hAnsi="Arial" w:cs="Arial"/>
+          <w:color w:val="1F1F1F"/>
+          <w:lang w:val="en-US"/>
+        </w:rPr>
+        <w:t xml:space="preserve">For the pending fraud events - All the pending events should be shown in a list with some important information - </w:t>
+      </w:r>
+    </w:p>
+    <w:p>
+      <w:pPr>
+        <w:pStyle w:val="6"/>
+        <w:numPr>
+          <w:ilvl w:val="0"/>
+          <w:numId w:val="12"/>
+        </w:numPr>
+        <w:shd w:val="clear" w:color="auto" w:fill="FFFFFF"/>
+        <w:spacing w:before="0" w:beforeAutospacing="0" w:after="0" w:afterAutospacing="0" w:line="240" w:lineRule="auto"/>
+        <w:ind w:firstLine="720" w:firstLineChars="0"/>
+        <w:rPr>
+          <w:rFonts w:hint="default" w:ascii="Arial" w:hAnsi="Arial" w:cs="Arial"/>
+          <w:color w:val="1F1F1F"/>
+          <w:lang w:val="en-US"/>
+        </w:rPr>
+      </w:pPr>
+      <w:r>
+        <w:rPr>
+          <w:rFonts w:hint="default" w:ascii="Arial" w:hAnsi="Arial" w:cs="Arial"/>
+          <w:color w:val="1F1F1F"/>
+          <w:lang w:val="en-US"/>
+        </w:rPr>
+        <w:t>Scam type as title of the event</w:t>
+      </w:r>
+    </w:p>
+    <w:p>
+      <w:pPr>
+        <w:pStyle w:val="6"/>
+        <w:numPr>
+          <w:ilvl w:val="0"/>
+          <w:numId w:val="12"/>
+        </w:numPr>
+        <w:shd w:val="clear" w:color="auto" w:fill="FFFFFF"/>
+        <w:spacing w:before="0" w:beforeAutospacing="0" w:after="0" w:afterAutospacing="0" w:line="240" w:lineRule="auto"/>
+        <w:ind w:firstLine="720" w:firstLineChars="0"/>
+        <w:rPr>
+          <w:rFonts w:hint="default" w:ascii="Arial" w:hAnsi="Arial" w:cs="Arial"/>
+          <w:color w:val="1F1F1F"/>
+          <w:lang w:val="en-US"/>
+        </w:rPr>
+      </w:pPr>
+      <w:r>
+        <w:rPr>
+          <w:rFonts w:hint="default" w:ascii="Arial" w:hAnsi="Arial" w:cs="Arial"/>
+          <w:color w:val="1F1F1F"/>
+          <w:lang w:val="en-US"/>
+        </w:rPr>
+        <w:t>Scam description (within 100 words)</w:t>
+      </w:r>
+    </w:p>
+    <w:p>
+      <w:pPr>
+        <w:pStyle w:val="6"/>
+        <w:numPr>
+          <w:ilvl w:val="0"/>
+          <w:numId w:val="12"/>
+        </w:numPr>
+        <w:shd w:val="clear" w:color="auto" w:fill="FFFFFF"/>
+        <w:spacing w:before="0" w:beforeAutospacing="0" w:after="0" w:afterAutospacing="0" w:line="240" w:lineRule="auto"/>
+        <w:ind w:firstLine="720" w:firstLineChars="0"/>
+        <w:rPr>
+          <w:rFonts w:hint="default" w:ascii="Arial" w:hAnsi="Arial" w:cs="Arial"/>
+          <w:color w:val="1F1F1F"/>
+          <w:lang w:val="en-US"/>
+        </w:rPr>
+      </w:pPr>
+      <w:r>
+        <w:rPr>
+          <w:rFonts w:hint="default" w:ascii="Arial" w:hAnsi="Arial" w:cs="Arial"/>
+          <w:color w:val="1F1F1F"/>
+          <w:lang w:val="en-US"/>
+        </w:rPr>
+        <w:t>Loss amount</w:t>
+      </w:r>
+    </w:p>
+    <w:p>
+      <w:pPr>
+        <w:pStyle w:val="6"/>
+        <w:numPr>
+          <w:ilvl w:val="0"/>
+          <w:numId w:val="12"/>
+        </w:numPr>
+        <w:shd w:val="clear" w:color="auto" w:fill="FFFFFF"/>
+        <w:spacing w:before="0" w:beforeAutospacing="0" w:after="0" w:afterAutospacing="0" w:line="240" w:lineRule="auto"/>
+        <w:ind w:firstLine="720" w:firstLineChars="0"/>
+        <w:rPr>
+          <w:rFonts w:hint="default" w:ascii="Arial" w:hAnsi="Arial" w:cs="Arial"/>
+          <w:color w:val="1F1F1F"/>
+          <w:lang w:val="en-US"/>
+        </w:rPr>
+      </w:pPr>
+      <w:r>
+        <w:rPr>
+          <w:rFonts w:hint="default" w:ascii="Arial" w:hAnsi="Arial" w:cs="Arial"/>
+          <w:color w:val="1F1F1F"/>
+          <w:lang w:val="en-US"/>
+        </w:rPr>
+        <w:t>Date and time of submission</w:t>
+      </w:r>
+    </w:p>
+    <w:p>
+      <w:pPr>
+        <w:pStyle w:val="6"/>
+        <w:numPr>
+          <w:ilvl w:val="0"/>
+          <w:numId w:val="12"/>
+        </w:numPr>
+        <w:shd w:val="clear" w:color="auto" w:fill="FFFFFF"/>
+        <w:spacing w:before="0" w:beforeAutospacing="0" w:after="0" w:afterAutospacing="0" w:line="240" w:lineRule="auto"/>
+        <w:ind w:firstLine="720" w:firstLineChars="0"/>
+        <w:rPr>
+          <w:rFonts w:hint="default" w:ascii="Arial" w:hAnsi="Arial" w:cs="Arial"/>
+          <w:color w:val="1F1F1F"/>
+          <w:lang w:val="en-US"/>
+        </w:rPr>
+      </w:pPr>
+      <w:r>
+        <w:rPr>
+          <w:rFonts w:hint="default" w:ascii="Arial" w:hAnsi="Arial" w:cs="Arial"/>
+          <w:color w:val="1F1F1F"/>
+          <w:lang w:val="en-US"/>
+        </w:rPr>
+        <w:t>Imposter name</w:t>
+      </w:r>
+    </w:p>
+    <w:p>
+      <w:pPr>
+        <w:pStyle w:val="6"/>
+        <w:numPr>
+          <w:ilvl w:val="0"/>
+          <w:numId w:val="12"/>
+        </w:numPr>
+        <w:shd w:val="clear" w:color="auto" w:fill="FFFFFF"/>
+        <w:spacing w:before="0" w:beforeAutospacing="0" w:after="0" w:afterAutospacing="0" w:line="240" w:lineRule="auto"/>
+        <w:ind w:firstLine="720" w:firstLineChars="0"/>
+        <w:rPr>
+          <w:rFonts w:hint="default" w:ascii="Arial" w:hAnsi="Arial" w:cs="Arial"/>
+          <w:color w:val="1F1F1F"/>
+          <w:lang w:val="en-US"/>
+        </w:rPr>
+      </w:pPr>
+      <w:r>
+        <w:rPr>
+          <w:rFonts w:hint="default" w:ascii="Arial" w:hAnsi="Arial" w:cs="Arial"/>
+          <w:color w:val="1F1F1F"/>
+          <w:lang w:val="en-US"/>
+        </w:rPr>
+        <w:t>Reporter name</w:t>
+      </w:r>
+    </w:p>
+    <w:p>
+      <w:pPr>
+        <w:pStyle w:val="6"/>
+        <w:numPr>
+          <w:ilvl w:val="0"/>
+          <w:numId w:val="12"/>
+        </w:numPr>
+        <w:shd w:val="clear" w:color="auto" w:fill="FFFFFF"/>
+        <w:spacing w:before="0" w:beforeAutospacing="0" w:after="0" w:afterAutospacing="0" w:line="240" w:lineRule="auto"/>
+        <w:ind w:firstLine="720" w:firstLineChars="0"/>
+        <w:rPr>
+          <w:rFonts w:hint="default" w:ascii="Arial" w:hAnsi="Arial" w:cs="Arial"/>
+          <w:color w:val="1F1F1F"/>
+          <w:lang w:val="en-US"/>
+        </w:rPr>
+      </w:pPr>
+      <w:r>
+        <w:rPr>
+          <w:rFonts w:hint="default" w:ascii="Arial" w:hAnsi="Arial" w:cs="Arial"/>
+          <w:color w:val="1F1F1F"/>
+          <w:lang w:val="en-US"/>
+        </w:rPr>
+        <w:t>Event status</w:t>
+      </w:r>
+    </w:p>
+    <w:p>
+      <w:pPr>
+        <w:pStyle w:val="6"/>
+        <w:numPr>
+          <w:ilvl w:val="0"/>
+          <w:numId w:val="12"/>
+        </w:numPr>
+        <w:shd w:val="clear" w:color="auto" w:fill="FFFFFF"/>
+        <w:spacing w:before="0" w:beforeAutospacing="0" w:after="0" w:afterAutospacing="0" w:line="240" w:lineRule="auto"/>
+        <w:ind w:firstLine="720" w:firstLineChars="0"/>
+        <w:rPr>
+          <w:rFonts w:hint="default" w:ascii="Arial" w:hAnsi="Arial" w:cs="Arial"/>
+          <w:color w:val="1F1F1F"/>
+          <w:lang w:val="en-US"/>
+        </w:rPr>
+      </w:pPr>
+      <w:r>
+        <w:rPr>
+          <w:rFonts w:hint="default" w:ascii="Arial" w:hAnsi="Arial" w:cs="Arial"/>
+          <w:color w:val="1F1F1F"/>
+          <w:lang w:val="en-US"/>
+        </w:rPr>
+        <w:t>Button for approve the event</w:t>
+      </w:r>
+    </w:p>
+    <w:p>
+      <w:pPr>
+        <w:pStyle w:val="6"/>
+        <w:numPr>
+          <w:numId w:val="0"/>
+        </w:numPr>
+        <w:shd w:val="clear" w:color="auto" w:fill="FFFFFF"/>
+        <w:spacing w:before="0" w:beforeAutospacing="0" w:after="0" w:afterAutospacing="0" w:line="240" w:lineRule="auto"/>
+        <w:rPr>
+          <w:rFonts w:hint="default" w:ascii="Arial" w:hAnsi="Arial" w:cs="Arial"/>
+          <w:color w:val="1F1F1F"/>
+          <w:lang w:val="en-US"/>
+        </w:rPr>
+      </w:pPr>
+      <w:r>
+        <w:rPr>
+          <w:rFonts w:hint="default" w:ascii="Arial" w:hAnsi="Arial" w:cs="Arial"/>
+          <w:color w:val="1F1F1F"/>
+          <w:lang w:val="en-US"/>
+        </w:rPr>
+        <w:t xml:space="preserve">After clicking the card, it will show all the details about the event.The information should be shown in a organized way - </w:t>
+      </w:r>
+    </w:p>
+    <w:p>
+      <w:pPr>
+        <w:pStyle w:val="6"/>
+        <w:numPr>
+          <w:ilvl w:val="0"/>
+          <w:numId w:val="13"/>
+        </w:numPr>
+        <w:shd w:val="clear" w:color="auto" w:fill="FFFFFF"/>
+        <w:spacing w:before="0" w:beforeAutospacing="0" w:after="0" w:afterAutospacing="0" w:line="240" w:lineRule="auto"/>
+        <w:ind w:firstLine="720" w:firstLineChars="0"/>
+        <w:rPr>
+          <w:rFonts w:hint="default" w:ascii="Arial" w:hAnsi="Arial" w:cs="Arial"/>
+          <w:color w:val="1F1F1F"/>
+          <w:lang w:val="en-US"/>
+        </w:rPr>
+      </w:pPr>
+      <w:r>
+        <w:rPr>
+          <w:rFonts w:hint="default" w:ascii="Arial" w:hAnsi="Arial" w:cs="Arial"/>
+          <w:color w:val="1F1F1F"/>
+          <w:lang w:val="en-US"/>
+        </w:rPr>
+        <w:t>Imposter details (With other live fraud events in short card)</w:t>
+      </w:r>
+    </w:p>
+    <w:p>
+      <w:pPr>
+        <w:pStyle w:val="6"/>
+        <w:numPr>
+          <w:ilvl w:val="0"/>
+          <w:numId w:val="13"/>
+        </w:numPr>
+        <w:shd w:val="clear" w:color="auto" w:fill="FFFFFF"/>
+        <w:spacing w:before="0" w:beforeAutospacing="0" w:after="0" w:afterAutospacing="0" w:line="240" w:lineRule="auto"/>
+        <w:ind w:firstLine="720" w:firstLineChars="0"/>
+        <w:rPr>
+          <w:rFonts w:hint="default" w:ascii="Arial" w:hAnsi="Arial" w:cs="Arial"/>
+          <w:color w:val="1F1F1F"/>
+          <w:lang w:val="en-US"/>
+        </w:rPr>
+      </w:pPr>
+      <w:r>
+        <w:rPr>
+          <w:rFonts w:hint="default" w:ascii="Arial" w:hAnsi="Arial" w:cs="Arial"/>
+          <w:color w:val="1F1F1F"/>
+          <w:lang w:val="en-US"/>
+        </w:rPr>
+        <w:t>Scam details</w:t>
+      </w:r>
+    </w:p>
+    <w:p>
+      <w:pPr>
+        <w:pStyle w:val="6"/>
+        <w:numPr>
+          <w:ilvl w:val="0"/>
+          <w:numId w:val="13"/>
+        </w:numPr>
+        <w:shd w:val="clear" w:color="auto" w:fill="FFFFFF"/>
+        <w:spacing w:before="0" w:beforeAutospacing="0" w:after="0" w:afterAutospacing="0" w:line="240" w:lineRule="auto"/>
+        <w:ind w:firstLine="720" w:firstLineChars="0"/>
+        <w:rPr>
+          <w:rFonts w:hint="default" w:ascii="Arial" w:hAnsi="Arial" w:cs="Arial"/>
+          <w:color w:val="1F1F1F"/>
+          <w:lang w:val="en-US"/>
+        </w:rPr>
+      </w:pPr>
+      <w:r>
+        <w:rPr>
+          <w:rFonts w:hint="default" w:ascii="Arial" w:hAnsi="Arial" w:cs="Arial"/>
+          <w:color w:val="1F1F1F"/>
+          <w:lang w:val="en-US"/>
+        </w:rPr>
+        <w:t>Reporter details (With submission date and time)</w:t>
+      </w:r>
+    </w:p>
+    <w:p>
+      <w:pPr>
+        <w:pStyle w:val="6"/>
+        <w:numPr>
+          <w:numId w:val="0"/>
+        </w:numPr>
+        <w:shd w:val="clear" w:color="auto" w:fill="FFFFFF"/>
+        <w:spacing w:before="0" w:beforeAutospacing="0" w:after="0" w:afterAutospacing="0" w:line="240" w:lineRule="auto"/>
+        <w:rPr>
+          <w:rFonts w:hint="default" w:ascii="Arial" w:hAnsi="Arial" w:cs="Arial"/>
+          <w:color w:val="1F1F1F"/>
+          <w:lang w:val="en-US"/>
+        </w:rPr>
+      </w:pPr>
+      <w:r>
+        <w:rPr>
+          <w:rFonts w:hint="default" w:ascii="Arial" w:hAnsi="Arial" w:cs="Arial"/>
+          <w:color w:val="1F1F1F"/>
+          <w:lang w:val="en-US"/>
+        </w:rPr>
+        <w:t>Button for apporval, edit request, and reject the event.</w:t>
+      </w:r>
+    </w:p>
+    <w:p>
+      <w:pPr>
+        <w:pStyle w:val="6"/>
+        <w:numPr>
+          <w:numId w:val="0"/>
+        </w:numPr>
+        <w:shd w:val="clear" w:color="auto" w:fill="FFFFFF"/>
+        <w:spacing w:before="0" w:beforeAutospacing="0" w:after="0" w:afterAutospacing="0" w:line="240" w:lineRule="auto"/>
+        <w:rPr>
+          <w:rFonts w:hint="default" w:ascii="Arial" w:hAnsi="Arial" w:cs="Arial"/>
+          <w:color w:val="1F1F1F"/>
+          <w:lang w:val="en-US"/>
+        </w:rPr>
+      </w:pPr>
+    </w:p>
+    <w:p>
+      <w:pPr>
+        <w:pStyle w:val="6"/>
+        <w:numPr>
+          <w:numId w:val="0"/>
+        </w:numPr>
+        <w:shd w:val="clear" w:color="auto" w:fill="FFFFFF"/>
+        <w:spacing w:before="0" w:beforeAutospacing="0" w:after="0" w:afterAutospacing="0" w:line="240" w:lineRule="auto"/>
+        <w:rPr>
+          <w:rFonts w:hint="default" w:ascii="Arial" w:hAnsi="Arial" w:cs="Arial"/>
+          <w:color w:val="1F1F1F"/>
+          <w:lang w:val="en-US"/>
+        </w:rPr>
+      </w:pPr>
+      <w:r>
+        <w:rPr>
+          <w:rFonts w:hint="default" w:ascii="Arial" w:hAnsi="Arial" w:cs="Arial"/>
+          <w:color w:val="1F1F1F"/>
+          <w:lang w:val="en-US"/>
+        </w:rPr>
+        <w:t xml:space="preserve">In deleted fraud events - All the deleted events from live fraud events or pending fraud events will be shown here. First all the events shown in a list with the following information - </w:t>
+      </w:r>
+    </w:p>
+    <w:p>
+      <w:pPr>
+        <w:pStyle w:val="6"/>
+        <w:numPr>
+          <w:numId w:val="0"/>
+        </w:numPr>
+        <w:shd w:val="clear" w:color="auto" w:fill="FFFFFF"/>
+        <w:spacing w:before="0" w:beforeAutospacing="0" w:after="0" w:afterAutospacing="0" w:line="240" w:lineRule="auto"/>
+        <w:rPr>
+          <w:rFonts w:hint="default" w:ascii="Arial" w:hAnsi="Arial" w:cs="Arial"/>
+          <w:color w:val="1F1F1F"/>
+          <w:lang w:val="en-US"/>
+        </w:rPr>
+      </w:pPr>
+    </w:p>
+    <w:p>
+      <w:pPr>
+        <w:pStyle w:val="6"/>
+        <w:numPr>
+          <w:ilvl w:val="0"/>
+          <w:numId w:val="14"/>
+        </w:numPr>
+        <w:shd w:val="clear" w:color="auto" w:fill="FFFFFF"/>
+        <w:spacing w:before="0" w:beforeAutospacing="0" w:after="0" w:afterAutospacing="0" w:line="240" w:lineRule="auto"/>
+        <w:ind w:firstLine="720" w:firstLineChars="0"/>
+        <w:rPr>
+          <w:rFonts w:hint="default" w:ascii="Arial" w:hAnsi="Arial" w:cs="Arial"/>
+          <w:color w:val="1F1F1F"/>
+          <w:lang w:val="en-US"/>
+        </w:rPr>
+      </w:pPr>
+      <w:r>
+        <w:rPr>
+          <w:rFonts w:hint="default" w:ascii="Arial" w:hAnsi="Arial" w:cs="Arial"/>
+          <w:color w:val="1F1F1F"/>
+          <w:lang w:val="en-US"/>
+        </w:rPr>
+        <w:t>Scam type as title of the event</w:t>
+      </w:r>
+    </w:p>
+    <w:p>
+      <w:pPr>
+        <w:pStyle w:val="6"/>
+        <w:numPr>
+          <w:ilvl w:val="0"/>
+          <w:numId w:val="14"/>
+        </w:numPr>
+        <w:shd w:val="clear" w:color="auto" w:fill="FFFFFF"/>
+        <w:spacing w:before="0" w:beforeAutospacing="0" w:after="0" w:afterAutospacing="0" w:line="240" w:lineRule="auto"/>
+        <w:ind w:firstLine="720" w:firstLineChars="0"/>
+        <w:rPr>
+          <w:rFonts w:hint="default" w:ascii="Arial" w:hAnsi="Arial" w:cs="Arial"/>
+          <w:color w:val="1F1F1F"/>
+          <w:lang w:val="en-US"/>
+        </w:rPr>
+      </w:pPr>
+      <w:r>
+        <w:rPr>
+          <w:rFonts w:hint="default" w:ascii="Arial" w:hAnsi="Arial" w:cs="Arial"/>
+          <w:color w:val="1F1F1F"/>
+          <w:lang w:val="en-US"/>
+        </w:rPr>
+        <w:t>Scam description (within 100 words)</w:t>
+      </w:r>
+    </w:p>
+    <w:p>
+      <w:pPr>
+        <w:pStyle w:val="6"/>
+        <w:numPr>
+          <w:ilvl w:val="0"/>
+          <w:numId w:val="14"/>
+        </w:numPr>
+        <w:shd w:val="clear" w:color="auto" w:fill="FFFFFF"/>
+        <w:spacing w:before="0" w:beforeAutospacing="0" w:after="0" w:afterAutospacing="0" w:line="240" w:lineRule="auto"/>
+        <w:ind w:firstLine="720" w:firstLineChars="0"/>
+        <w:rPr>
+          <w:rFonts w:hint="default" w:ascii="Arial" w:hAnsi="Arial" w:cs="Arial"/>
+          <w:color w:val="1F1F1F"/>
+          <w:lang w:val="en-US"/>
+        </w:rPr>
+      </w:pPr>
+      <w:r>
+        <w:rPr>
+          <w:rFonts w:hint="default" w:ascii="Arial" w:hAnsi="Arial" w:cs="Arial"/>
+          <w:color w:val="1F1F1F"/>
+          <w:lang w:val="en-US"/>
+        </w:rPr>
+        <w:t>Loss amount</w:t>
+      </w:r>
+    </w:p>
+    <w:p>
+      <w:pPr>
+        <w:pStyle w:val="6"/>
+        <w:numPr>
+          <w:ilvl w:val="0"/>
+          <w:numId w:val="14"/>
+        </w:numPr>
+        <w:shd w:val="clear" w:color="auto" w:fill="FFFFFF"/>
+        <w:spacing w:before="0" w:beforeAutospacing="0" w:after="0" w:afterAutospacing="0" w:line="240" w:lineRule="auto"/>
+        <w:ind w:firstLine="720" w:firstLineChars="0"/>
+        <w:rPr>
+          <w:rFonts w:hint="default" w:ascii="Arial" w:hAnsi="Arial" w:cs="Arial"/>
+          <w:color w:val="1F1F1F"/>
+          <w:lang w:val="en-US"/>
+        </w:rPr>
+      </w:pPr>
+      <w:r>
+        <w:rPr>
+          <w:rFonts w:hint="default" w:ascii="Arial" w:hAnsi="Arial" w:cs="Arial"/>
+          <w:color w:val="1F1F1F"/>
+          <w:lang w:val="en-US"/>
+        </w:rPr>
+        <w:t>Date and time of submission</w:t>
+      </w:r>
+    </w:p>
+    <w:p>
+      <w:pPr>
+        <w:pStyle w:val="6"/>
+        <w:numPr>
+          <w:ilvl w:val="0"/>
+          <w:numId w:val="14"/>
+        </w:numPr>
+        <w:shd w:val="clear" w:color="auto" w:fill="FFFFFF"/>
+        <w:spacing w:before="0" w:beforeAutospacing="0" w:after="0" w:afterAutospacing="0" w:line="240" w:lineRule="auto"/>
+        <w:ind w:firstLine="720" w:firstLineChars="0"/>
+        <w:rPr>
+          <w:rFonts w:hint="default" w:ascii="Arial" w:hAnsi="Arial" w:cs="Arial"/>
+          <w:color w:val="1F1F1F"/>
+          <w:lang w:val="en-US"/>
+        </w:rPr>
+      </w:pPr>
+      <w:r>
+        <w:rPr>
+          <w:rFonts w:hint="default" w:ascii="Arial" w:hAnsi="Arial" w:cs="Arial"/>
+          <w:color w:val="1F1F1F"/>
+          <w:lang w:val="en-US"/>
+        </w:rPr>
+        <w:t>Date and time of rejection</w:t>
+      </w:r>
+    </w:p>
+    <w:p>
+      <w:pPr>
+        <w:pStyle w:val="6"/>
+        <w:numPr>
+          <w:ilvl w:val="0"/>
+          <w:numId w:val="14"/>
+        </w:numPr>
+        <w:shd w:val="clear" w:color="auto" w:fill="FFFFFF"/>
+        <w:spacing w:before="0" w:beforeAutospacing="0" w:after="0" w:afterAutospacing="0" w:line="240" w:lineRule="auto"/>
+        <w:ind w:firstLine="720" w:firstLineChars="0"/>
+        <w:rPr>
+          <w:rFonts w:hint="default" w:ascii="Arial" w:hAnsi="Arial" w:cs="Arial"/>
+          <w:color w:val="1F1F1F"/>
+          <w:lang w:val="en-US"/>
+        </w:rPr>
+      </w:pPr>
+      <w:r>
+        <w:rPr>
+          <w:rFonts w:hint="default" w:ascii="Arial" w:hAnsi="Arial" w:cs="Arial"/>
+          <w:color w:val="1F1F1F"/>
+          <w:lang w:val="en-US"/>
+        </w:rPr>
+        <w:t>Total rejected day (since time of rejection)</w:t>
+      </w:r>
+    </w:p>
+    <w:p>
+      <w:pPr>
+        <w:pStyle w:val="6"/>
+        <w:numPr>
+          <w:ilvl w:val="0"/>
+          <w:numId w:val="14"/>
+        </w:numPr>
+        <w:shd w:val="clear" w:color="auto" w:fill="FFFFFF"/>
+        <w:spacing w:before="0" w:beforeAutospacing="0" w:after="0" w:afterAutospacing="0" w:line="240" w:lineRule="auto"/>
+        <w:ind w:firstLine="720" w:firstLineChars="0"/>
+        <w:rPr>
+          <w:rFonts w:hint="default" w:ascii="Arial" w:hAnsi="Arial" w:cs="Arial"/>
+          <w:color w:val="1F1F1F"/>
+          <w:lang w:val="en-US"/>
+        </w:rPr>
+      </w:pPr>
+      <w:r>
+        <w:rPr>
+          <w:rFonts w:hint="default" w:ascii="Arial" w:hAnsi="Arial" w:cs="Arial"/>
+          <w:color w:val="1F1F1F"/>
+          <w:lang w:val="en-US"/>
+        </w:rPr>
+        <w:t>Imposter name</w:t>
+      </w:r>
+    </w:p>
+    <w:p>
+      <w:pPr>
+        <w:pStyle w:val="6"/>
+        <w:numPr>
+          <w:ilvl w:val="0"/>
+          <w:numId w:val="14"/>
+        </w:numPr>
+        <w:shd w:val="clear" w:color="auto" w:fill="FFFFFF"/>
+        <w:spacing w:before="0" w:beforeAutospacing="0" w:after="0" w:afterAutospacing="0" w:line="240" w:lineRule="auto"/>
+        <w:ind w:firstLine="720" w:firstLineChars="0"/>
+        <w:rPr>
+          <w:rFonts w:hint="default" w:ascii="Arial" w:hAnsi="Arial" w:cs="Arial"/>
+          <w:color w:val="1F1F1F"/>
+          <w:lang w:val="en-US"/>
+        </w:rPr>
+      </w:pPr>
+      <w:r>
+        <w:rPr>
+          <w:rFonts w:hint="default" w:ascii="Arial" w:hAnsi="Arial" w:cs="Arial"/>
+          <w:color w:val="1F1F1F"/>
+          <w:lang w:val="en-US"/>
+        </w:rPr>
+        <w:t>Reporter name</w:t>
+      </w:r>
+    </w:p>
+    <w:p>
+      <w:pPr>
+        <w:pStyle w:val="6"/>
+        <w:numPr>
+          <w:ilvl w:val="0"/>
+          <w:numId w:val="14"/>
+        </w:numPr>
+        <w:shd w:val="clear" w:color="auto" w:fill="FFFFFF"/>
+        <w:spacing w:before="0" w:beforeAutospacing="0" w:after="0" w:afterAutospacing="0" w:line="240" w:lineRule="auto"/>
+        <w:ind w:firstLine="720" w:firstLineChars="0"/>
+        <w:rPr>
+          <w:rFonts w:hint="default" w:ascii="Arial" w:hAnsi="Arial" w:cs="Arial"/>
+          <w:color w:val="1F1F1F"/>
+          <w:lang w:val="en-US"/>
+        </w:rPr>
+      </w:pPr>
+      <w:r>
+        <w:rPr>
+          <w:rFonts w:hint="default" w:ascii="Arial" w:hAnsi="Arial" w:cs="Arial"/>
+          <w:color w:val="1F1F1F"/>
+          <w:lang w:val="en-US"/>
+        </w:rPr>
+        <w:t>Rejected admin name (implemented later, since admin panel is not created yet)</w:t>
+      </w:r>
+    </w:p>
+    <w:p>
+      <w:pPr>
+        <w:pStyle w:val="6"/>
+        <w:numPr>
+          <w:ilvl w:val="0"/>
+          <w:numId w:val="14"/>
+        </w:numPr>
+        <w:shd w:val="clear" w:color="auto" w:fill="FFFFFF"/>
+        <w:spacing w:before="0" w:beforeAutospacing="0" w:after="0" w:afterAutospacing="0" w:line="240" w:lineRule="auto"/>
+        <w:ind w:firstLine="720" w:firstLineChars="0"/>
+        <w:rPr>
+          <w:rFonts w:hint="default" w:ascii="Arial" w:hAnsi="Arial" w:cs="Arial"/>
+          <w:color w:val="1F1F1F"/>
+          <w:lang w:val="en-US"/>
+        </w:rPr>
+      </w:pPr>
+      <w:r>
+        <w:rPr>
+          <w:rFonts w:hint="default" w:ascii="Arial" w:hAnsi="Arial" w:cs="Arial"/>
+          <w:color w:val="1F1F1F"/>
+          <w:lang w:val="en-US"/>
+        </w:rPr>
+        <w:t>Rejected reason (submit by admin)</w:t>
+      </w:r>
+    </w:p>
+    <w:p>
+      <w:pPr>
+        <w:pStyle w:val="6"/>
+        <w:numPr>
+          <w:ilvl w:val="0"/>
+          <w:numId w:val="14"/>
+        </w:numPr>
+        <w:shd w:val="clear" w:color="auto" w:fill="FFFFFF"/>
+        <w:spacing w:before="0" w:beforeAutospacing="0" w:after="0" w:afterAutospacing="0" w:line="240" w:lineRule="auto"/>
+        <w:ind w:firstLine="720" w:firstLineChars="0"/>
+        <w:rPr>
+          <w:rFonts w:hint="default" w:ascii="Arial" w:hAnsi="Arial" w:cs="Arial"/>
+          <w:color w:val="1F1F1F"/>
+          <w:lang w:val="en-US"/>
+        </w:rPr>
+      </w:pPr>
+      <w:r>
+        <w:rPr>
+          <w:rFonts w:hint="default" w:ascii="Arial" w:hAnsi="Arial" w:cs="Arial"/>
+          <w:color w:val="1F1F1F"/>
+          <w:lang w:val="en-US"/>
+        </w:rPr>
+        <w:t>Event status (From where it is rejected)</w:t>
+      </w:r>
+    </w:p>
+    <w:p>
+      <w:pPr>
+        <w:pStyle w:val="6"/>
+        <w:numPr>
+          <w:ilvl w:val="0"/>
+          <w:numId w:val="14"/>
+        </w:numPr>
+        <w:shd w:val="clear" w:color="auto" w:fill="FFFFFF"/>
+        <w:spacing w:before="0" w:beforeAutospacing="0" w:after="0" w:afterAutospacing="0" w:line="240" w:lineRule="auto"/>
+        <w:ind w:firstLine="720" w:firstLineChars="0"/>
+        <w:rPr>
+          <w:rFonts w:hint="default" w:ascii="Arial" w:hAnsi="Arial" w:cs="Arial"/>
+          <w:color w:val="1F1F1F"/>
+          <w:lang w:val="en-US"/>
+        </w:rPr>
+      </w:pPr>
+      <w:r>
+        <w:rPr>
+          <w:rFonts w:hint="default" w:ascii="Arial" w:hAnsi="Arial" w:cs="Arial"/>
+          <w:color w:val="1F1F1F"/>
+          <w:lang w:val="en-US"/>
+        </w:rPr>
+        <w:t>Button for approve the event</w:t>
+      </w:r>
+    </w:p>
+    <w:p>
+      <w:pPr>
+        <w:pStyle w:val="6"/>
+        <w:numPr>
+          <w:numId w:val="0"/>
+        </w:numPr>
+        <w:shd w:val="clear" w:color="auto" w:fill="FFFFFF"/>
+        <w:spacing w:before="0" w:beforeAutospacing="0" w:after="0" w:afterAutospacing="0" w:line="240" w:lineRule="auto"/>
+        <w:rPr>
+          <w:rFonts w:hint="default" w:ascii="Arial" w:hAnsi="Arial" w:cs="Arial"/>
+          <w:color w:val="1F1F1F"/>
+          <w:lang w:val="en-US"/>
+        </w:rPr>
+      </w:pPr>
+      <w:r>
+        <w:rPr>
+          <w:rFonts w:hint="default" w:ascii="Arial" w:hAnsi="Arial" w:cs="Arial"/>
+          <w:color w:val="1F1F1F"/>
+          <w:lang w:val="en-US"/>
+        </w:rPr>
+        <w:t xml:space="preserve">After clicking the card, it will shows all the details about the deleted events and button for approve and edit request. </w:t>
+      </w:r>
+    </w:p>
+    <w:p>
+      <w:pPr>
+        <w:pStyle w:val="6"/>
+        <w:numPr>
+          <w:numId w:val="0"/>
+        </w:numPr>
+        <w:shd w:val="clear" w:color="auto" w:fill="FFFFFF"/>
+        <w:spacing w:before="0" w:beforeAutospacing="0" w:after="0" w:afterAutospacing="0" w:line="240" w:lineRule="auto"/>
+        <w:rPr>
+          <w:rFonts w:hint="default" w:ascii="Arial" w:hAnsi="Arial" w:cs="Arial"/>
+          <w:color w:val="1F1F1F"/>
+          <w:lang w:val="en-US"/>
+        </w:rPr>
+      </w:pPr>
+    </w:p>
+    <w:p>
+      <w:pPr>
+        <w:pStyle w:val="6"/>
+        <w:numPr>
+          <w:numId w:val="0"/>
+        </w:numPr>
+        <w:shd w:val="clear" w:color="auto" w:fill="FFFFFF"/>
+        <w:spacing w:before="0" w:beforeAutospacing="0" w:after="0" w:afterAutospacing="0" w:line="240" w:lineRule="auto"/>
+        <w:rPr>
+          <w:rFonts w:hint="default" w:ascii="Arial" w:hAnsi="Arial" w:cs="Arial"/>
+          <w:color w:val="1F1F1F"/>
+          <w:lang w:val="en-US"/>
+        </w:rPr>
+      </w:pPr>
+    </w:p>
+    <w:p>
+      <w:pPr>
+        <w:pStyle w:val="6"/>
+        <w:numPr>
+          <w:numId w:val="0"/>
+        </w:numPr>
+        <w:shd w:val="clear" w:color="auto" w:fill="FFFFFF"/>
+        <w:spacing w:before="0" w:beforeAutospacing="0" w:after="0" w:afterAutospacing="0" w:line="240" w:lineRule="auto"/>
+        <w:rPr>
+          <w:rFonts w:hint="default" w:ascii="Arial" w:hAnsi="Arial" w:cs="Arial"/>
+          <w:color w:val="1F1F1F"/>
+          <w:lang w:val="en-US"/>
+        </w:rPr>
+      </w:pPr>
+      <w:r>
+        <w:rPr>
+          <w:rFonts w:hint="default" w:ascii="Arial" w:hAnsi="Arial" w:cs="Arial"/>
+          <w:color w:val="1F1F1F"/>
+          <w:lang w:val="en-US"/>
+        </w:rPr>
+        <w:t xml:space="preserve">Make the changes in the admin.html page and make sure that the database schema is updated for holding all the changes in proper way. </w:t>
       </w:r>
     </w:p>
     <w:p>
@@ -1741,23 +3409,72 @@
       <w:pPr>
         <w:pStyle w:val="6"/>
         <w:numPr>
-          <w:numId w:val="0"/>
-        </w:numPr>
-        <w:shd w:val="clear" w:color="auto" w:fill="FFFFFF"/>
-        <w:spacing w:before="0" w:beforeAutospacing="0" w:after="0" w:afterAutospacing="0" w:line="240" w:lineRule="auto"/>
-        <w:rPr>
-          <w:rFonts w:hint="default" w:ascii="Arial" w:hAnsi="Arial" w:cs="Arial"/>
-          <w:color w:val="1F1F1F"/>
-          <w:lang w:val="en-US"/>
-        </w:rPr>
-      </w:pPr>
-      <w:r>
-        <w:rPr>
-          <w:rFonts w:hint="default" w:ascii="Arial" w:hAnsi="Arial" w:cs="Arial"/>
-          <w:color w:val="1F1F1F"/>
-          <w:lang w:val="en-US"/>
-        </w:rPr>
-        <w:t>Update the database schema for holding the changes.</w:t>
+          <w:ilvl w:val="0"/>
+          <w:numId w:val="15"/>
+        </w:numPr>
+        <w:shd w:val="clear" w:color="auto" w:fill="FFFFFF"/>
+        <w:spacing w:before="0" w:beforeAutospacing="0" w:after="0" w:afterAutospacing="0" w:line="240" w:lineRule="auto"/>
+        <w:rPr>
+          <w:rFonts w:hint="default" w:ascii="Arial" w:hAnsi="Arial" w:cs="Arial"/>
+          <w:color w:val="1F1F1F"/>
+          <w:lang w:val="en-US"/>
+        </w:rPr>
+      </w:pPr>
+      <w:r>
+        <w:rPr>
+          <w:rFonts w:hint="default" w:ascii="Arial" w:hAnsi="Arial" w:cs="Arial"/>
+          <w:color w:val="1F1F1F"/>
+          <w:lang w:val="en-US"/>
+        </w:rPr>
+        <w:t>Make sure the admin homepage is enough user friendly for the admin panel</w:t>
+      </w:r>
+    </w:p>
+    <w:p>
+      <w:pPr>
+        <w:pStyle w:val="6"/>
+        <w:numPr>
+          <w:ilvl w:val="0"/>
+          <w:numId w:val="15"/>
+        </w:numPr>
+        <w:shd w:val="clear" w:color="auto" w:fill="FFFFFF"/>
+        <w:spacing w:before="0" w:beforeAutospacing="0" w:after="0" w:afterAutospacing="0" w:line="240" w:lineRule="auto"/>
+        <w:rPr>
+          <w:rFonts w:hint="default" w:ascii="Arial" w:hAnsi="Arial" w:cs="Arial"/>
+          <w:color w:val="1F1F1F"/>
+          <w:lang w:val="en-US"/>
+        </w:rPr>
+      </w:pPr>
+      <w:r>
+        <w:rPr>
+          <w:rFonts w:hint="default" w:ascii="Arial" w:hAnsi="Arial" w:cs="Arial"/>
+          <w:color w:val="1F1F1F"/>
+          <w:lang w:val="en-US"/>
+        </w:rPr>
+        <w:t>Make spaces for holding imposter list, reporter list and admin list.</w:t>
+      </w:r>
+    </w:p>
+    <w:p>
+      <w:pPr>
+        <w:pStyle w:val="6"/>
+        <w:numPr>
+          <w:ilvl w:val="0"/>
+          <w:numId w:val="15"/>
+        </w:numPr>
+        <w:shd w:val="clear" w:color="auto" w:fill="FFFFFF"/>
+        <w:spacing w:before="0" w:beforeAutospacing="0" w:after="0" w:afterAutospacing="0" w:line="240" w:lineRule="auto"/>
+        <w:rPr>
+          <w:rFonts w:hint="default" w:ascii="Arial" w:hAnsi="Arial" w:cs="Arial"/>
+          <w:color w:val="1F1F1F"/>
+          <w:lang w:val="en-US"/>
+        </w:rPr>
+      </w:pPr>
+      <w:r>
+        <w:rPr>
+          <w:rFonts w:hint="default" w:ascii="Arial" w:hAnsi="Arial" w:cs="Arial"/>
+          <w:color w:val="1F1F1F"/>
+          <w:lang w:val="en-US"/>
+        </w:rPr>
+        <w:t>Each item should be different with relevant color. Like  - light red for delete list, light green for live list and so on.</w:t>
       </w:r>
     </w:p>
     <w:sectPr>
@@ -1823,6 +3540,18 @@
 <file path=word/numbering.xml><?xml version="1.0" encoding="utf-8"?>
 <w:numbering xmlns:wpc="http://schemas.microsoft.com/office/word/2010/wordprocessingCanvas" xmlns:mc="http://schemas.openxmlformats.org/markup-compatibility/2006" xmlns:o="urn:schemas-microsoft-com:office:office" xmlns:r="http://schemas.openxmlformats.org/officeDocument/2006/relationships" xmlns:m="http://schemas.openxmlformats.org/officeDocument/2006/math" xmlns:v="urn:schemas-microsoft-com:vml" xmlns:wp14="http://schemas.microsoft.com/office/word/2010/wordprocessingDrawing" xmlns:wp="http://schemas.openxmlformats.org/drawingml/2006/wordprocessingDrawing" xmlns:w10="urn:schemas-microsoft-com:office:word" xmlns:w="http://schemas.openxmlformats.org/wordprocessingml/2006/main" xmlns:w14="http://schemas.microsoft.com/office/word/2010/wordml" xmlns:wpg="http://schemas.microsoft.com/office/word/2010/wordprocessingGroup" xmlns:wpi="http://schemas.microsoft.com/office/word/2010/wordprocessingInk" xmlns:wne="http://schemas.microsoft.com/office/word/2006/wordml" xmlns:wps="http://schemas.microsoft.com/office/word/2010/wordprocessingShape" xmlns:wpsCustomData="http://www.wps.cn/officeDocument/2013/wpsCustomData" mc:Ignorable="w14 wp14">
   <w:abstractNum w:abstractNumId="0">
+    <w:nsid w:val="A57E01ED"/>
+    <w:multiLevelType w:val="singleLevel"/>
+    <w:tmpl w:val="A57E01ED"/>
+    <w:lvl w:ilvl="0" w:tentative="0">
+      <w:start w:val="1"/>
+      <w:numFmt w:val="upperLetter"/>
+      <w:suff w:val="space"/>
+      <w:lvlText w:val="%1."/>
+      <w:lvlJc w:val="left"/>
+    </w:lvl>
+  </w:abstractNum>
+  <w:abstractNum w:abstractNumId="1">
     <w:nsid w:val="B9B5C73F"/>
     <w:multiLevelType w:val="singleLevel"/>
     <w:tmpl w:val="B9B5C73F"/>
@@ -1834,7 +3563,31 @@
       <w:lvlJc w:val="left"/>
     </w:lvl>
   </w:abstractNum>
-  <w:abstractNum w:abstractNumId="1">
+  <w:abstractNum w:abstractNumId="2">
+    <w:nsid w:val="DF8183C2"/>
+    <w:multiLevelType w:val="singleLevel"/>
+    <w:tmpl w:val="DF8183C2"/>
+    <w:lvl w:ilvl="0" w:tentative="0">
+      <w:start w:val="1"/>
+      <w:numFmt w:val="upperLetter"/>
+      <w:suff w:val="space"/>
+      <w:lvlText w:val="%1."/>
+      <w:lvlJc w:val="left"/>
+    </w:lvl>
+  </w:abstractNum>
+  <w:abstractNum w:abstractNumId="3">
+    <w:nsid w:val="F5F137AA"/>
+    <w:multiLevelType w:val="singleLevel"/>
+    <w:tmpl w:val="F5F137AA"/>
+    <w:lvl w:ilvl="0" w:tentative="0">
+      <w:start w:val="1"/>
+      <w:numFmt w:val="upperLetter"/>
+      <w:suff w:val="space"/>
+      <w:lvlText w:val="%1."/>
+      <w:lvlJc w:val="left"/>
+    </w:lvl>
+  </w:abstractNum>
+  <w:abstractNum w:abstractNumId="4">
     <w:nsid w:val="037D6EA2"/>
     <w:multiLevelType w:val="multilevel"/>
     <w:tmpl w:val="037D6EA2"/>
@@ -1923,7 +3676,19 @@
       </w:pPr>
     </w:lvl>
   </w:abstractNum>
-  <w:abstractNum w:abstractNumId="2">
+  <w:abstractNum w:abstractNumId="5">
+    <w:nsid w:val="04D1DF3B"/>
+    <w:multiLevelType w:val="singleLevel"/>
+    <w:tmpl w:val="04D1DF3B"/>
+    <w:lvl w:ilvl="0" w:tentative="0">
+      <w:start w:val="1"/>
+      <w:numFmt w:val="decimal"/>
+      <w:suff w:val="space"/>
+      <w:lvlText w:val="%1."/>
+      <w:lvlJc w:val="left"/>
+    </w:lvl>
+  </w:abstractNum>
+  <w:abstractNum w:abstractNumId="6">
     <w:nsid w:val="0EAF9BE1"/>
     <w:multiLevelType w:val="singleLevel"/>
     <w:tmpl w:val="0EAF9BE1"/>
@@ -1935,7 +3700,7 @@
       <w:lvlJc w:val="left"/>
     </w:lvl>
   </w:abstractNum>
-  <w:abstractNum w:abstractNumId="3">
+  <w:abstractNum w:abstractNumId="7">
     <w:nsid w:val="105B1DA6"/>
     <w:multiLevelType w:val="multilevel"/>
     <w:tmpl w:val="105B1DA6"/>
@@ -2024,7 +3789,43 @@
       </w:pPr>
     </w:lvl>
   </w:abstractNum>
-  <w:abstractNum w:abstractNumId="4">
+  <w:abstractNum w:abstractNumId="8">
+    <w:nsid w:val="3D60E1B1"/>
+    <w:multiLevelType w:val="singleLevel"/>
+    <w:tmpl w:val="3D60E1B1"/>
+    <w:lvl w:ilvl="0" w:tentative="0">
+      <w:start w:val="1"/>
+      <w:numFmt w:val="upperLetter"/>
+      <w:suff w:val="space"/>
+      <w:lvlText w:val="%1."/>
+      <w:lvlJc w:val="left"/>
+    </w:lvl>
+  </w:abstractNum>
+  <w:abstractNum w:abstractNumId="9">
+    <w:nsid w:val="47429A61"/>
+    <w:multiLevelType w:val="singleLevel"/>
+    <w:tmpl w:val="47429A61"/>
+    <w:lvl w:ilvl="0" w:tentative="0">
+      <w:start w:val="1"/>
+      <w:numFmt w:val="upperLetter"/>
+      <w:suff w:val="space"/>
+      <w:lvlText w:val="%1."/>
+      <w:lvlJc w:val="left"/>
+    </w:lvl>
+  </w:abstractNum>
+  <w:abstractNum w:abstractNumId="10">
+    <w:nsid w:val="6A409F4A"/>
+    <w:multiLevelType w:val="singleLevel"/>
+    <w:tmpl w:val="6A409F4A"/>
+    <w:lvl w:ilvl="0" w:tentative="0">
+      <w:start w:val="1"/>
+      <w:numFmt w:val="upperLetter"/>
+      <w:suff w:val="space"/>
+      <w:lvlText w:val="%1."/>
+      <w:lvlJc w:val="left"/>
+    </w:lvl>
+  </w:abstractNum>
+  <w:abstractNum w:abstractNumId="11">
     <w:nsid w:val="6E572D43"/>
     <w:multiLevelType w:val="singleLevel"/>
     <w:tmpl w:val="6E572D43"/>
@@ -2039,7 +3840,7 @@
       </w:pPr>
     </w:lvl>
   </w:abstractNum>
-  <w:abstractNum w:abstractNumId="5">
+  <w:abstractNum w:abstractNumId="12">
     <w:nsid w:val="73420BB4"/>
     <w:multiLevelType w:val="multilevel"/>
     <w:tmpl w:val="73420BB4"/>
@@ -2128,7 +3929,7 @@
       </w:pPr>
     </w:lvl>
   </w:abstractNum>
-  <w:abstractNum w:abstractNumId="6">
+  <w:abstractNum w:abstractNumId="13">
     <w:nsid w:val="768D6D45"/>
     <w:multiLevelType w:val="singleLevel"/>
     <w:tmpl w:val="768D6D45"/>
@@ -2140,7 +3941,7 @@
       <w:lvlJc w:val="left"/>
     </w:lvl>
   </w:abstractNum>
-  <w:abstractNum w:abstractNumId="7">
+  <w:abstractNum w:abstractNumId="14">
     <w:nsid w:val="79492D55"/>
     <w:multiLevelType w:val="multilevel"/>
     <w:tmpl w:val="79492D55"/>
@@ -2230,28 +4031,49 @@
     </w:lvl>
   </w:abstractNum>
   <w:num w:numId="1">
+    <w:abstractNumId w:val="7"/>
+  </w:num>
+  <w:num w:numId="2">
+    <w:abstractNumId w:val="4"/>
+  </w:num>
+  <w:num w:numId="3">
+    <w:abstractNumId w:val="12"/>
+  </w:num>
+  <w:num w:numId="4">
+    <w:abstractNumId w:val="14"/>
+  </w:num>
+  <w:num w:numId="5">
+    <w:abstractNumId w:val="11"/>
+  </w:num>
+  <w:num w:numId="6">
+    <w:abstractNumId w:val="6"/>
+  </w:num>
+  <w:num w:numId="7">
+    <w:abstractNumId w:val="1"/>
+  </w:num>
+  <w:num w:numId="8">
+    <w:abstractNumId w:val="13"/>
+  </w:num>
+  <w:num w:numId="9">
+    <w:abstractNumId w:val="2"/>
+  </w:num>
+  <w:num w:numId="10">
     <w:abstractNumId w:val="3"/>
   </w:num>
-  <w:num w:numId="2">
-    <w:abstractNumId w:val="1"/>
+  <w:num w:numId="11">
+    <w:abstractNumId w:val="9"/>
   </w:num>
-  <w:num w:numId="3">
-    <w:abstractNumId w:val="5"/>
+  <w:num w:numId="12">
+    <w:abstractNumId w:val="10"/>
   </w:num>
-  <w:num w:numId="4">
-    <w:abstractNumId w:val="7"/>
-  </w:num>
-  <w:num w:numId="5">
-    <w:abstractNumId w:val="4"/>
-  </w:num>
-  <w:num w:numId="6">
-    <w:abstractNumId w:val="2"/>
-  </w:num>
-  <w:num w:numId="7">
+  <w:num w:numId="13">
     <w:abstractNumId w:val="0"/>
   </w:num>
-  <w:num w:numId="8">
-    <w:abstractNumId w:val="6"/>
+  <w:num w:numId="14">
+    <w:abstractNumId w:val="8"/>
+  </w:num>
+  <w:num w:numId="15">
+    <w:abstractNumId w:val="5"/>
   </w:num>
 </w:numbering>
 </file>
@@ -2298,8 +4120,8 @@
     <w:lsdException w:uiPriority="99" w:name="Normal Indent"/>
     <w:lsdException w:uiPriority="99" w:name="footnote text"/>
     <w:lsdException w:uiPriority="99" w:name="annotation text"/>
-    <w:lsdException w:uiPriority="99" w:semiHidden="0" w:name="header"/>
-    <w:lsdException w:uiPriority="99" w:semiHidden="0" w:name="footer"/>
+    <w:lsdException w:qFormat="1" w:uiPriority="99" w:semiHidden="0" w:name="header"/>
+    <w:lsdException w:qFormat="1" w:uiPriority="99" w:semiHidden="0" w:name="footer"/>
     <w:lsdException w:uiPriority="99" w:name="index heading"/>
     <w:lsdException w:qFormat="1" w:uiPriority="35" w:name="caption"/>
     <w:lsdException w:uiPriority="99" w:name="table of figures"/>
@@ -2332,7 +4154,7 @@
     <w:lsdException w:qFormat="1" w:unhideWhenUsed="0" w:uiPriority="10" w:semiHidden="0" w:name="Title"/>
     <w:lsdException w:uiPriority="99" w:name="Closing"/>
     <w:lsdException w:uiPriority="99" w:name="Signature"/>
-    <w:lsdException w:uiPriority="1" w:name="Default Paragraph Font"/>
+    <w:lsdException w:qFormat="1" w:uiPriority="1" w:name="Default Paragraph Font"/>
     <w:lsdException w:uiPriority="99" w:name="Body Text"/>
     <w:lsdException w:uiPriority="99" w:name="Body Text Indent"/>
     <w:lsdException w:uiPriority="99" w:name="List Continue"/>
@@ -2535,6 +4357,7 @@
     <w:name w:val="Default Paragraph Font"/>
     <w:semiHidden/>
     <w:unhideWhenUsed/>
+    <w:qFormat/>
     <w:uiPriority w:val="1"/>
   </w:style>
   <w:style w:type="table" w:default="1" w:styleId="3">
@@ -2557,6 +4380,7 @@
     <w:basedOn w:val="1"/>
     <w:link w:val="8"/>
     <w:unhideWhenUsed/>
+    <w:qFormat/>
     <w:uiPriority w:val="99"/>
     <w:pPr>
       <w:tabs>
@@ -2571,6 +4395,7 @@
     <w:basedOn w:val="1"/>
     <w:link w:val="7"/>
     <w:unhideWhenUsed/>
+    <w:qFormat/>
     <w:uiPriority w:val="99"/>
     <w:pPr>
       <w:tabs>
@@ -2599,6 +4424,7 @@
     <w:name w:val="Header Char"/>
     <w:basedOn w:val="2"/>
     <w:link w:val="5"/>
+    <w:qFormat/>
     <w:uiPriority w:val="99"/>
   </w:style>
   <w:style w:type="character" w:customStyle="1" w:styleId="8">

</xml_diff>

<commit_message>
Update the homepage and add new event-details and imposter details page.
</commit_message>
<xml_diff>
--- a/Fraud-checker promt.docx
+++ b/Fraud-checker promt.docx
@@ -1890,7 +1890,1714 @@
           <w:color w:val="1F1F1F"/>
           <w:lang w:val="en-US"/>
         </w:rPr>
-        <w:t>This page is only accessible to the authorized admin panel. They have the ultimate power to control all the information of the website. They should show all the currently live fraud events, pending fraud events, d</w:t>
+        <w:t>This page is only accessible to the authorized admin panel. They have the ultimate power to control all the information of the website. They should show all the currently live fraud events, pending fraud events, delete fraud events, imposter list, and reporter list. Also they can take action based on the current situation.</w:t>
+      </w:r>
+    </w:p>
+    <w:p>
+      <w:pPr>
+        <w:pStyle w:val="6"/>
+        <w:numPr>
+          <w:ilvl w:val="0"/>
+          <w:numId w:val="0"/>
+        </w:numPr>
+        <w:shd w:val="clear" w:color="auto" w:fill="FFFFFF"/>
+        <w:spacing w:before="0" w:beforeAutospacing="0" w:after="0" w:afterAutospacing="0" w:line="240" w:lineRule="auto"/>
+        <w:rPr>
+          <w:rFonts w:hint="default" w:ascii="Arial" w:hAnsi="Arial" w:cs="Arial"/>
+          <w:color w:val="1F1F1F"/>
+          <w:lang w:val="en-US"/>
+        </w:rPr>
+      </w:pPr>
+    </w:p>
+    <w:p>
+      <w:pPr>
+        <w:pStyle w:val="6"/>
+        <w:numPr>
+          <w:ilvl w:val="0"/>
+          <w:numId w:val="0"/>
+        </w:numPr>
+        <w:shd w:val="clear" w:color="auto" w:fill="FFFFFF"/>
+        <w:spacing w:before="0" w:beforeAutospacing="0" w:after="0" w:afterAutospacing="0" w:line="240" w:lineRule="auto"/>
+        <w:rPr>
+          <w:rFonts w:hint="default" w:ascii="Arial" w:hAnsi="Arial" w:cs="Arial"/>
+          <w:color w:val="1F1F1F"/>
+          <w:lang w:val="en-US"/>
+        </w:rPr>
+      </w:pPr>
+      <w:r>
+        <w:rPr>
+          <w:rFonts w:hint="default" w:ascii="Arial" w:hAnsi="Arial" w:cs="Arial"/>
+          <w:color w:val="1F1F1F"/>
+          <w:lang w:val="en-US"/>
+        </w:rPr>
+        <w:t>Task:</w:t>
+      </w:r>
+    </w:p>
+    <w:p>
+      <w:pPr>
+        <w:pStyle w:val="6"/>
+        <w:numPr>
+          <w:ilvl w:val="0"/>
+          <w:numId w:val="0"/>
+        </w:numPr>
+        <w:shd w:val="clear" w:color="auto" w:fill="FFFFFF"/>
+        <w:spacing w:before="0" w:beforeAutospacing="0" w:after="0" w:afterAutospacing="0" w:line="240" w:lineRule="auto"/>
+        <w:rPr>
+          <w:rFonts w:hint="default" w:ascii="Arial" w:hAnsi="Arial" w:cs="Arial"/>
+          <w:color w:val="1F1F1F"/>
+          <w:lang w:val="en-US"/>
+        </w:rPr>
+      </w:pPr>
+      <w:r>
+        <w:rPr>
+          <w:rFonts w:hint="default" w:ascii="Arial" w:hAnsi="Arial" w:cs="Arial"/>
+          <w:color w:val="1F1F1F"/>
+          <w:lang w:val="en-US"/>
+        </w:rPr>
+        <w:t>You’ve to update the admin.html page to cover all the cases described in context.</w:t>
+      </w:r>
+    </w:p>
+    <w:p>
+      <w:pPr>
+        <w:pStyle w:val="6"/>
+        <w:numPr>
+          <w:ilvl w:val="0"/>
+          <w:numId w:val="0"/>
+        </w:numPr>
+        <w:shd w:val="clear" w:color="auto" w:fill="FFFFFF"/>
+        <w:spacing w:before="0" w:beforeAutospacing="0" w:after="0" w:afterAutospacing="0" w:line="240" w:lineRule="auto"/>
+        <w:rPr>
+          <w:rFonts w:hint="default" w:ascii="Arial" w:hAnsi="Arial" w:cs="Arial"/>
+          <w:color w:val="1F1F1F"/>
+          <w:lang w:val="en-US"/>
+        </w:rPr>
+      </w:pPr>
+      <w:r>
+        <w:rPr>
+          <w:rFonts w:hint="default" w:ascii="Arial" w:hAnsi="Arial" w:cs="Arial"/>
+          <w:color w:val="1F1F1F"/>
+          <w:lang w:val="en-US"/>
+        </w:rPr>
+        <w:t>For the live fraud events -</w:t>
+      </w:r>
+    </w:p>
+    <w:p>
+      <w:pPr>
+        <w:pStyle w:val="6"/>
+        <w:numPr>
+          <w:ilvl w:val="0"/>
+          <w:numId w:val="0"/>
+        </w:numPr>
+        <w:shd w:val="clear" w:color="auto" w:fill="FFFFFF"/>
+        <w:spacing w:before="0" w:beforeAutospacing="0" w:after="0" w:afterAutospacing="0" w:line="240" w:lineRule="auto"/>
+        <w:rPr>
+          <w:rFonts w:hint="default" w:ascii="Arial" w:hAnsi="Arial" w:cs="Arial"/>
+          <w:color w:val="1F1F1F"/>
+          <w:lang w:val="en-US"/>
+        </w:rPr>
+      </w:pPr>
+      <w:r>
+        <w:rPr>
+          <w:rFonts w:hint="default" w:ascii="Arial" w:hAnsi="Arial" w:cs="Arial"/>
+          <w:color w:val="1F1F1F"/>
+          <w:lang w:val="en-US"/>
+        </w:rPr>
+        <w:t xml:space="preserve">All the events should be showed in a card format with some important information. This can be  - </w:t>
+      </w:r>
+    </w:p>
+    <w:p>
+      <w:pPr>
+        <w:pStyle w:val="6"/>
+        <w:numPr>
+          <w:ilvl w:val="0"/>
+          <w:numId w:val="9"/>
+        </w:numPr>
+        <w:shd w:val="clear" w:color="auto" w:fill="FFFFFF"/>
+        <w:spacing w:before="0" w:beforeAutospacing="0" w:after="0" w:afterAutospacing="0" w:line="240" w:lineRule="auto"/>
+        <w:ind w:firstLine="720" w:firstLineChars="0"/>
+        <w:rPr>
+          <w:rFonts w:hint="default" w:ascii="Arial" w:hAnsi="Arial" w:cs="Arial"/>
+          <w:color w:val="1F1F1F"/>
+          <w:lang w:val="en-US"/>
+        </w:rPr>
+      </w:pPr>
+      <w:r>
+        <w:rPr>
+          <w:rFonts w:hint="default" w:ascii="Arial" w:hAnsi="Arial" w:cs="Arial"/>
+          <w:color w:val="1F1F1F"/>
+          <w:lang w:val="en-US"/>
+        </w:rPr>
+        <w:t>Scam type as title of the event</w:t>
+      </w:r>
+    </w:p>
+    <w:p>
+      <w:pPr>
+        <w:pStyle w:val="6"/>
+        <w:numPr>
+          <w:ilvl w:val="0"/>
+          <w:numId w:val="9"/>
+        </w:numPr>
+        <w:shd w:val="clear" w:color="auto" w:fill="FFFFFF"/>
+        <w:spacing w:before="0" w:beforeAutospacing="0" w:after="0" w:afterAutospacing="0" w:line="240" w:lineRule="auto"/>
+        <w:ind w:firstLine="720" w:firstLineChars="0"/>
+        <w:rPr>
+          <w:rFonts w:hint="default" w:ascii="Arial" w:hAnsi="Arial" w:cs="Arial"/>
+          <w:color w:val="1F1F1F"/>
+          <w:lang w:val="en-US"/>
+        </w:rPr>
+      </w:pPr>
+      <w:r>
+        <w:rPr>
+          <w:rFonts w:hint="default" w:ascii="Arial" w:hAnsi="Arial" w:cs="Arial"/>
+          <w:color w:val="1F1F1F"/>
+          <w:lang w:val="en-US"/>
+        </w:rPr>
+        <w:t>Scam description (within 100 words)</w:t>
+      </w:r>
+    </w:p>
+    <w:p>
+      <w:pPr>
+        <w:pStyle w:val="6"/>
+        <w:numPr>
+          <w:ilvl w:val="0"/>
+          <w:numId w:val="9"/>
+        </w:numPr>
+        <w:shd w:val="clear" w:color="auto" w:fill="FFFFFF"/>
+        <w:spacing w:before="0" w:beforeAutospacing="0" w:after="0" w:afterAutospacing="0" w:line="240" w:lineRule="auto"/>
+        <w:ind w:firstLine="720" w:firstLineChars="0"/>
+        <w:rPr>
+          <w:rFonts w:hint="default" w:ascii="Arial" w:hAnsi="Arial" w:cs="Arial"/>
+          <w:color w:val="1F1F1F"/>
+          <w:lang w:val="en-US"/>
+        </w:rPr>
+      </w:pPr>
+      <w:r>
+        <w:rPr>
+          <w:rFonts w:hint="default" w:ascii="Arial" w:hAnsi="Arial" w:cs="Arial"/>
+          <w:color w:val="1F1F1F"/>
+          <w:lang w:val="en-US"/>
+        </w:rPr>
+        <w:t>Loss amount</w:t>
+      </w:r>
+    </w:p>
+    <w:p>
+      <w:pPr>
+        <w:pStyle w:val="6"/>
+        <w:numPr>
+          <w:ilvl w:val="0"/>
+          <w:numId w:val="9"/>
+        </w:numPr>
+        <w:shd w:val="clear" w:color="auto" w:fill="FFFFFF"/>
+        <w:spacing w:before="0" w:beforeAutospacing="0" w:after="0" w:afterAutospacing="0" w:line="240" w:lineRule="auto"/>
+        <w:ind w:firstLine="720" w:firstLineChars="0"/>
+        <w:rPr>
+          <w:rFonts w:hint="default" w:ascii="Arial" w:hAnsi="Arial" w:cs="Arial"/>
+          <w:color w:val="1F1F1F"/>
+          <w:lang w:val="en-US"/>
+        </w:rPr>
+      </w:pPr>
+      <w:r>
+        <w:rPr>
+          <w:rFonts w:hint="default" w:ascii="Arial" w:hAnsi="Arial" w:cs="Arial"/>
+          <w:color w:val="1F1F1F"/>
+          <w:lang w:val="en-US"/>
+        </w:rPr>
+        <w:t>Date and time of submission</w:t>
+      </w:r>
+    </w:p>
+    <w:p>
+      <w:pPr>
+        <w:pStyle w:val="6"/>
+        <w:numPr>
+          <w:ilvl w:val="0"/>
+          <w:numId w:val="9"/>
+        </w:numPr>
+        <w:shd w:val="clear" w:color="auto" w:fill="FFFFFF"/>
+        <w:spacing w:before="0" w:beforeAutospacing="0" w:after="0" w:afterAutospacing="0" w:line="240" w:lineRule="auto"/>
+        <w:ind w:firstLine="720" w:firstLineChars="0"/>
+        <w:rPr>
+          <w:rFonts w:hint="default" w:ascii="Arial" w:hAnsi="Arial" w:cs="Arial"/>
+          <w:color w:val="1F1F1F"/>
+          <w:lang w:val="en-US"/>
+        </w:rPr>
+      </w:pPr>
+      <w:r>
+        <w:rPr>
+          <w:rFonts w:hint="default" w:ascii="Arial" w:hAnsi="Arial" w:cs="Arial"/>
+          <w:color w:val="1F1F1F"/>
+          <w:lang w:val="en-US"/>
+        </w:rPr>
+        <w:t>Date and time of approval</w:t>
+      </w:r>
+    </w:p>
+    <w:p>
+      <w:pPr>
+        <w:pStyle w:val="6"/>
+        <w:numPr>
+          <w:ilvl w:val="0"/>
+          <w:numId w:val="9"/>
+        </w:numPr>
+        <w:shd w:val="clear" w:color="auto" w:fill="FFFFFF"/>
+        <w:spacing w:before="0" w:beforeAutospacing="0" w:after="0" w:afterAutospacing="0" w:line="240" w:lineRule="auto"/>
+        <w:ind w:firstLine="720" w:firstLineChars="0"/>
+        <w:rPr>
+          <w:rFonts w:hint="default" w:ascii="Arial" w:hAnsi="Arial" w:cs="Arial"/>
+          <w:color w:val="1F1F1F"/>
+          <w:lang w:val="en-US"/>
+        </w:rPr>
+      </w:pPr>
+      <w:r>
+        <w:rPr>
+          <w:rFonts w:hint="default" w:ascii="Arial" w:hAnsi="Arial" w:cs="Arial"/>
+          <w:color w:val="1F1F1F"/>
+          <w:lang w:val="en-US"/>
+        </w:rPr>
+        <w:t>Total live day (since time of approval)</w:t>
+      </w:r>
+    </w:p>
+    <w:p>
+      <w:pPr>
+        <w:pStyle w:val="6"/>
+        <w:numPr>
+          <w:ilvl w:val="0"/>
+          <w:numId w:val="9"/>
+        </w:numPr>
+        <w:shd w:val="clear" w:color="auto" w:fill="FFFFFF"/>
+        <w:spacing w:before="0" w:beforeAutospacing="0" w:after="0" w:afterAutospacing="0" w:line="240" w:lineRule="auto"/>
+        <w:ind w:firstLine="720" w:firstLineChars="0"/>
+        <w:rPr>
+          <w:rFonts w:hint="default" w:ascii="Arial" w:hAnsi="Arial" w:cs="Arial"/>
+          <w:color w:val="1F1F1F"/>
+          <w:lang w:val="en-US"/>
+        </w:rPr>
+      </w:pPr>
+      <w:r>
+        <w:rPr>
+          <w:rFonts w:hint="default" w:ascii="Arial" w:hAnsi="Arial" w:cs="Arial"/>
+          <w:color w:val="1F1F1F"/>
+          <w:lang w:val="en-US"/>
+        </w:rPr>
+        <w:t>Imposter name</w:t>
+      </w:r>
+    </w:p>
+    <w:p>
+      <w:pPr>
+        <w:pStyle w:val="6"/>
+        <w:numPr>
+          <w:ilvl w:val="0"/>
+          <w:numId w:val="9"/>
+        </w:numPr>
+        <w:shd w:val="clear" w:color="auto" w:fill="FFFFFF"/>
+        <w:spacing w:before="0" w:beforeAutospacing="0" w:after="0" w:afterAutospacing="0" w:line="240" w:lineRule="auto"/>
+        <w:ind w:firstLine="720" w:firstLineChars="0"/>
+        <w:rPr>
+          <w:rFonts w:hint="default" w:ascii="Arial" w:hAnsi="Arial" w:cs="Arial"/>
+          <w:color w:val="1F1F1F"/>
+          <w:lang w:val="en-US"/>
+        </w:rPr>
+      </w:pPr>
+      <w:r>
+        <w:rPr>
+          <w:rFonts w:hint="default" w:ascii="Arial" w:hAnsi="Arial" w:cs="Arial"/>
+          <w:color w:val="1F1F1F"/>
+          <w:lang w:val="en-US"/>
+        </w:rPr>
+        <w:t>Reporter name</w:t>
+      </w:r>
+    </w:p>
+    <w:p>
+      <w:pPr>
+        <w:pStyle w:val="6"/>
+        <w:numPr>
+          <w:ilvl w:val="0"/>
+          <w:numId w:val="9"/>
+        </w:numPr>
+        <w:shd w:val="clear" w:color="auto" w:fill="FFFFFF"/>
+        <w:spacing w:before="0" w:beforeAutospacing="0" w:after="0" w:afterAutospacing="0" w:line="240" w:lineRule="auto"/>
+        <w:ind w:firstLine="720" w:firstLineChars="0"/>
+        <w:rPr>
+          <w:rFonts w:hint="default" w:ascii="Arial" w:hAnsi="Arial" w:cs="Arial"/>
+          <w:color w:val="1F1F1F"/>
+          <w:lang w:val="en-US"/>
+        </w:rPr>
+      </w:pPr>
+      <w:r>
+        <w:rPr>
+          <w:rFonts w:hint="default" w:ascii="Arial" w:hAnsi="Arial" w:cs="Arial"/>
+          <w:color w:val="1F1F1F"/>
+          <w:lang w:val="en-US"/>
+        </w:rPr>
+        <w:t>Approved admin name (implemented later, since admin panel is not created yet)</w:t>
+      </w:r>
+    </w:p>
+    <w:p>
+      <w:pPr>
+        <w:pStyle w:val="6"/>
+        <w:numPr>
+          <w:ilvl w:val="0"/>
+          <w:numId w:val="9"/>
+        </w:numPr>
+        <w:shd w:val="clear" w:color="auto" w:fill="FFFFFF"/>
+        <w:spacing w:before="0" w:beforeAutospacing="0" w:after="0" w:afterAutospacing="0" w:line="240" w:lineRule="auto"/>
+        <w:ind w:firstLine="720" w:firstLineChars="0"/>
+        <w:rPr>
+          <w:rFonts w:hint="default" w:ascii="Arial" w:hAnsi="Arial" w:cs="Arial"/>
+          <w:color w:val="1F1F1F"/>
+          <w:lang w:val="en-US"/>
+        </w:rPr>
+      </w:pPr>
+      <w:r>
+        <w:rPr>
+          <w:rFonts w:hint="default" w:ascii="Arial" w:hAnsi="Arial" w:cs="Arial"/>
+          <w:color w:val="1F1F1F"/>
+          <w:lang w:val="en-US"/>
+        </w:rPr>
+        <w:t>Event status</w:t>
+      </w:r>
+    </w:p>
+    <w:p>
+      <w:pPr>
+        <w:pStyle w:val="6"/>
+        <w:numPr>
+          <w:ilvl w:val="0"/>
+          <w:numId w:val="9"/>
+        </w:numPr>
+        <w:shd w:val="clear" w:color="auto" w:fill="FFFFFF"/>
+        <w:spacing w:before="0" w:beforeAutospacing="0" w:after="0" w:afterAutospacing="0" w:line="240" w:lineRule="auto"/>
+        <w:ind w:firstLine="720" w:firstLineChars="0"/>
+        <w:rPr>
+          <w:rFonts w:hint="default" w:ascii="Arial" w:hAnsi="Arial" w:cs="Arial"/>
+          <w:color w:val="1F1F1F"/>
+          <w:lang w:val="en-US"/>
+        </w:rPr>
+      </w:pPr>
+      <w:r>
+        <w:rPr>
+          <w:rFonts w:hint="default" w:ascii="Arial" w:hAnsi="Arial" w:cs="Arial"/>
+          <w:color w:val="1F1F1F"/>
+          <w:lang w:val="en-US"/>
+        </w:rPr>
+        <w:t>Button for delete the event</w:t>
+      </w:r>
+    </w:p>
+    <w:p>
+      <w:pPr>
+        <w:pStyle w:val="6"/>
+        <w:numPr>
+          <w:ilvl w:val="0"/>
+          <w:numId w:val="0"/>
+        </w:numPr>
+        <w:shd w:val="clear" w:color="auto" w:fill="FFFFFF"/>
+        <w:spacing w:before="0" w:beforeAutospacing="0" w:after="0" w:afterAutospacing="0" w:line="240" w:lineRule="auto"/>
+        <w:rPr>
+          <w:rFonts w:hint="default" w:ascii="Arial" w:hAnsi="Arial" w:cs="Arial"/>
+          <w:color w:val="1F1F1F"/>
+          <w:lang w:val="en-US"/>
+        </w:rPr>
+      </w:pPr>
+    </w:p>
+    <w:p>
+      <w:pPr>
+        <w:pStyle w:val="6"/>
+        <w:numPr>
+          <w:ilvl w:val="0"/>
+          <w:numId w:val="0"/>
+        </w:numPr>
+        <w:shd w:val="clear" w:color="auto" w:fill="FFFFFF"/>
+        <w:spacing w:before="0" w:beforeAutospacing="0" w:after="0" w:afterAutospacing="0" w:line="240" w:lineRule="auto"/>
+        <w:rPr>
+          <w:rFonts w:hint="default" w:ascii="Arial" w:hAnsi="Arial" w:cs="Arial"/>
+          <w:color w:val="1F1F1F"/>
+          <w:lang w:val="en-US"/>
+        </w:rPr>
+      </w:pPr>
+      <w:r>
+        <w:rPr>
+          <w:rFonts w:hint="default" w:ascii="Arial" w:hAnsi="Arial" w:cs="Arial"/>
+          <w:color w:val="1F1F1F"/>
+          <w:lang w:val="en-US"/>
+        </w:rPr>
+        <w:t xml:space="preserve">After clicking the card, it will show all the details about the event. All the submitted information by the reporter and also some additional information like - </w:t>
+      </w:r>
+    </w:p>
+    <w:p>
+      <w:pPr>
+        <w:pStyle w:val="6"/>
+        <w:numPr>
+          <w:ilvl w:val="0"/>
+          <w:numId w:val="10"/>
+        </w:numPr>
+        <w:shd w:val="clear" w:color="auto" w:fill="FFFFFF"/>
+        <w:spacing w:before="0" w:beforeAutospacing="0" w:after="0" w:afterAutospacing="0" w:line="240" w:lineRule="auto"/>
+        <w:ind w:firstLine="720" w:firstLineChars="0"/>
+        <w:rPr>
+          <w:rFonts w:hint="default" w:ascii="Arial" w:hAnsi="Arial" w:cs="Arial"/>
+          <w:color w:val="1F1F1F"/>
+          <w:lang w:val="en-US"/>
+        </w:rPr>
+      </w:pPr>
+      <w:r>
+        <w:rPr>
+          <w:rFonts w:hint="default" w:ascii="Arial" w:hAnsi="Arial" w:cs="Arial"/>
+          <w:color w:val="1F1F1F"/>
+          <w:lang w:val="en-US"/>
+        </w:rPr>
+        <w:t>Date of submission</w:t>
+      </w:r>
+    </w:p>
+    <w:p>
+      <w:pPr>
+        <w:pStyle w:val="6"/>
+        <w:numPr>
+          <w:ilvl w:val="0"/>
+          <w:numId w:val="10"/>
+        </w:numPr>
+        <w:shd w:val="clear" w:color="auto" w:fill="FFFFFF"/>
+        <w:spacing w:before="0" w:beforeAutospacing="0" w:after="0" w:afterAutospacing="0" w:line="240" w:lineRule="auto"/>
+        <w:ind w:firstLine="720" w:firstLineChars="0"/>
+        <w:rPr>
+          <w:rFonts w:hint="default" w:ascii="Arial" w:hAnsi="Arial" w:cs="Arial"/>
+          <w:color w:val="1F1F1F"/>
+          <w:lang w:val="en-US"/>
+        </w:rPr>
+      </w:pPr>
+      <w:r>
+        <w:rPr>
+          <w:rFonts w:hint="default" w:ascii="Arial" w:hAnsi="Arial" w:cs="Arial"/>
+          <w:color w:val="1F1F1F"/>
+          <w:lang w:val="en-US"/>
+        </w:rPr>
+        <w:t>Other fraud events of the imposter (if exists)</w:t>
+      </w:r>
+    </w:p>
+    <w:p>
+      <w:pPr>
+        <w:pStyle w:val="6"/>
+        <w:numPr>
+          <w:ilvl w:val="0"/>
+          <w:numId w:val="10"/>
+        </w:numPr>
+        <w:shd w:val="clear" w:color="auto" w:fill="FFFFFF"/>
+        <w:spacing w:before="0" w:beforeAutospacing="0" w:after="0" w:afterAutospacing="0" w:line="240" w:lineRule="auto"/>
+        <w:ind w:firstLine="720" w:firstLineChars="0"/>
+        <w:rPr>
+          <w:rFonts w:hint="default" w:ascii="Arial" w:hAnsi="Arial" w:cs="Arial"/>
+          <w:color w:val="1F1F1F"/>
+          <w:lang w:val="en-US"/>
+        </w:rPr>
+      </w:pPr>
+      <w:r>
+        <w:rPr>
+          <w:rFonts w:hint="default" w:ascii="Arial" w:hAnsi="Arial" w:cs="Arial"/>
+          <w:color w:val="1F1F1F"/>
+          <w:lang w:val="en-US"/>
+        </w:rPr>
+        <w:t>Approval details (will be implemented later)</w:t>
+      </w:r>
+    </w:p>
+    <w:p>
+      <w:pPr>
+        <w:pStyle w:val="6"/>
+        <w:numPr>
+          <w:ilvl w:val="0"/>
+          <w:numId w:val="0"/>
+        </w:numPr>
+        <w:shd w:val="clear" w:color="auto" w:fill="FFFFFF"/>
+        <w:spacing w:before="0" w:beforeAutospacing="0" w:after="0" w:afterAutospacing="0" w:line="240" w:lineRule="auto"/>
+        <w:rPr>
+          <w:rFonts w:hint="default" w:ascii="Arial" w:hAnsi="Arial" w:cs="Arial"/>
+          <w:color w:val="1F1F1F"/>
+          <w:lang w:val="en-US"/>
+        </w:rPr>
+      </w:pPr>
+    </w:p>
+    <w:p>
+      <w:pPr>
+        <w:pStyle w:val="6"/>
+        <w:numPr>
+          <w:ilvl w:val="0"/>
+          <w:numId w:val="0"/>
+        </w:numPr>
+        <w:shd w:val="clear" w:color="auto" w:fill="FFFFFF"/>
+        <w:spacing w:before="0" w:beforeAutospacing="0" w:after="0" w:afterAutospacing="0" w:line="240" w:lineRule="auto"/>
+        <w:rPr>
+          <w:rFonts w:hint="default" w:ascii="Arial" w:hAnsi="Arial" w:cs="Arial"/>
+          <w:color w:val="1F1F1F"/>
+          <w:lang w:val="en-US"/>
+        </w:rPr>
+      </w:pPr>
+      <w:r>
+        <w:rPr>
+          <w:rFonts w:hint="default" w:ascii="Arial" w:hAnsi="Arial" w:cs="Arial"/>
+          <w:color w:val="1F1F1F"/>
+          <w:lang w:val="en-US"/>
+        </w:rPr>
+        <w:t>The information in the details should be shown in organized way. Like-</w:t>
+      </w:r>
+    </w:p>
+    <w:p>
+      <w:pPr>
+        <w:pStyle w:val="6"/>
+        <w:numPr>
+          <w:ilvl w:val="0"/>
+          <w:numId w:val="11"/>
+        </w:numPr>
+        <w:shd w:val="clear" w:color="auto" w:fill="FFFFFF"/>
+        <w:spacing w:before="0" w:beforeAutospacing="0" w:after="0" w:afterAutospacing="0" w:line="240" w:lineRule="auto"/>
+        <w:ind w:firstLine="720" w:firstLineChars="0"/>
+        <w:rPr>
+          <w:rFonts w:hint="default" w:ascii="Arial" w:hAnsi="Arial" w:cs="Arial"/>
+          <w:color w:val="1F1F1F"/>
+          <w:lang w:val="en-US"/>
+        </w:rPr>
+      </w:pPr>
+      <w:r>
+        <w:rPr>
+          <w:rFonts w:hint="default" w:ascii="Arial" w:hAnsi="Arial" w:cs="Arial"/>
+          <w:color w:val="1F1F1F"/>
+          <w:lang w:val="en-US"/>
+        </w:rPr>
+        <w:t>Imposter details (With other live fraud events in short card)</w:t>
+      </w:r>
+    </w:p>
+    <w:p>
+      <w:pPr>
+        <w:pStyle w:val="6"/>
+        <w:numPr>
+          <w:ilvl w:val="0"/>
+          <w:numId w:val="11"/>
+        </w:numPr>
+        <w:shd w:val="clear" w:color="auto" w:fill="FFFFFF"/>
+        <w:spacing w:before="0" w:beforeAutospacing="0" w:after="0" w:afterAutospacing="0" w:line="240" w:lineRule="auto"/>
+        <w:ind w:firstLine="720" w:firstLineChars="0"/>
+        <w:rPr>
+          <w:rFonts w:hint="default" w:ascii="Arial" w:hAnsi="Arial" w:cs="Arial"/>
+          <w:color w:val="1F1F1F"/>
+          <w:lang w:val="en-US"/>
+        </w:rPr>
+      </w:pPr>
+      <w:r>
+        <w:rPr>
+          <w:rFonts w:hint="default" w:ascii="Arial" w:hAnsi="Arial" w:cs="Arial"/>
+          <w:color w:val="1F1F1F"/>
+          <w:lang w:val="en-US"/>
+        </w:rPr>
+        <w:t>Scam details</w:t>
+      </w:r>
+    </w:p>
+    <w:p>
+      <w:pPr>
+        <w:pStyle w:val="6"/>
+        <w:numPr>
+          <w:ilvl w:val="0"/>
+          <w:numId w:val="11"/>
+        </w:numPr>
+        <w:shd w:val="clear" w:color="auto" w:fill="FFFFFF"/>
+        <w:spacing w:before="0" w:beforeAutospacing="0" w:after="0" w:afterAutospacing="0" w:line="240" w:lineRule="auto"/>
+        <w:ind w:firstLine="720" w:firstLineChars="0"/>
+        <w:rPr>
+          <w:rFonts w:hint="default" w:ascii="Arial" w:hAnsi="Arial" w:cs="Arial"/>
+          <w:color w:val="1F1F1F"/>
+          <w:lang w:val="en-US"/>
+        </w:rPr>
+      </w:pPr>
+      <w:r>
+        <w:rPr>
+          <w:rFonts w:hint="default" w:ascii="Arial" w:hAnsi="Arial" w:cs="Arial"/>
+          <w:color w:val="1F1F1F"/>
+          <w:lang w:val="en-US"/>
+        </w:rPr>
+        <w:t>Reporter details</w:t>
+      </w:r>
+    </w:p>
+    <w:p>
+      <w:pPr>
+        <w:pStyle w:val="6"/>
+        <w:numPr>
+          <w:ilvl w:val="0"/>
+          <w:numId w:val="11"/>
+        </w:numPr>
+        <w:shd w:val="clear" w:color="auto" w:fill="FFFFFF"/>
+        <w:spacing w:before="0" w:beforeAutospacing="0" w:after="0" w:afterAutospacing="0" w:line="240" w:lineRule="auto"/>
+        <w:ind w:firstLine="720" w:firstLineChars="0"/>
+        <w:rPr>
+          <w:rFonts w:hint="default" w:ascii="Arial" w:hAnsi="Arial" w:cs="Arial"/>
+          <w:color w:val="1F1F1F"/>
+          <w:lang w:val="en-US"/>
+        </w:rPr>
+      </w:pPr>
+      <w:r>
+        <w:rPr>
+          <w:rFonts w:hint="default" w:ascii="Arial" w:hAnsi="Arial" w:cs="Arial"/>
+          <w:color w:val="1F1F1F"/>
+          <w:lang w:val="en-US"/>
+        </w:rPr>
+        <w:t>Apporval details (Implemented later)</w:t>
+      </w:r>
+    </w:p>
+    <w:p>
+      <w:pPr>
+        <w:pStyle w:val="6"/>
+        <w:numPr>
+          <w:ilvl w:val="0"/>
+          <w:numId w:val="0"/>
+        </w:numPr>
+        <w:shd w:val="clear" w:color="auto" w:fill="FFFFFF"/>
+        <w:spacing w:before="0" w:beforeAutospacing="0" w:after="0" w:afterAutospacing="0" w:line="240" w:lineRule="auto"/>
+        <w:rPr>
+          <w:rFonts w:hint="default" w:ascii="Arial" w:hAnsi="Arial" w:cs="Arial"/>
+          <w:color w:val="1F1F1F"/>
+          <w:lang w:val="en-US"/>
+        </w:rPr>
+      </w:pPr>
+      <w:r>
+        <w:rPr>
+          <w:rFonts w:hint="default" w:ascii="Arial" w:hAnsi="Arial" w:cs="Arial"/>
+          <w:color w:val="1F1F1F"/>
+          <w:lang w:val="en-US"/>
+        </w:rPr>
+        <w:t xml:space="preserve">Add button for delete the event or edit request button to send edit request to the reporter. </w:t>
+      </w:r>
+    </w:p>
+    <w:p>
+      <w:pPr>
+        <w:pStyle w:val="6"/>
+        <w:numPr>
+          <w:ilvl w:val="0"/>
+          <w:numId w:val="0"/>
+        </w:numPr>
+        <w:shd w:val="clear" w:color="auto" w:fill="FFFFFF"/>
+        <w:spacing w:before="0" w:beforeAutospacing="0" w:after="0" w:afterAutospacing="0" w:line="240" w:lineRule="auto"/>
+        <w:rPr>
+          <w:rFonts w:hint="default" w:ascii="Arial" w:hAnsi="Arial" w:cs="Arial"/>
+          <w:color w:val="1F1F1F"/>
+          <w:lang w:val="en-US"/>
+        </w:rPr>
+      </w:pPr>
+    </w:p>
+    <w:p>
+      <w:pPr>
+        <w:pStyle w:val="6"/>
+        <w:numPr>
+          <w:ilvl w:val="0"/>
+          <w:numId w:val="0"/>
+        </w:numPr>
+        <w:shd w:val="clear" w:color="auto" w:fill="FFFFFF"/>
+        <w:spacing w:before="0" w:beforeAutospacing="0" w:after="0" w:afterAutospacing="0" w:line="240" w:lineRule="auto"/>
+        <w:rPr>
+          <w:rFonts w:hint="default" w:ascii="Arial" w:hAnsi="Arial" w:cs="Arial"/>
+          <w:color w:val="1F1F1F"/>
+          <w:lang w:val="en-US"/>
+        </w:rPr>
+      </w:pPr>
+    </w:p>
+    <w:p>
+      <w:pPr>
+        <w:pStyle w:val="6"/>
+        <w:numPr>
+          <w:ilvl w:val="0"/>
+          <w:numId w:val="0"/>
+        </w:numPr>
+        <w:shd w:val="clear" w:color="auto" w:fill="FFFFFF"/>
+        <w:spacing w:before="0" w:beforeAutospacing="0" w:after="0" w:afterAutospacing="0" w:line="240" w:lineRule="auto"/>
+        <w:rPr>
+          <w:rFonts w:hint="default" w:ascii="Arial" w:hAnsi="Arial" w:cs="Arial"/>
+          <w:color w:val="1F1F1F"/>
+          <w:lang w:val="en-US"/>
+        </w:rPr>
+      </w:pPr>
+      <w:r>
+        <w:rPr>
+          <w:rFonts w:hint="default" w:ascii="Arial" w:hAnsi="Arial" w:cs="Arial"/>
+          <w:color w:val="1F1F1F"/>
+          <w:lang w:val="en-US"/>
+        </w:rPr>
+        <w:t xml:space="preserve">For the pending fraud events - All the pending events should be shown in a list with some important information - </w:t>
+      </w:r>
+    </w:p>
+    <w:p>
+      <w:pPr>
+        <w:pStyle w:val="6"/>
+        <w:numPr>
+          <w:ilvl w:val="0"/>
+          <w:numId w:val="12"/>
+        </w:numPr>
+        <w:shd w:val="clear" w:color="auto" w:fill="FFFFFF"/>
+        <w:spacing w:before="0" w:beforeAutospacing="0" w:after="0" w:afterAutospacing="0" w:line="240" w:lineRule="auto"/>
+        <w:ind w:firstLine="720" w:firstLineChars="0"/>
+        <w:rPr>
+          <w:rFonts w:hint="default" w:ascii="Arial" w:hAnsi="Arial" w:cs="Arial"/>
+          <w:color w:val="1F1F1F"/>
+          <w:lang w:val="en-US"/>
+        </w:rPr>
+      </w:pPr>
+      <w:r>
+        <w:rPr>
+          <w:rFonts w:hint="default" w:ascii="Arial" w:hAnsi="Arial" w:cs="Arial"/>
+          <w:color w:val="1F1F1F"/>
+          <w:lang w:val="en-US"/>
+        </w:rPr>
+        <w:t>Scam type as title of the event</w:t>
+      </w:r>
+    </w:p>
+    <w:p>
+      <w:pPr>
+        <w:pStyle w:val="6"/>
+        <w:numPr>
+          <w:ilvl w:val="0"/>
+          <w:numId w:val="12"/>
+        </w:numPr>
+        <w:shd w:val="clear" w:color="auto" w:fill="FFFFFF"/>
+        <w:spacing w:before="0" w:beforeAutospacing="0" w:after="0" w:afterAutospacing="0" w:line="240" w:lineRule="auto"/>
+        <w:ind w:firstLine="720" w:firstLineChars="0"/>
+        <w:rPr>
+          <w:rFonts w:hint="default" w:ascii="Arial" w:hAnsi="Arial" w:cs="Arial"/>
+          <w:color w:val="1F1F1F"/>
+          <w:lang w:val="en-US"/>
+        </w:rPr>
+      </w:pPr>
+      <w:r>
+        <w:rPr>
+          <w:rFonts w:hint="default" w:ascii="Arial" w:hAnsi="Arial" w:cs="Arial"/>
+          <w:color w:val="1F1F1F"/>
+          <w:lang w:val="en-US"/>
+        </w:rPr>
+        <w:t>Scam description (within 100 words)</w:t>
+      </w:r>
+    </w:p>
+    <w:p>
+      <w:pPr>
+        <w:pStyle w:val="6"/>
+        <w:numPr>
+          <w:ilvl w:val="0"/>
+          <w:numId w:val="12"/>
+        </w:numPr>
+        <w:shd w:val="clear" w:color="auto" w:fill="FFFFFF"/>
+        <w:spacing w:before="0" w:beforeAutospacing="0" w:after="0" w:afterAutospacing="0" w:line="240" w:lineRule="auto"/>
+        <w:ind w:firstLine="720" w:firstLineChars="0"/>
+        <w:rPr>
+          <w:rFonts w:hint="default" w:ascii="Arial" w:hAnsi="Arial" w:cs="Arial"/>
+          <w:color w:val="1F1F1F"/>
+          <w:lang w:val="en-US"/>
+        </w:rPr>
+      </w:pPr>
+      <w:r>
+        <w:rPr>
+          <w:rFonts w:hint="default" w:ascii="Arial" w:hAnsi="Arial" w:cs="Arial"/>
+          <w:color w:val="1F1F1F"/>
+          <w:lang w:val="en-US"/>
+        </w:rPr>
+        <w:t>Loss amount</w:t>
+      </w:r>
+    </w:p>
+    <w:p>
+      <w:pPr>
+        <w:pStyle w:val="6"/>
+        <w:numPr>
+          <w:ilvl w:val="0"/>
+          <w:numId w:val="12"/>
+        </w:numPr>
+        <w:shd w:val="clear" w:color="auto" w:fill="FFFFFF"/>
+        <w:spacing w:before="0" w:beforeAutospacing="0" w:after="0" w:afterAutospacing="0" w:line="240" w:lineRule="auto"/>
+        <w:ind w:firstLine="720" w:firstLineChars="0"/>
+        <w:rPr>
+          <w:rFonts w:hint="default" w:ascii="Arial" w:hAnsi="Arial" w:cs="Arial"/>
+          <w:color w:val="1F1F1F"/>
+          <w:lang w:val="en-US"/>
+        </w:rPr>
+      </w:pPr>
+      <w:r>
+        <w:rPr>
+          <w:rFonts w:hint="default" w:ascii="Arial" w:hAnsi="Arial" w:cs="Arial"/>
+          <w:color w:val="1F1F1F"/>
+          <w:lang w:val="en-US"/>
+        </w:rPr>
+        <w:t>Date and time of submission</w:t>
+      </w:r>
+    </w:p>
+    <w:p>
+      <w:pPr>
+        <w:pStyle w:val="6"/>
+        <w:numPr>
+          <w:ilvl w:val="0"/>
+          <w:numId w:val="12"/>
+        </w:numPr>
+        <w:shd w:val="clear" w:color="auto" w:fill="FFFFFF"/>
+        <w:spacing w:before="0" w:beforeAutospacing="0" w:after="0" w:afterAutospacing="0" w:line="240" w:lineRule="auto"/>
+        <w:ind w:firstLine="720" w:firstLineChars="0"/>
+        <w:rPr>
+          <w:rFonts w:hint="default" w:ascii="Arial" w:hAnsi="Arial" w:cs="Arial"/>
+          <w:color w:val="1F1F1F"/>
+          <w:lang w:val="en-US"/>
+        </w:rPr>
+      </w:pPr>
+      <w:r>
+        <w:rPr>
+          <w:rFonts w:hint="default" w:ascii="Arial" w:hAnsi="Arial" w:cs="Arial"/>
+          <w:color w:val="1F1F1F"/>
+          <w:lang w:val="en-US"/>
+        </w:rPr>
+        <w:t>Imposter name</w:t>
+      </w:r>
+    </w:p>
+    <w:p>
+      <w:pPr>
+        <w:pStyle w:val="6"/>
+        <w:numPr>
+          <w:ilvl w:val="0"/>
+          <w:numId w:val="12"/>
+        </w:numPr>
+        <w:shd w:val="clear" w:color="auto" w:fill="FFFFFF"/>
+        <w:spacing w:before="0" w:beforeAutospacing="0" w:after="0" w:afterAutospacing="0" w:line="240" w:lineRule="auto"/>
+        <w:ind w:firstLine="720" w:firstLineChars="0"/>
+        <w:rPr>
+          <w:rFonts w:hint="default" w:ascii="Arial" w:hAnsi="Arial" w:cs="Arial"/>
+          <w:color w:val="1F1F1F"/>
+          <w:lang w:val="en-US"/>
+        </w:rPr>
+      </w:pPr>
+      <w:r>
+        <w:rPr>
+          <w:rFonts w:hint="default" w:ascii="Arial" w:hAnsi="Arial" w:cs="Arial"/>
+          <w:color w:val="1F1F1F"/>
+          <w:lang w:val="en-US"/>
+        </w:rPr>
+        <w:t>Reporter name</w:t>
+      </w:r>
+    </w:p>
+    <w:p>
+      <w:pPr>
+        <w:pStyle w:val="6"/>
+        <w:numPr>
+          <w:ilvl w:val="0"/>
+          <w:numId w:val="12"/>
+        </w:numPr>
+        <w:shd w:val="clear" w:color="auto" w:fill="FFFFFF"/>
+        <w:spacing w:before="0" w:beforeAutospacing="0" w:after="0" w:afterAutospacing="0" w:line="240" w:lineRule="auto"/>
+        <w:ind w:firstLine="720" w:firstLineChars="0"/>
+        <w:rPr>
+          <w:rFonts w:hint="default" w:ascii="Arial" w:hAnsi="Arial" w:cs="Arial"/>
+          <w:color w:val="1F1F1F"/>
+          <w:lang w:val="en-US"/>
+        </w:rPr>
+      </w:pPr>
+      <w:r>
+        <w:rPr>
+          <w:rFonts w:hint="default" w:ascii="Arial" w:hAnsi="Arial" w:cs="Arial"/>
+          <w:color w:val="1F1F1F"/>
+          <w:lang w:val="en-US"/>
+        </w:rPr>
+        <w:t>Event status</w:t>
+      </w:r>
+    </w:p>
+    <w:p>
+      <w:pPr>
+        <w:pStyle w:val="6"/>
+        <w:numPr>
+          <w:ilvl w:val="0"/>
+          <w:numId w:val="12"/>
+        </w:numPr>
+        <w:shd w:val="clear" w:color="auto" w:fill="FFFFFF"/>
+        <w:spacing w:before="0" w:beforeAutospacing="0" w:after="0" w:afterAutospacing="0" w:line="240" w:lineRule="auto"/>
+        <w:ind w:firstLine="720" w:firstLineChars="0"/>
+        <w:rPr>
+          <w:rFonts w:hint="default" w:ascii="Arial" w:hAnsi="Arial" w:cs="Arial"/>
+          <w:color w:val="1F1F1F"/>
+          <w:lang w:val="en-US"/>
+        </w:rPr>
+      </w:pPr>
+      <w:r>
+        <w:rPr>
+          <w:rFonts w:hint="default" w:ascii="Arial" w:hAnsi="Arial" w:cs="Arial"/>
+          <w:color w:val="1F1F1F"/>
+          <w:lang w:val="en-US"/>
+        </w:rPr>
+        <w:t>Button for approve the event</w:t>
+      </w:r>
+    </w:p>
+    <w:p>
+      <w:pPr>
+        <w:pStyle w:val="6"/>
+        <w:numPr>
+          <w:ilvl w:val="0"/>
+          <w:numId w:val="0"/>
+        </w:numPr>
+        <w:shd w:val="clear" w:color="auto" w:fill="FFFFFF"/>
+        <w:spacing w:before="0" w:beforeAutospacing="0" w:after="0" w:afterAutospacing="0" w:line="240" w:lineRule="auto"/>
+        <w:rPr>
+          <w:rFonts w:hint="default" w:ascii="Arial" w:hAnsi="Arial" w:cs="Arial"/>
+          <w:color w:val="1F1F1F"/>
+          <w:lang w:val="en-US"/>
+        </w:rPr>
+      </w:pPr>
+      <w:r>
+        <w:rPr>
+          <w:rFonts w:hint="default" w:ascii="Arial" w:hAnsi="Arial" w:cs="Arial"/>
+          <w:color w:val="1F1F1F"/>
+          <w:lang w:val="en-US"/>
+        </w:rPr>
+        <w:t xml:space="preserve">After clicking the card, it will show all the details about the event.The information should be shown in a organized way - </w:t>
+      </w:r>
+    </w:p>
+    <w:p>
+      <w:pPr>
+        <w:pStyle w:val="6"/>
+        <w:numPr>
+          <w:ilvl w:val="0"/>
+          <w:numId w:val="13"/>
+        </w:numPr>
+        <w:shd w:val="clear" w:color="auto" w:fill="FFFFFF"/>
+        <w:spacing w:before="0" w:beforeAutospacing="0" w:after="0" w:afterAutospacing="0" w:line="240" w:lineRule="auto"/>
+        <w:ind w:firstLine="720" w:firstLineChars="0"/>
+        <w:rPr>
+          <w:rFonts w:hint="default" w:ascii="Arial" w:hAnsi="Arial" w:cs="Arial"/>
+          <w:color w:val="1F1F1F"/>
+          <w:lang w:val="en-US"/>
+        </w:rPr>
+      </w:pPr>
+      <w:r>
+        <w:rPr>
+          <w:rFonts w:hint="default" w:ascii="Arial" w:hAnsi="Arial" w:cs="Arial"/>
+          <w:color w:val="1F1F1F"/>
+          <w:lang w:val="en-US"/>
+        </w:rPr>
+        <w:t>Imposter details (With other live fraud events in short card)</w:t>
+      </w:r>
+    </w:p>
+    <w:p>
+      <w:pPr>
+        <w:pStyle w:val="6"/>
+        <w:numPr>
+          <w:ilvl w:val="0"/>
+          <w:numId w:val="13"/>
+        </w:numPr>
+        <w:shd w:val="clear" w:color="auto" w:fill="FFFFFF"/>
+        <w:spacing w:before="0" w:beforeAutospacing="0" w:after="0" w:afterAutospacing="0" w:line="240" w:lineRule="auto"/>
+        <w:ind w:firstLine="720" w:firstLineChars="0"/>
+        <w:rPr>
+          <w:rFonts w:hint="default" w:ascii="Arial" w:hAnsi="Arial" w:cs="Arial"/>
+          <w:color w:val="1F1F1F"/>
+          <w:lang w:val="en-US"/>
+        </w:rPr>
+      </w:pPr>
+      <w:r>
+        <w:rPr>
+          <w:rFonts w:hint="default" w:ascii="Arial" w:hAnsi="Arial" w:cs="Arial"/>
+          <w:color w:val="1F1F1F"/>
+          <w:lang w:val="en-US"/>
+        </w:rPr>
+        <w:t>Scam details</w:t>
+      </w:r>
+    </w:p>
+    <w:p>
+      <w:pPr>
+        <w:pStyle w:val="6"/>
+        <w:numPr>
+          <w:ilvl w:val="0"/>
+          <w:numId w:val="13"/>
+        </w:numPr>
+        <w:shd w:val="clear" w:color="auto" w:fill="FFFFFF"/>
+        <w:spacing w:before="0" w:beforeAutospacing="0" w:after="0" w:afterAutospacing="0" w:line="240" w:lineRule="auto"/>
+        <w:ind w:firstLine="720" w:firstLineChars="0"/>
+        <w:rPr>
+          <w:rFonts w:hint="default" w:ascii="Arial" w:hAnsi="Arial" w:cs="Arial"/>
+          <w:color w:val="1F1F1F"/>
+          <w:lang w:val="en-US"/>
+        </w:rPr>
+      </w:pPr>
+      <w:r>
+        <w:rPr>
+          <w:rFonts w:hint="default" w:ascii="Arial" w:hAnsi="Arial" w:cs="Arial"/>
+          <w:color w:val="1F1F1F"/>
+          <w:lang w:val="en-US"/>
+        </w:rPr>
+        <w:t>Reporter details (With submission date and time)</w:t>
+      </w:r>
+    </w:p>
+    <w:p>
+      <w:pPr>
+        <w:pStyle w:val="6"/>
+        <w:numPr>
+          <w:ilvl w:val="0"/>
+          <w:numId w:val="0"/>
+        </w:numPr>
+        <w:shd w:val="clear" w:color="auto" w:fill="FFFFFF"/>
+        <w:spacing w:before="0" w:beforeAutospacing="0" w:after="0" w:afterAutospacing="0" w:line="240" w:lineRule="auto"/>
+        <w:rPr>
+          <w:rFonts w:hint="default" w:ascii="Arial" w:hAnsi="Arial" w:cs="Arial"/>
+          <w:color w:val="1F1F1F"/>
+          <w:lang w:val="en-US"/>
+        </w:rPr>
+      </w:pPr>
+      <w:r>
+        <w:rPr>
+          <w:rFonts w:hint="default" w:ascii="Arial" w:hAnsi="Arial" w:cs="Arial"/>
+          <w:color w:val="1F1F1F"/>
+          <w:lang w:val="en-US"/>
+        </w:rPr>
+        <w:t>Button for apporval, edit request, and reject the event.</w:t>
+      </w:r>
+    </w:p>
+    <w:p>
+      <w:pPr>
+        <w:pStyle w:val="6"/>
+        <w:numPr>
+          <w:ilvl w:val="0"/>
+          <w:numId w:val="0"/>
+        </w:numPr>
+        <w:shd w:val="clear" w:color="auto" w:fill="FFFFFF"/>
+        <w:spacing w:before="0" w:beforeAutospacing="0" w:after="0" w:afterAutospacing="0" w:line="240" w:lineRule="auto"/>
+        <w:rPr>
+          <w:rFonts w:hint="default" w:ascii="Arial" w:hAnsi="Arial" w:cs="Arial"/>
+          <w:color w:val="1F1F1F"/>
+          <w:lang w:val="en-US"/>
+        </w:rPr>
+      </w:pPr>
+    </w:p>
+    <w:p>
+      <w:pPr>
+        <w:pStyle w:val="6"/>
+        <w:numPr>
+          <w:ilvl w:val="0"/>
+          <w:numId w:val="0"/>
+        </w:numPr>
+        <w:shd w:val="clear" w:color="auto" w:fill="FFFFFF"/>
+        <w:spacing w:before="0" w:beforeAutospacing="0" w:after="0" w:afterAutospacing="0" w:line="240" w:lineRule="auto"/>
+        <w:rPr>
+          <w:rFonts w:hint="default" w:ascii="Arial" w:hAnsi="Arial" w:cs="Arial"/>
+          <w:color w:val="1F1F1F"/>
+          <w:lang w:val="en-US"/>
+        </w:rPr>
+      </w:pPr>
+      <w:r>
+        <w:rPr>
+          <w:rFonts w:hint="default" w:ascii="Arial" w:hAnsi="Arial" w:cs="Arial"/>
+          <w:color w:val="1F1F1F"/>
+          <w:lang w:val="en-US"/>
+        </w:rPr>
+        <w:t xml:space="preserve">In deleted fraud events - All the deleted events from live fraud events or pending fraud events will be shown here. First all the events shown in a list with the following information - </w:t>
+      </w:r>
+    </w:p>
+    <w:p>
+      <w:pPr>
+        <w:pStyle w:val="6"/>
+        <w:numPr>
+          <w:ilvl w:val="0"/>
+          <w:numId w:val="0"/>
+        </w:numPr>
+        <w:shd w:val="clear" w:color="auto" w:fill="FFFFFF"/>
+        <w:spacing w:before="0" w:beforeAutospacing="0" w:after="0" w:afterAutospacing="0" w:line="240" w:lineRule="auto"/>
+        <w:rPr>
+          <w:rFonts w:hint="default" w:ascii="Arial" w:hAnsi="Arial" w:cs="Arial"/>
+          <w:color w:val="1F1F1F"/>
+          <w:lang w:val="en-US"/>
+        </w:rPr>
+      </w:pPr>
+    </w:p>
+    <w:p>
+      <w:pPr>
+        <w:pStyle w:val="6"/>
+        <w:numPr>
+          <w:ilvl w:val="0"/>
+          <w:numId w:val="14"/>
+        </w:numPr>
+        <w:shd w:val="clear" w:color="auto" w:fill="FFFFFF"/>
+        <w:spacing w:before="0" w:beforeAutospacing="0" w:after="0" w:afterAutospacing="0" w:line="240" w:lineRule="auto"/>
+        <w:ind w:firstLine="720" w:firstLineChars="0"/>
+        <w:rPr>
+          <w:rFonts w:hint="default" w:ascii="Arial" w:hAnsi="Arial" w:cs="Arial"/>
+          <w:color w:val="1F1F1F"/>
+          <w:lang w:val="en-US"/>
+        </w:rPr>
+      </w:pPr>
+      <w:r>
+        <w:rPr>
+          <w:rFonts w:hint="default" w:ascii="Arial" w:hAnsi="Arial" w:cs="Arial"/>
+          <w:color w:val="1F1F1F"/>
+          <w:lang w:val="en-US"/>
+        </w:rPr>
+        <w:t>Scam type as title of the event</w:t>
+      </w:r>
+    </w:p>
+    <w:p>
+      <w:pPr>
+        <w:pStyle w:val="6"/>
+        <w:numPr>
+          <w:ilvl w:val="0"/>
+          <w:numId w:val="14"/>
+        </w:numPr>
+        <w:shd w:val="clear" w:color="auto" w:fill="FFFFFF"/>
+        <w:spacing w:before="0" w:beforeAutospacing="0" w:after="0" w:afterAutospacing="0" w:line="240" w:lineRule="auto"/>
+        <w:ind w:firstLine="720" w:firstLineChars="0"/>
+        <w:rPr>
+          <w:rFonts w:hint="default" w:ascii="Arial" w:hAnsi="Arial" w:cs="Arial"/>
+          <w:color w:val="1F1F1F"/>
+          <w:lang w:val="en-US"/>
+        </w:rPr>
+      </w:pPr>
+      <w:r>
+        <w:rPr>
+          <w:rFonts w:hint="default" w:ascii="Arial" w:hAnsi="Arial" w:cs="Arial"/>
+          <w:color w:val="1F1F1F"/>
+          <w:lang w:val="en-US"/>
+        </w:rPr>
+        <w:t>Scam description (within 100 words)</w:t>
+      </w:r>
+    </w:p>
+    <w:p>
+      <w:pPr>
+        <w:pStyle w:val="6"/>
+        <w:numPr>
+          <w:ilvl w:val="0"/>
+          <w:numId w:val="14"/>
+        </w:numPr>
+        <w:shd w:val="clear" w:color="auto" w:fill="FFFFFF"/>
+        <w:spacing w:before="0" w:beforeAutospacing="0" w:after="0" w:afterAutospacing="0" w:line="240" w:lineRule="auto"/>
+        <w:ind w:firstLine="720" w:firstLineChars="0"/>
+        <w:rPr>
+          <w:rFonts w:hint="default" w:ascii="Arial" w:hAnsi="Arial" w:cs="Arial"/>
+          <w:color w:val="1F1F1F"/>
+          <w:lang w:val="en-US"/>
+        </w:rPr>
+      </w:pPr>
+      <w:r>
+        <w:rPr>
+          <w:rFonts w:hint="default" w:ascii="Arial" w:hAnsi="Arial" w:cs="Arial"/>
+          <w:color w:val="1F1F1F"/>
+          <w:lang w:val="en-US"/>
+        </w:rPr>
+        <w:t>Loss amount</w:t>
+      </w:r>
+    </w:p>
+    <w:p>
+      <w:pPr>
+        <w:pStyle w:val="6"/>
+        <w:numPr>
+          <w:ilvl w:val="0"/>
+          <w:numId w:val="14"/>
+        </w:numPr>
+        <w:shd w:val="clear" w:color="auto" w:fill="FFFFFF"/>
+        <w:spacing w:before="0" w:beforeAutospacing="0" w:after="0" w:afterAutospacing="0" w:line="240" w:lineRule="auto"/>
+        <w:ind w:firstLine="720" w:firstLineChars="0"/>
+        <w:rPr>
+          <w:rFonts w:hint="default" w:ascii="Arial" w:hAnsi="Arial" w:cs="Arial"/>
+          <w:color w:val="1F1F1F"/>
+          <w:lang w:val="en-US"/>
+        </w:rPr>
+      </w:pPr>
+      <w:r>
+        <w:rPr>
+          <w:rFonts w:hint="default" w:ascii="Arial" w:hAnsi="Arial" w:cs="Arial"/>
+          <w:color w:val="1F1F1F"/>
+          <w:lang w:val="en-US"/>
+        </w:rPr>
+        <w:t>Date and time of submission</w:t>
+      </w:r>
+    </w:p>
+    <w:p>
+      <w:pPr>
+        <w:pStyle w:val="6"/>
+        <w:numPr>
+          <w:ilvl w:val="0"/>
+          <w:numId w:val="14"/>
+        </w:numPr>
+        <w:shd w:val="clear" w:color="auto" w:fill="FFFFFF"/>
+        <w:spacing w:before="0" w:beforeAutospacing="0" w:after="0" w:afterAutospacing="0" w:line="240" w:lineRule="auto"/>
+        <w:ind w:firstLine="720" w:firstLineChars="0"/>
+        <w:rPr>
+          <w:rFonts w:hint="default" w:ascii="Arial" w:hAnsi="Arial" w:cs="Arial"/>
+          <w:color w:val="1F1F1F"/>
+          <w:lang w:val="en-US"/>
+        </w:rPr>
+      </w:pPr>
+      <w:r>
+        <w:rPr>
+          <w:rFonts w:hint="default" w:ascii="Arial" w:hAnsi="Arial" w:cs="Arial"/>
+          <w:color w:val="1F1F1F"/>
+          <w:lang w:val="en-US"/>
+        </w:rPr>
+        <w:t>Date and time of rejection</w:t>
+      </w:r>
+    </w:p>
+    <w:p>
+      <w:pPr>
+        <w:pStyle w:val="6"/>
+        <w:numPr>
+          <w:ilvl w:val="0"/>
+          <w:numId w:val="14"/>
+        </w:numPr>
+        <w:shd w:val="clear" w:color="auto" w:fill="FFFFFF"/>
+        <w:spacing w:before="0" w:beforeAutospacing="0" w:after="0" w:afterAutospacing="0" w:line="240" w:lineRule="auto"/>
+        <w:ind w:firstLine="720" w:firstLineChars="0"/>
+        <w:rPr>
+          <w:rFonts w:hint="default" w:ascii="Arial" w:hAnsi="Arial" w:cs="Arial"/>
+          <w:color w:val="1F1F1F"/>
+          <w:lang w:val="en-US"/>
+        </w:rPr>
+      </w:pPr>
+      <w:r>
+        <w:rPr>
+          <w:rFonts w:hint="default" w:ascii="Arial" w:hAnsi="Arial" w:cs="Arial"/>
+          <w:color w:val="1F1F1F"/>
+          <w:lang w:val="en-US"/>
+        </w:rPr>
+        <w:t>Total rejected day (since time of rejection)</w:t>
+      </w:r>
+    </w:p>
+    <w:p>
+      <w:pPr>
+        <w:pStyle w:val="6"/>
+        <w:numPr>
+          <w:ilvl w:val="0"/>
+          <w:numId w:val="14"/>
+        </w:numPr>
+        <w:shd w:val="clear" w:color="auto" w:fill="FFFFFF"/>
+        <w:spacing w:before="0" w:beforeAutospacing="0" w:after="0" w:afterAutospacing="0" w:line="240" w:lineRule="auto"/>
+        <w:ind w:firstLine="720" w:firstLineChars="0"/>
+        <w:rPr>
+          <w:rFonts w:hint="default" w:ascii="Arial" w:hAnsi="Arial" w:cs="Arial"/>
+          <w:color w:val="1F1F1F"/>
+          <w:lang w:val="en-US"/>
+        </w:rPr>
+      </w:pPr>
+      <w:r>
+        <w:rPr>
+          <w:rFonts w:hint="default" w:ascii="Arial" w:hAnsi="Arial" w:cs="Arial"/>
+          <w:color w:val="1F1F1F"/>
+          <w:lang w:val="en-US"/>
+        </w:rPr>
+        <w:t>Imposter name</w:t>
+      </w:r>
+    </w:p>
+    <w:p>
+      <w:pPr>
+        <w:pStyle w:val="6"/>
+        <w:numPr>
+          <w:ilvl w:val="0"/>
+          <w:numId w:val="14"/>
+        </w:numPr>
+        <w:shd w:val="clear" w:color="auto" w:fill="FFFFFF"/>
+        <w:spacing w:before="0" w:beforeAutospacing="0" w:after="0" w:afterAutospacing="0" w:line="240" w:lineRule="auto"/>
+        <w:ind w:firstLine="720" w:firstLineChars="0"/>
+        <w:rPr>
+          <w:rFonts w:hint="default" w:ascii="Arial" w:hAnsi="Arial" w:cs="Arial"/>
+          <w:color w:val="1F1F1F"/>
+          <w:lang w:val="en-US"/>
+        </w:rPr>
+      </w:pPr>
+      <w:r>
+        <w:rPr>
+          <w:rFonts w:hint="default" w:ascii="Arial" w:hAnsi="Arial" w:cs="Arial"/>
+          <w:color w:val="1F1F1F"/>
+          <w:lang w:val="en-US"/>
+        </w:rPr>
+        <w:t>Reporter name</w:t>
+      </w:r>
+    </w:p>
+    <w:p>
+      <w:pPr>
+        <w:pStyle w:val="6"/>
+        <w:numPr>
+          <w:ilvl w:val="0"/>
+          <w:numId w:val="14"/>
+        </w:numPr>
+        <w:shd w:val="clear" w:color="auto" w:fill="FFFFFF"/>
+        <w:spacing w:before="0" w:beforeAutospacing="0" w:after="0" w:afterAutospacing="0" w:line="240" w:lineRule="auto"/>
+        <w:ind w:firstLine="720" w:firstLineChars="0"/>
+        <w:rPr>
+          <w:rFonts w:hint="default" w:ascii="Arial" w:hAnsi="Arial" w:cs="Arial"/>
+          <w:color w:val="1F1F1F"/>
+          <w:lang w:val="en-US"/>
+        </w:rPr>
+      </w:pPr>
+      <w:r>
+        <w:rPr>
+          <w:rFonts w:hint="default" w:ascii="Arial" w:hAnsi="Arial" w:cs="Arial"/>
+          <w:color w:val="1F1F1F"/>
+          <w:lang w:val="en-US"/>
+        </w:rPr>
+        <w:t>Rejected admin name (implemented later, since admin panel is not created yet)</w:t>
+      </w:r>
+    </w:p>
+    <w:p>
+      <w:pPr>
+        <w:pStyle w:val="6"/>
+        <w:numPr>
+          <w:ilvl w:val="0"/>
+          <w:numId w:val="14"/>
+        </w:numPr>
+        <w:shd w:val="clear" w:color="auto" w:fill="FFFFFF"/>
+        <w:spacing w:before="0" w:beforeAutospacing="0" w:after="0" w:afterAutospacing="0" w:line="240" w:lineRule="auto"/>
+        <w:ind w:firstLine="720" w:firstLineChars="0"/>
+        <w:rPr>
+          <w:rFonts w:hint="default" w:ascii="Arial" w:hAnsi="Arial" w:cs="Arial"/>
+          <w:color w:val="1F1F1F"/>
+          <w:lang w:val="en-US"/>
+        </w:rPr>
+      </w:pPr>
+      <w:r>
+        <w:rPr>
+          <w:rFonts w:hint="default" w:ascii="Arial" w:hAnsi="Arial" w:cs="Arial"/>
+          <w:color w:val="1F1F1F"/>
+          <w:lang w:val="en-US"/>
+        </w:rPr>
+        <w:t>Rejected reason (submit by admin)</w:t>
+      </w:r>
+    </w:p>
+    <w:p>
+      <w:pPr>
+        <w:pStyle w:val="6"/>
+        <w:numPr>
+          <w:ilvl w:val="0"/>
+          <w:numId w:val="14"/>
+        </w:numPr>
+        <w:shd w:val="clear" w:color="auto" w:fill="FFFFFF"/>
+        <w:spacing w:before="0" w:beforeAutospacing="0" w:after="0" w:afterAutospacing="0" w:line="240" w:lineRule="auto"/>
+        <w:ind w:firstLine="720" w:firstLineChars="0"/>
+        <w:rPr>
+          <w:rFonts w:hint="default" w:ascii="Arial" w:hAnsi="Arial" w:cs="Arial"/>
+          <w:color w:val="1F1F1F"/>
+          <w:lang w:val="en-US"/>
+        </w:rPr>
+      </w:pPr>
+      <w:r>
+        <w:rPr>
+          <w:rFonts w:hint="default" w:ascii="Arial" w:hAnsi="Arial" w:cs="Arial"/>
+          <w:color w:val="1F1F1F"/>
+          <w:lang w:val="en-US"/>
+        </w:rPr>
+        <w:t>Event status (From where it is rejected)</w:t>
+      </w:r>
+    </w:p>
+    <w:p>
+      <w:pPr>
+        <w:pStyle w:val="6"/>
+        <w:numPr>
+          <w:ilvl w:val="0"/>
+          <w:numId w:val="14"/>
+        </w:numPr>
+        <w:shd w:val="clear" w:color="auto" w:fill="FFFFFF"/>
+        <w:spacing w:before="0" w:beforeAutospacing="0" w:after="0" w:afterAutospacing="0" w:line="240" w:lineRule="auto"/>
+        <w:ind w:firstLine="720" w:firstLineChars="0"/>
+        <w:rPr>
+          <w:rFonts w:hint="default" w:ascii="Arial" w:hAnsi="Arial" w:cs="Arial"/>
+          <w:color w:val="1F1F1F"/>
+          <w:lang w:val="en-US"/>
+        </w:rPr>
+      </w:pPr>
+      <w:r>
+        <w:rPr>
+          <w:rFonts w:hint="default" w:ascii="Arial" w:hAnsi="Arial" w:cs="Arial"/>
+          <w:color w:val="1F1F1F"/>
+          <w:lang w:val="en-US"/>
+        </w:rPr>
+        <w:t>Button for approve the event</w:t>
+      </w:r>
+    </w:p>
+    <w:p>
+      <w:pPr>
+        <w:pStyle w:val="6"/>
+        <w:numPr>
+          <w:ilvl w:val="0"/>
+          <w:numId w:val="0"/>
+        </w:numPr>
+        <w:shd w:val="clear" w:color="auto" w:fill="FFFFFF"/>
+        <w:spacing w:before="0" w:beforeAutospacing="0" w:after="0" w:afterAutospacing="0" w:line="240" w:lineRule="auto"/>
+        <w:rPr>
+          <w:rFonts w:hint="default" w:ascii="Arial" w:hAnsi="Arial" w:cs="Arial"/>
+          <w:color w:val="1F1F1F"/>
+          <w:lang w:val="en-US"/>
+        </w:rPr>
+      </w:pPr>
+      <w:r>
+        <w:rPr>
+          <w:rFonts w:hint="default" w:ascii="Arial" w:hAnsi="Arial" w:cs="Arial"/>
+          <w:color w:val="1F1F1F"/>
+          <w:lang w:val="en-US"/>
+        </w:rPr>
+        <w:t xml:space="preserve">After clicking the card, it will shows all the details about the deleted events and button for approve and edit request. </w:t>
+      </w:r>
+    </w:p>
+    <w:p>
+      <w:pPr>
+        <w:pStyle w:val="6"/>
+        <w:numPr>
+          <w:ilvl w:val="0"/>
+          <w:numId w:val="0"/>
+        </w:numPr>
+        <w:shd w:val="clear" w:color="auto" w:fill="FFFFFF"/>
+        <w:spacing w:before="0" w:beforeAutospacing="0" w:after="0" w:afterAutospacing="0" w:line="240" w:lineRule="auto"/>
+        <w:rPr>
+          <w:rFonts w:hint="default" w:ascii="Arial" w:hAnsi="Arial" w:cs="Arial"/>
+          <w:color w:val="1F1F1F"/>
+          <w:lang w:val="en-US"/>
+        </w:rPr>
+      </w:pPr>
+    </w:p>
+    <w:p>
+      <w:pPr>
+        <w:pStyle w:val="6"/>
+        <w:numPr>
+          <w:ilvl w:val="0"/>
+          <w:numId w:val="0"/>
+        </w:numPr>
+        <w:shd w:val="clear" w:color="auto" w:fill="FFFFFF"/>
+        <w:spacing w:before="0" w:beforeAutospacing="0" w:after="0" w:afterAutospacing="0" w:line="240" w:lineRule="auto"/>
+        <w:rPr>
+          <w:rFonts w:hint="default" w:ascii="Arial" w:hAnsi="Arial" w:cs="Arial"/>
+          <w:color w:val="1F1F1F"/>
+          <w:lang w:val="en-US"/>
+        </w:rPr>
+      </w:pPr>
+    </w:p>
+    <w:p>
+      <w:pPr>
+        <w:pStyle w:val="6"/>
+        <w:numPr>
+          <w:ilvl w:val="0"/>
+          <w:numId w:val="0"/>
+        </w:numPr>
+        <w:shd w:val="clear" w:color="auto" w:fill="FFFFFF"/>
+        <w:spacing w:before="0" w:beforeAutospacing="0" w:after="0" w:afterAutospacing="0" w:line="240" w:lineRule="auto"/>
+        <w:rPr>
+          <w:rFonts w:hint="default" w:ascii="Arial" w:hAnsi="Arial" w:cs="Arial"/>
+          <w:color w:val="1F1F1F"/>
+          <w:lang w:val="en-US"/>
+        </w:rPr>
+      </w:pPr>
+      <w:r>
+        <w:rPr>
+          <w:rFonts w:hint="default" w:ascii="Arial" w:hAnsi="Arial" w:cs="Arial"/>
+          <w:color w:val="1F1F1F"/>
+          <w:lang w:val="en-US"/>
+        </w:rPr>
+        <w:t xml:space="preserve">Make the changes in the admin.html page and make sure that the database schema is updated for holding all the changes in proper way. </w:t>
+      </w:r>
+    </w:p>
+    <w:p>
+      <w:pPr>
+        <w:pStyle w:val="6"/>
+        <w:numPr>
+          <w:ilvl w:val="0"/>
+          <w:numId w:val="0"/>
+        </w:numPr>
+        <w:shd w:val="clear" w:color="auto" w:fill="FFFFFF"/>
+        <w:spacing w:before="0" w:beforeAutospacing="0" w:after="0" w:afterAutospacing="0" w:line="240" w:lineRule="auto"/>
+        <w:rPr>
+          <w:rFonts w:hint="default" w:ascii="Arial" w:hAnsi="Arial" w:cs="Arial"/>
+          <w:color w:val="1F1F1F"/>
+          <w:lang w:val="en-US"/>
+        </w:rPr>
+      </w:pPr>
+    </w:p>
+    <w:p>
+      <w:pPr>
+        <w:pStyle w:val="6"/>
+        <w:numPr>
+          <w:ilvl w:val="0"/>
+          <w:numId w:val="0"/>
+        </w:numPr>
+        <w:shd w:val="clear" w:color="auto" w:fill="FFFFFF"/>
+        <w:spacing w:before="0" w:beforeAutospacing="0" w:after="0" w:afterAutospacing="0" w:line="240" w:lineRule="auto"/>
+        <w:rPr>
+          <w:rFonts w:hint="default" w:ascii="Arial" w:hAnsi="Arial" w:cs="Arial"/>
+          <w:color w:val="1F1F1F"/>
+          <w:lang w:val="en-US"/>
+        </w:rPr>
+      </w:pPr>
+      <w:r>
+        <w:rPr>
+          <w:rFonts w:hint="default" w:ascii="Arial" w:hAnsi="Arial" w:cs="Arial"/>
+          <w:color w:val="1F1F1F"/>
+          <w:lang w:val="en-US"/>
+        </w:rPr>
+        <w:t>Constraints:</w:t>
+      </w:r>
+    </w:p>
+    <w:p>
+      <w:pPr>
+        <w:pStyle w:val="6"/>
+        <w:numPr>
+          <w:ilvl w:val="0"/>
+          <w:numId w:val="15"/>
+        </w:numPr>
+        <w:shd w:val="clear" w:color="auto" w:fill="FFFFFF"/>
+        <w:spacing w:before="0" w:beforeAutospacing="0" w:after="0" w:afterAutospacing="0" w:line="240" w:lineRule="auto"/>
+        <w:rPr>
+          <w:rFonts w:hint="default" w:ascii="Arial" w:hAnsi="Arial" w:cs="Arial"/>
+          <w:color w:val="1F1F1F"/>
+          <w:lang w:val="en-US"/>
+        </w:rPr>
+      </w:pPr>
+      <w:r>
+        <w:rPr>
+          <w:rFonts w:hint="default" w:ascii="Arial" w:hAnsi="Arial" w:cs="Arial"/>
+          <w:color w:val="1F1F1F"/>
+          <w:lang w:val="en-US"/>
+        </w:rPr>
+        <w:t>Make sure the admin homepage is enough user friendly for the admin panel</w:t>
+      </w:r>
+    </w:p>
+    <w:p>
+      <w:pPr>
+        <w:pStyle w:val="6"/>
+        <w:numPr>
+          <w:ilvl w:val="0"/>
+          <w:numId w:val="15"/>
+        </w:numPr>
+        <w:shd w:val="clear" w:color="auto" w:fill="FFFFFF"/>
+        <w:spacing w:before="0" w:beforeAutospacing="0" w:after="0" w:afterAutospacing="0" w:line="240" w:lineRule="auto"/>
+        <w:rPr>
+          <w:rFonts w:hint="default" w:ascii="Arial" w:hAnsi="Arial" w:cs="Arial"/>
+          <w:color w:val="1F1F1F"/>
+          <w:lang w:val="en-US"/>
+        </w:rPr>
+      </w:pPr>
+      <w:r>
+        <w:rPr>
+          <w:rFonts w:hint="default" w:ascii="Arial" w:hAnsi="Arial" w:cs="Arial"/>
+          <w:color w:val="1F1F1F"/>
+          <w:lang w:val="en-US"/>
+        </w:rPr>
+        <w:t>Make spaces for holding imposter list, reporter list and admin list.</w:t>
+      </w:r>
+    </w:p>
+    <w:p>
+      <w:pPr>
+        <w:pStyle w:val="6"/>
+        <w:numPr>
+          <w:ilvl w:val="0"/>
+          <w:numId w:val="15"/>
+        </w:numPr>
+        <w:shd w:val="clear" w:color="auto" w:fill="FFFFFF"/>
+        <w:spacing w:before="0" w:beforeAutospacing="0" w:after="0" w:afterAutospacing="0" w:line="240" w:lineRule="auto"/>
+        <w:rPr>
+          <w:rFonts w:hint="default" w:ascii="Arial" w:hAnsi="Arial" w:cs="Arial"/>
+          <w:color w:val="1F1F1F"/>
+          <w:lang w:val="en-US"/>
+        </w:rPr>
+      </w:pPr>
+      <w:r>
+        <w:rPr>
+          <w:rFonts w:hint="default" w:ascii="Arial" w:hAnsi="Arial" w:cs="Arial"/>
+          <w:color w:val="1F1F1F"/>
+          <w:lang w:val="en-US"/>
+        </w:rPr>
+        <w:t>Each item should be different with relevant color. Like  - light red for delete list, light green for live list and so on.</w:t>
+      </w:r>
+    </w:p>
+    <w:p>
+      <w:pPr>
+        <w:pStyle w:val="6"/>
+        <w:numPr>
+          <w:numId w:val="0"/>
+        </w:numPr>
+        <w:shd w:val="clear" w:color="auto" w:fill="FFFFFF"/>
+        <w:spacing w:before="0" w:beforeAutospacing="0" w:after="0" w:afterAutospacing="0" w:line="240" w:lineRule="auto"/>
+        <w:rPr>
+          <w:rFonts w:hint="default" w:ascii="Arial" w:hAnsi="Arial" w:cs="Arial"/>
+          <w:color w:val="1F1F1F"/>
+          <w:lang w:val="en-US"/>
+        </w:rPr>
+      </w:pPr>
+    </w:p>
+    <w:p>
+      <w:pPr>
+        <w:pStyle w:val="6"/>
+        <w:numPr>
+          <w:numId w:val="0"/>
+        </w:numPr>
+        <w:shd w:val="clear" w:color="auto" w:fill="FFFFFF"/>
+        <w:spacing w:before="0" w:beforeAutospacing="0" w:after="0" w:afterAutospacing="0" w:line="240" w:lineRule="auto"/>
+        <w:rPr>
+          <w:rFonts w:hint="default" w:ascii="Arial" w:hAnsi="Arial" w:cs="Arial"/>
+          <w:color w:val="1F1F1F"/>
+          <w:lang w:val="en-US"/>
+        </w:rPr>
+      </w:pPr>
+    </w:p>
+    <w:p>
+      <w:pPr>
+        <w:pStyle w:val="6"/>
+        <w:numPr>
+          <w:numId w:val="0"/>
+        </w:numPr>
+        <w:shd w:val="clear" w:color="auto" w:fill="FFFFFF"/>
+        <w:spacing w:before="0" w:beforeAutospacing="0" w:after="0" w:afterAutospacing="0" w:line="240" w:lineRule="auto"/>
+        <w:rPr>
+          <w:rFonts w:hint="default" w:ascii="Arial" w:hAnsi="Arial" w:cs="Arial"/>
+          <w:color w:val="1F1F1F"/>
+          <w:lang w:val="en-US"/>
+        </w:rPr>
+      </w:pPr>
+      <w:r>
+        <w:rPr>
+          <w:rFonts w:hint="default" w:ascii="Arial" w:hAnsi="Arial" w:cs="Arial"/>
+          <w:color w:val="1F1F1F"/>
+          <w:lang w:val="en-US"/>
+        </w:rPr>
+        <w:t xml:space="preserve">We are going to redesign the home page(index.html) today and updating our search feature. </w:t>
+      </w:r>
+    </w:p>
+    <w:p>
+      <w:pPr>
+        <w:pStyle w:val="6"/>
+        <w:numPr>
+          <w:numId w:val="0"/>
+        </w:numPr>
+        <w:shd w:val="clear" w:color="auto" w:fill="FFFFFF"/>
+        <w:spacing w:before="0" w:beforeAutospacing="0" w:after="0" w:afterAutospacing="0" w:line="240" w:lineRule="auto"/>
+        <w:rPr>
+          <w:rFonts w:hint="default" w:ascii="Arial" w:hAnsi="Arial" w:cs="Arial"/>
+          <w:color w:val="1F1F1F"/>
+          <w:lang w:val="en-US"/>
+        </w:rPr>
+      </w:pPr>
+    </w:p>
+    <w:p>
+      <w:pPr>
+        <w:pStyle w:val="6"/>
+        <w:numPr>
+          <w:numId w:val="0"/>
+        </w:numPr>
+        <w:shd w:val="clear" w:color="auto" w:fill="FFFFFF"/>
+        <w:spacing w:before="0" w:beforeAutospacing="0" w:after="0" w:afterAutospacing="0" w:line="240" w:lineRule="auto"/>
+        <w:rPr>
+          <w:rFonts w:hint="default" w:ascii="Arial" w:hAnsi="Arial" w:cs="Arial"/>
+          <w:color w:val="1F1F1F"/>
+          <w:lang w:val="en-US"/>
+        </w:rPr>
+      </w:pPr>
+      <w:r>
+        <w:rPr>
+          <w:rFonts w:hint="default" w:ascii="Arial" w:hAnsi="Arial" w:cs="Arial"/>
+          <w:color w:val="1F1F1F"/>
+          <w:lang w:val="en-US"/>
+        </w:rPr>
+        <w:t>Context:</w:t>
+      </w:r>
+    </w:p>
+    <w:p>
+      <w:pPr>
+        <w:pStyle w:val="6"/>
+        <w:numPr>
+          <w:numId w:val="0"/>
+        </w:numPr>
+        <w:shd w:val="clear" w:color="auto" w:fill="FFFFFF"/>
+        <w:spacing w:before="0" w:beforeAutospacing="0" w:after="0" w:afterAutospacing="0" w:line="240" w:lineRule="auto"/>
+        <w:rPr>
+          <w:rFonts w:hint="default" w:ascii="Arial" w:hAnsi="Arial" w:cs="Arial"/>
+          <w:color w:val="1F1F1F"/>
+          <w:lang w:val="en-US"/>
+        </w:rPr>
+      </w:pPr>
+      <w:r>
+        <w:rPr>
+          <w:rFonts w:hint="default" w:ascii="Arial" w:hAnsi="Arial" w:cs="Arial"/>
+          <w:color w:val="1F1F1F"/>
+          <w:lang w:val="en-US"/>
+        </w:rPr>
+        <w:t xml:space="preserve">The general user don’t know anything about the website now. So, when a new user visit </w:t>
       </w:r>
       <w:bookmarkStart w:id="0" w:name="_GoBack"/>
       <w:bookmarkEnd w:id="0"/>
@@ -1900,30 +3607,204 @@
           <w:color w:val="1F1F1F"/>
           <w:lang w:val="en-US"/>
         </w:rPr>
-        <w:t>elete fraud events, imposter list, and reporter list. Also they can take action based on the current situation.</w:t>
-      </w:r>
-    </w:p>
-    <w:p>
-      <w:pPr>
-        <w:pStyle w:val="6"/>
-        <w:numPr>
-          <w:ilvl w:val="0"/>
-          <w:numId w:val="0"/>
-        </w:numPr>
-        <w:shd w:val="clear" w:color="auto" w:fill="FFFFFF"/>
-        <w:spacing w:before="0" w:beforeAutospacing="0" w:after="0" w:afterAutospacing="0" w:line="240" w:lineRule="auto"/>
-        <w:rPr>
-          <w:rFonts w:hint="default" w:ascii="Arial" w:hAnsi="Arial" w:cs="Arial"/>
-          <w:color w:val="1F1F1F"/>
-          <w:lang w:val="en-US"/>
-        </w:rPr>
-      </w:pPr>
-    </w:p>
-    <w:p>
-      <w:pPr>
-        <w:pStyle w:val="6"/>
-        <w:numPr>
-          <w:ilvl w:val="0"/>
+        <w:t xml:space="preserve">the website, he should get an idea at his first look. The purpose of the website should be cleared to the user at a first glance. So, we need to change the website homepage like this. </w:t>
+      </w:r>
+    </w:p>
+    <w:p>
+      <w:pPr>
+        <w:pStyle w:val="6"/>
+        <w:numPr>
+          <w:numId w:val="0"/>
+        </w:numPr>
+        <w:shd w:val="clear" w:color="auto" w:fill="FFFFFF"/>
+        <w:spacing w:before="0" w:beforeAutospacing="0" w:after="0" w:afterAutospacing="0" w:line="240" w:lineRule="auto"/>
+        <w:rPr>
+          <w:rFonts w:hint="default" w:ascii="Arial" w:hAnsi="Arial" w:cs="Arial"/>
+          <w:color w:val="1F1F1F"/>
+          <w:lang w:val="en-US"/>
+        </w:rPr>
+      </w:pPr>
+    </w:p>
+    <w:p>
+      <w:pPr>
+        <w:pStyle w:val="6"/>
+        <w:numPr>
+          <w:numId w:val="0"/>
+        </w:numPr>
+        <w:shd w:val="clear" w:color="auto" w:fill="FFFFFF"/>
+        <w:spacing w:before="0" w:beforeAutospacing="0" w:after="0" w:afterAutospacing="0" w:line="240" w:lineRule="auto"/>
+        <w:rPr>
+          <w:rFonts w:hint="default" w:ascii="Arial" w:hAnsi="Arial" w:cs="Arial"/>
+          <w:color w:val="1F1F1F"/>
+          <w:lang w:val="en-US"/>
+        </w:rPr>
+      </w:pPr>
+      <w:r>
+        <w:rPr>
+          <w:rFonts w:hint="default" w:ascii="Arial" w:hAnsi="Arial" w:cs="Arial"/>
+          <w:color w:val="1F1F1F"/>
+          <w:lang w:val="en-US"/>
+        </w:rPr>
+        <w:t xml:space="preserve">The ‘report an incident’ button should be place in more easy to find location and with more context. Like - “Are you a victim of a Scam? Then report the incident. It’ll help others.” </w:t>
+      </w:r>
+      <w:r>
+        <w:rPr>
+          <w:rFonts w:hint="default" w:ascii="Arial" w:hAnsi="Arial" w:cs="Arial"/>
+          <w:color w:val="1F1F1F"/>
+          <w:lang w:val="en-US"/>
+        </w:rPr>
+        <w:br w:type="textWrapping"/>
+      </w:r>
+      <w:r>
+        <w:rPr>
+          <w:rFonts w:hint="default" w:ascii="Arial" w:hAnsi="Arial" w:cs="Arial"/>
+          <w:color w:val="1F1F1F"/>
+          <w:lang w:val="en-US"/>
+        </w:rPr>
+        <w:br w:type="textWrapping"/>
+      </w:r>
+      <w:r>
+        <w:rPr>
+          <w:rFonts w:hint="default" w:ascii="Arial" w:hAnsi="Arial" w:cs="Arial"/>
+          <w:color w:val="1F1F1F"/>
+          <w:lang w:val="en-US"/>
+        </w:rPr>
+        <w:t xml:space="preserve">The search feature should be more accurate with “imposter name, imposter nickname, phone number, imposter alternative phone number, imposter NID number, GD number, scam type, scam description, scam location”. The search feature should not show search results from reporter name, phone number and email. </w:t>
+      </w:r>
+    </w:p>
+    <w:p>
+      <w:pPr>
+        <w:pStyle w:val="6"/>
+        <w:numPr>
+          <w:numId w:val="0"/>
+        </w:numPr>
+        <w:shd w:val="clear" w:color="auto" w:fill="FFFFFF"/>
+        <w:spacing w:before="0" w:beforeAutospacing="0" w:after="0" w:afterAutospacing="0" w:line="240" w:lineRule="auto"/>
+        <w:rPr>
+          <w:rFonts w:hint="default" w:ascii="Arial" w:hAnsi="Arial" w:cs="Arial"/>
+          <w:color w:val="1F1F1F"/>
+          <w:lang w:val="en-US"/>
+        </w:rPr>
+      </w:pPr>
+    </w:p>
+    <w:p>
+      <w:pPr>
+        <w:pStyle w:val="6"/>
+        <w:numPr>
+          <w:numId w:val="0"/>
+        </w:numPr>
+        <w:shd w:val="clear" w:color="auto" w:fill="FFFFFF"/>
+        <w:spacing w:before="0" w:beforeAutospacing="0" w:after="0" w:afterAutospacing="0" w:line="240" w:lineRule="auto"/>
+        <w:rPr>
+          <w:rFonts w:hint="default" w:ascii="Arial" w:hAnsi="Arial" w:cs="Arial"/>
+          <w:color w:val="1F1F1F"/>
+          <w:lang w:val="en-US"/>
+        </w:rPr>
+      </w:pPr>
+      <w:r>
+        <w:rPr>
+          <w:rFonts w:hint="default" w:ascii="Arial" w:hAnsi="Arial" w:cs="Arial"/>
+          <w:color w:val="1F1F1F"/>
+          <w:lang w:val="en-US"/>
+        </w:rPr>
+        <w:t xml:space="preserve">All the matched live fraud event should be shown in a list format, with some important fields information. </w:t>
+      </w:r>
+    </w:p>
+    <w:p>
+      <w:pPr>
+        <w:pStyle w:val="6"/>
+        <w:numPr>
+          <w:numId w:val="0"/>
+        </w:numPr>
+        <w:shd w:val="clear" w:color="auto" w:fill="FFFFFF"/>
+        <w:spacing w:before="0" w:beforeAutospacing="0" w:after="0" w:afterAutospacing="0" w:line="240" w:lineRule="auto"/>
+        <w:rPr>
+          <w:rFonts w:hint="default" w:ascii="Arial" w:hAnsi="Arial" w:cs="Arial"/>
+          <w:color w:val="1F1F1F"/>
+          <w:lang w:val="en-US"/>
+        </w:rPr>
+      </w:pPr>
+    </w:p>
+    <w:p>
+      <w:pPr>
+        <w:pStyle w:val="6"/>
+        <w:numPr>
+          <w:numId w:val="0"/>
+        </w:numPr>
+        <w:shd w:val="clear" w:color="auto" w:fill="FFFFFF"/>
+        <w:spacing w:before="0" w:beforeAutospacing="0" w:after="0" w:afterAutospacing="0" w:line="240" w:lineRule="auto"/>
+        <w:rPr>
+          <w:rFonts w:hint="default" w:ascii="Arial" w:hAnsi="Arial" w:cs="Arial"/>
+          <w:color w:val="1F1F1F"/>
+          <w:lang w:val="en-US"/>
+        </w:rPr>
+      </w:pPr>
+      <w:r>
+        <w:rPr>
+          <w:rFonts w:hint="default" w:ascii="Arial" w:hAnsi="Arial" w:cs="Arial"/>
+          <w:color w:val="1F1F1F"/>
+          <w:lang w:val="en-US"/>
+        </w:rPr>
+        <w:t>Clicking on specific fraud events should open in a new page with the unique URLs for each events. Which will shows all the details about the fraud event and the imposter. All the relevant images/files/videos must be shown in the fraud details page.</w:t>
+      </w:r>
+    </w:p>
+    <w:p>
+      <w:pPr>
+        <w:pStyle w:val="6"/>
+        <w:numPr>
+          <w:numId w:val="0"/>
+        </w:numPr>
+        <w:shd w:val="clear" w:color="auto" w:fill="FFFFFF"/>
+        <w:spacing w:before="0" w:beforeAutospacing="0" w:after="0" w:afterAutospacing="0" w:line="240" w:lineRule="auto"/>
+        <w:rPr>
+          <w:rFonts w:hint="default" w:ascii="Arial" w:hAnsi="Arial" w:cs="Arial"/>
+          <w:color w:val="1F1F1F"/>
+          <w:lang w:val="en-US"/>
+        </w:rPr>
+      </w:pPr>
+    </w:p>
+    <w:p>
+      <w:pPr>
+        <w:pStyle w:val="6"/>
+        <w:numPr>
+          <w:numId w:val="0"/>
+        </w:numPr>
+        <w:shd w:val="clear" w:color="auto" w:fill="FFFFFF"/>
+        <w:spacing w:before="0" w:beforeAutospacing="0" w:after="0" w:afterAutospacing="0" w:line="240" w:lineRule="auto"/>
+        <w:rPr>
+          <w:rFonts w:hint="default" w:ascii="Arial" w:hAnsi="Arial" w:cs="Arial"/>
+          <w:color w:val="1F1F1F"/>
+          <w:lang w:val="en-US"/>
+        </w:rPr>
+      </w:pPr>
+      <w:r>
+        <w:rPr>
+          <w:rFonts w:hint="default" w:ascii="Arial" w:hAnsi="Arial" w:cs="Arial"/>
+          <w:color w:val="1F1F1F"/>
+          <w:lang w:val="en-US"/>
+        </w:rPr>
+        <w:t>The imposter profile should be linked with the fraud details page with imposter name and image. Clicking on the imposter card will open a imposter details page.</w:t>
+      </w:r>
+    </w:p>
+    <w:p>
+      <w:pPr>
+        <w:pStyle w:val="6"/>
+        <w:numPr>
+          <w:numId w:val="0"/>
+        </w:numPr>
+        <w:shd w:val="clear" w:color="auto" w:fill="FFFFFF"/>
+        <w:spacing w:before="0" w:beforeAutospacing="0" w:after="0" w:afterAutospacing="0" w:line="240" w:lineRule="auto"/>
+        <w:rPr>
+          <w:rFonts w:hint="default" w:ascii="Arial" w:hAnsi="Arial" w:cs="Arial"/>
+          <w:color w:val="1F1F1F"/>
+          <w:lang w:val="en-US"/>
+        </w:rPr>
+      </w:pPr>
+    </w:p>
+    <w:p>
+      <w:pPr>
+        <w:pStyle w:val="6"/>
+        <w:numPr>
           <w:numId w:val="0"/>
         </w:numPr>
         <w:shd w:val="clear" w:color="auto" w:fill="FFFFFF"/>
@@ -1947,80 +3828,232 @@
       <w:pPr>
         <w:pStyle w:val="6"/>
         <w:numPr>
-          <w:ilvl w:val="0"/>
-          <w:numId w:val="0"/>
-        </w:numPr>
-        <w:shd w:val="clear" w:color="auto" w:fill="FFFFFF"/>
-        <w:spacing w:before="0" w:beforeAutospacing="0" w:after="0" w:afterAutospacing="0" w:line="240" w:lineRule="auto"/>
-        <w:rPr>
-          <w:rFonts w:hint="default" w:ascii="Arial" w:hAnsi="Arial" w:cs="Arial"/>
-          <w:color w:val="1F1F1F"/>
-          <w:lang w:val="en-US"/>
-        </w:rPr>
-      </w:pPr>
-      <w:r>
-        <w:rPr>
-          <w:rFonts w:hint="default" w:ascii="Arial" w:hAnsi="Arial" w:cs="Arial"/>
-          <w:color w:val="1F1F1F"/>
-          <w:lang w:val="en-US"/>
-        </w:rPr>
-        <w:t>You’ve to update the admin.html page to cover all the cases described in context.</w:t>
-      </w:r>
-    </w:p>
-    <w:p>
-      <w:pPr>
-        <w:pStyle w:val="6"/>
-        <w:numPr>
-          <w:ilvl w:val="0"/>
-          <w:numId w:val="0"/>
-        </w:numPr>
-        <w:shd w:val="clear" w:color="auto" w:fill="FFFFFF"/>
-        <w:spacing w:before="0" w:beforeAutospacing="0" w:after="0" w:afterAutospacing="0" w:line="240" w:lineRule="auto"/>
-        <w:rPr>
-          <w:rFonts w:hint="default" w:ascii="Arial" w:hAnsi="Arial" w:cs="Arial"/>
-          <w:color w:val="1F1F1F"/>
-          <w:lang w:val="en-US"/>
-        </w:rPr>
-      </w:pPr>
-      <w:r>
-        <w:rPr>
-          <w:rFonts w:hint="default" w:ascii="Arial" w:hAnsi="Arial" w:cs="Arial"/>
-          <w:color w:val="1F1F1F"/>
-          <w:lang w:val="en-US"/>
-        </w:rPr>
-        <w:t>For the live fraud events -</w:t>
-      </w:r>
-    </w:p>
-    <w:p>
-      <w:pPr>
-        <w:pStyle w:val="6"/>
-        <w:numPr>
-          <w:ilvl w:val="0"/>
-          <w:numId w:val="0"/>
-        </w:numPr>
-        <w:shd w:val="clear" w:color="auto" w:fill="FFFFFF"/>
-        <w:spacing w:before="0" w:beforeAutospacing="0" w:after="0" w:afterAutospacing="0" w:line="240" w:lineRule="auto"/>
-        <w:rPr>
-          <w:rFonts w:hint="default" w:ascii="Arial" w:hAnsi="Arial" w:cs="Arial"/>
-          <w:color w:val="1F1F1F"/>
-          <w:lang w:val="en-US"/>
-        </w:rPr>
-      </w:pPr>
-      <w:r>
-        <w:rPr>
-          <w:rFonts w:hint="default" w:ascii="Arial" w:hAnsi="Arial" w:cs="Arial"/>
-          <w:color w:val="1F1F1F"/>
-          <w:lang w:val="en-US"/>
-        </w:rPr>
-        <w:t xml:space="preserve">All the events should be showed in a card format with some important information. This can be  - </w:t>
-      </w:r>
-    </w:p>
-    <w:p>
-      <w:pPr>
-        <w:pStyle w:val="6"/>
-        <w:numPr>
-          <w:ilvl w:val="0"/>
-          <w:numId w:val="9"/>
+          <w:numId w:val="0"/>
+        </w:numPr>
+        <w:shd w:val="clear" w:color="auto" w:fill="FFFFFF"/>
+        <w:spacing w:before="0" w:beforeAutospacing="0" w:after="0" w:afterAutospacing="0" w:line="240" w:lineRule="auto"/>
+        <w:rPr>
+          <w:rFonts w:hint="default" w:ascii="Arial" w:hAnsi="Arial" w:cs="Arial"/>
+          <w:color w:val="1F1F1F"/>
+          <w:lang w:val="en-US"/>
+        </w:rPr>
+      </w:pPr>
+      <w:r>
+        <w:rPr>
+          <w:rFonts w:hint="default" w:ascii="Arial" w:hAnsi="Arial" w:cs="Arial"/>
+          <w:color w:val="1F1F1F"/>
+          <w:lang w:val="en-US"/>
+        </w:rPr>
+        <w:t xml:space="preserve">First redesign the homepage for showing the purpose of this website and give a short summary in easy way. Also re-place the ‘report and incident’ button with proper context. </w:t>
+      </w:r>
+    </w:p>
+    <w:p>
+      <w:pPr>
+        <w:pStyle w:val="6"/>
+        <w:numPr>
+          <w:numId w:val="0"/>
+        </w:numPr>
+        <w:shd w:val="clear" w:color="auto" w:fill="FFFFFF"/>
+        <w:spacing w:before="0" w:beforeAutospacing="0" w:after="0" w:afterAutospacing="0" w:line="240" w:lineRule="auto"/>
+        <w:rPr>
+          <w:rFonts w:hint="default" w:ascii="Arial" w:hAnsi="Arial" w:cs="Arial"/>
+          <w:color w:val="1F1F1F"/>
+          <w:lang w:val="en-US"/>
+        </w:rPr>
+      </w:pPr>
+    </w:p>
+    <w:p>
+      <w:pPr>
+        <w:pStyle w:val="6"/>
+        <w:numPr>
+          <w:numId w:val="0"/>
+        </w:numPr>
+        <w:shd w:val="clear" w:color="auto" w:fill="FFFFFF"/>
+        <w:spacing w:before="0" w:beforeAutospacing="0" w:after="0" w:afterAutospacing="0" w:line="240" w:lineRule="auto"/>
+        <w:rPr>
+          <w:rFonts w:hint="default" w:ascii="Arial" w:hAnsi="Arial" w:cs="Arial"/>
+          <w:color w:val="1F1F1F"/>
+          <w:lang w:val="en-US"/>
+        </w:rPr>
+      </w:pPr>
+      <w:r>
+        <w:rPr>
+          <w:rFonts w:hint="default" w:ascii="Arial" w:hAnsi="Arial" w:cs="Arial"/>
+          <w:color w:val="1F1F1F"/>
+          <w:lang w:val="en-US"/>
+        </w:rPr>
+        <w:t xml:space="preserve">Then update the search feature with the notified fields and show the search result in a list with live matched events. The event card should contains - </w:t>
+      </w:r>
+    </w:p>
+    <w:p>
+      <w:pPr>
+        <w:pStyle w:val="6"/>
+        <w:numPr>
+          <w:ilvl w:val="0"/>
+          <w:numId w:val="16"/>
+        </w:numPr>
+        <w:shd w:val="clear" w:color="auto" w:fill="FFFFFF"/>
+        <w:spacing w:before="0" w:beforeAutospacing="0" w:after="0" w:afterAutospacing="0" w:line="240" w:lineRule="auto"/>
+        <w:ind w:left="0" w:leftChars="0" w:firstLine="720" w:firstLineChars="0"/>
+        <w:rPr>
+          <w:rFonts w:hint="default" w:ascii="Arial" w:hAnsi="Arial" w:cs="Arial"/>
+          <w:color w:val="1F1F1F"/>
+          <w:lang w:val="en-US"/>
+        </w:rPr>
+      </w:pPr>
+      <w:r>
+        <w:rPr>
+          <w:rFonts w:hint="default" w:ascii="Arial" w:hAnsi="Arial" w:cs="Arial"/>
+          <w:color w:val="1F1F1F"/>
+          <w:lang w:val="en-US"/>
+        </w:rPr>
+        <w:t>Scam type as title</w:t>
+      </w:r>
+    </w:p>
+    <w:p>
+      <w:pPr>
+        <w:pStyle w:val="6"/>
+        <w:numPr>
+          <w:ilvl w:val="0"/>
+          <w:numId w:val="16"/>
+        </w:numPr>
+        <w:shd w:val="clear" w:color="auto" w:fill="FFFFFF"/>
+        <w:spacing w:before="0" w:beforeAutospacing="0" w:after="0" w:afterAutospacing="0" w:line="240" w:lineRule="auto"/>
+        <w:ind w:left="0" w:leftChars="0" w:firstLine="720" w:firstLineChars="0"/>
+        <w:rPr>
+          <w:rFonts w:hint="default" w:ascii="Arial" w:hAnsi="Arial" w:cs="Arial"/>
+          <w:color w:val="1F1F1F"/>
+          <w:lang w:val="en-US"/>
+        </w:rPr>
+      </w:pPr>
+      <w:r>
+        <w:rPr>
+          <w:rFonts w:hint="default" w:ascii="Arial" w:hAnsi="Arial" w:cs="Arial"/>
+          <w:color w:val="1F1F1F"/>
+          <w:lang w:val="en-US"/>
+        </w:rPr>
+        <w:t>Scam short description within 100 words</w:t>
+      </w:r>
+    </w:p>
+    <w:p>
+      <w:pPr>
+        <w:pStyle w:val="6"/>
+        <w:numPr>
+          <w:ilvl w:val="0"/>
+          <w:numId w:val="16"/>
+        </w:numPr>
+        <w:shd w:val="clear" w:color="auto" w:fill="FFFFFF"/>
+        <w:spacing w:before="0" w:beforeAutospacing="0" w:after="0" w:afterAutospacing="0" w:line="240" w:lineRule="auto"/>
+        <w:ind w:left="0" w:leftChars="0" w:firstLine="720" w:firstLineChars="0"/>
+        <w:rPr>
+          <w:rFonts w:hint="default" w:ascii="Arial" w:hAnsi="Arial" w:cs="Arial"/>
+          <w:color w:val="1F1F1F"/>
+          <w:lang w:val="en-US"/>
+        </w:rPr>
+      </w:pPr>
+      <w:r>
+        <w:rPr>
+          <w:rFonts w:hint="default" w:ascii="Arial" w:hAnsi="Arial" w:cs="Arial"/>
+          <w:color w:val="1F1F1F"/>
+          <w:lang w:val="en-US"/>
+        </w:rPr>
+        <w:t>Imposter name with imposter picture(circle)</w:t>
+      </w:r>
+    </w:p>
+    <w:p>
+      <w:pPr>
+        <w:pStyle w:val="6"/>
+        <w:numPr>
+          <w:ilvl w:val="0"/>
+          <w:numId w:val="16"/>
+        </w:numPr>
+        <w:shd w:val="clear" w:color="auto" w:fill="FFFFFF"/>
+        <w:spacing w:before="0" w:beforeAutospacing="0" w:after="0" w:afterAutospacing="0" w:line="240" w:lineRule="auto"/>
+        <w:ind w:left="0" w:leftChars="0" w:firstLine="720" w:firstLineChars="0"/>
+        <w:rPr>
+          <w:rFonts w:hint="default" w:ascii="Arial" w:hAnsi="Arial" w:cs="Arial"/>
+          <w:color w:val="1F1F1F"/>
+          <w:lang w:val="en-US"/>
+        </w:rPr>
+      </w:pPr>
+      <w:r>
+        <w:rPr>
+          <w:rFonts w:hint="default" w:ascii="Arial" w:hAnsi="Arial" w:cs="Arial"/>
+          <w:color w:val="1F1F1F"/>
+          <w:lang w:val="en-US"/>
+        </w:rPr>
+        <w:t>Loss amount</w:t>
+      </w:r>
+    </w:p>
+    <w:p>
+      <w:pPr>
+        <w:pStyle w:val="6"/>
+        <w:numPr>
+          <w:ilvl w:val="0"/>
+          <w:numId w:val="16"/>
+        </w:numPr>
+        <w:shd w:val="clear" w:color="auto" w:fill="FFFFFF"/>
+        <w:spacing w:before="0" w:beforeAutospacing="0" w:after="0" w:afterAutospacing="0" w:line="240" w:lineRule="auto"/>
+        <w:ind w:left="0" w:leftChars="0" w:firstLine="720" w:firstLineChars="0"/>
+        <w:rPr>
+          <w:rFonts w:hint="default" w:ascii="Arial" w:hAnsi="Arial" w:cs="Arial"/>
+          <w:color w:val="1F1F1F"/>
+          <w:lang w:val="en-US"/>
+        </w:rPr>
+      </w:pPr>
+      <w:r>
+        <w:rPr>
+          <w:rFonts w:hint="default" w:ascii="Arial" w:hAnsi="Arial" w:cs="Arial"/>
+          <w:color w:val="1F1F1F"/>
+          <w:lang w:val="en-US"/>
+        </w:rPr>
+        <w:t>Location of the scam</w:t>
+      </w:r>
+    </w:p>
+    <w:p>
+      <w:pPr>
+        <w:pStyle w:val="6"/>
+        <w:numPr>
+          <w:numId w:val="0"/>
+        </w:numPr>
+        <w:shd w:val="clear" w:color="auto" w:fill="FFFFFF"/>
+        <w:spacing w:before="0" w:beforeAutospacing="0" w:after="0" w:afterAutospacing="0" w:line="240" w:lineRule="auto"/>
+        <w:rPr>
+          <w:rFonts w:hint="default" w:ascii="Arial" w:hAnsi="Arial" w:cs="Arial"/>
+          <w:color w:val="1F1F1F"/>
+          <w:lang w:val="en-US"/>
+        </w:rPr>
+      </w:pPr>
+    </w:p>
+    <w:p>
+      <w:pPr>
+        <w:pStyle w:val="6"/>
+        <w:numPr>
+          <w:numId w:val="0"/>
+        </w:numPr>
+        <w:shd w:val="clear" w:color="auto" w:fill="FFFFFF"/>
+        <w:spacing w:before="0" w:beforeAutospacing="0" w:after="0" w:afterAutospacing="0" w:line="240" w:lineRule="auto"/>
+        <w:rPr>
+          <w:rFonts w:hint="default" w:ascii="Arial" w:hAnsi="Arial" w:cs="Arial"/>
+          <w:color w:val="1F1F1F"/>
+          <w:lang w:val="en-US"/>
+        </w:rPr>
+      </w:pPr>
+      <w:r>
+        <w:rPr>
+          <w:rFonts w:hint="default" w:ascii="Arial" w:hAnsi="Arial" w:cs="Arial"/>
+          <w:color w:val="1F1F1F"/>
+          <w:lang w:val="en-US"/>
+        </w:rPr>
+        <w:t xml:space="preserve">Clicking on the fraud event will open in a new page. The page URL must be unique for each events. The page will show all the details about the fraud events. This should shown in different section - </w:t>
+      </w:r>
+    </w:p>
+    <w:p>
+      <w:pPr>
+        <w:pStyle w:val="6"/>
+        <w:numPr>
+          <w:ilvl w:val="0"/>
+          <w:numId w:val="17"/>
         </w:numPr>
         <w:shd w:val="clear" w:color="auto" w:fill="FFFFFF"/>
         <w:spacing w:before="0" w:beforeAutospacing="0" w:after="0" w:afterAutospacing="0" w:line="240" w:lineRule="auto"/>
@@ -2037,15 +4070,15 @@
           <w:color w:val="1F1F1F"/>
           <w:lang w:val="en-US"/>
         </w:rPr>
-        <w:t>Scam type as title of the event</w:t>
-      </w:r>
-    </w:p>
-    <w:p>
-      <w:pPr>
-        <w:pStyle w:val="6"/>
-        <w:numPr>
-          <w:ilvl w:val="0"/>
-          <w:numId w:val="9"/>
+        <w:t>Fraud details (With all the information and proof image/files/documents)</w:t>
+      </w:r>
+    </w:p>
+    <w:p>
+      <w:pPr>
+        <w:pStyle w:val="6"/>
+        <w:numPr>
+          <w:ilvl w:val="0"/>
+          <w:numId w:val="17"/>
         </w:numPr>
         <w:shd w:val="clear" w:color="auto" w:fill="FFFFFF"/>
         <w:spacing w:before="0" w:beforeAutospacing="0" w:after="0" w:afterAutospacing="0" w:line="240" w:lineRule="auto"/>
@@ -2062,15 +4095,15 @@
           <w:color w:val="1F1F1F"/>
           <w:lang w:val="en-US"/>
         </w:rPr>
-        <w:t>Scam description (within 100 words)</w:t>
-      </w:r>
-    </w:p>
-    <w:p>
-      <w:pPr>
-        <w:pStyle w:val="6"/>
-        <w:numPr>
-          <w:ilvl w:val="0"/>
-          <w:numId w:val="9"/>
+        <w:t>Imposter details(profile link)</w:t>
+      </w:r>
+    </w:p>
+    <w:p>
+      <w:pPr>
+        <w:pStyle w:val="6"/>
+        <w:numPr>
+          <w:ilvl w:val="0"/>
+          <w:numId w:val="17"/>
         </w:numPr>
         <w:shd w:val="clear" w:color="auto" w:fill="FFFFFF"/>
         <w:spacing w:before="0" w:beforeAutospacing="0" w:after="0" w:afterAutospacing="0" w:line="240" w:lineRule="auto"/>
@@ -2087,1284 +4120,7 @@
           <w:color w:val="1F1F1F"/>
           <w:lang w:val="en-US"/>
         </w:rPr>
-        <w:t>Loss amount</w:t>
-      </w:r>
-    </w:p>
-    <w:p>
-      <w:pPr>
-        <w:pStyle w:val="6"/>
-        <w:numPr>
-          <w:ilvl w:val="0"/>
-          <w:numId w:val="9"/>
-        </w:numPr>
-        <w:shd w:val="clear" w:color="auto" w:fill="FFFFFF"/>
-        <w:spacing w:before="0" w:beforeAutospacing="0" w:after="0" w:afterAutospacing="0" w:line="240" w:lineRule="auto"/>
-        <w:ind w:firstLine="720" w:firstLineChars="0"/>
-        <w:rPr>
-          <w:rFonts w:hint="default" w:ascii="Arial" w:hAnsi="Arial" w:cs="Arial"/>
-          <w:color w:val="1F1F1F"/>
-          <w:lang w:val="en-US"/>
-        </w:rPr>
-      </w:pPr>
-      <w:r>
-        <w:rPr>
-          <w:rFonts w:hint="default" w:ascii="Arial" w:hAnsi="Arial" w:cs="Arial"/>
-          <w:color w:val="1F1F1F"/>
-          <w:lang w:val="en-US"/>
-        </w:rPr>
-        <w:t>Date and time of submission</w:t>
-      </w:r>
-    </w:p>
-    <w:p>
-      <w:pPr>
-        <w:pStyle w:val="6"/>
-        <w:numPr>
-          <w:ilvl w:val="0"/>
-          <w:numId w:val="9"/>
-        </w:numPr>
-        <w:shd w:val="clear" w:color="auto" w:fill="FFFFFF"/>
-        <w:spacing w:before="0" w:beforeAutospacing="0" w:after="0" w:afterAutospacing="0" w:line="240" w:lineRule="auto"/>
-        <w:ind w:firstLine="720" w:firstLineChars="0"/>
-        <w:rPr>
-          <w:rFonts w:hint="default" w:ascii="Arial" w:hAnsi="Arial" w:cs="Arial"/>
-          <w:color w:val="1F1F1F"/>
-          <w:lang w:val="en-US"/>
-        </w:rPr>
-      </w:pPr>
-      <w:r>
-        <w:rPr>
-          <w:rFonts w:hint="default" w:ascii="Arial" w:hAnsi="Arial" w:cs="Arial"/>
-          <w:color w:val="1F1F1F"/>
-          <w:lang w:val="en-US"/>
-        </w:rPr>
-        <w:t>Date and time of approval</w:t>
-      </w:r>
-    </w:p>
-    <w:p>
-      <w:pPr>
-        <w:pStyle w:val="6"/>
-        <w:numPr>
-          <w:ilvl w:val="0"/>
-          <w:numId w:val="9"/>
-        </w:numPr>
-        <w:shd w:val="clear" w:color="auto" w:fill="FFFFFF"/>
-        <w:spacing w:before="0" w:beforeAutospacing="0" w:after="0" w:afterAutospacing="0" w:line="240" w:lineRule="auto"/>
-        <w:ind w:firstLine="720" w:firstLineChars="0"/>
-        <w:rPr>
-          <w:rFonts w:hint="default" w:ascii="Arial" w:hAnsi="Arial" w:cs="Arial"/>
-          <w:color w:val="1F1F1F"/>
-          <w:lang w:val="en-US"/>
-        </w:rPr>
-      </w:pPr>
-      <w:r>
-        <w:rPr>
-          <w:rFonts w:hint="default" w:ascii="Arial" w:hAnsi="Arial" w:cs="Arial"/>
-          <w:color w:val="1F1F1F"/>
-          <w:lang w:val="en-US"/>
-        </w:rPr>
-        <w:t>Total live day (since time of approval)</w:t>
-      </w:r>
-    </w:p>
-    <w:p>
-      <w:pPr>
-        <w:pStyle w:val="6"/>
-        <w:numPr>
-          <w:ilvl w:val="0"/>
-          <w:numId w:val="9"/>
-        </w:numPr>
-        <w:shd w:val="clear" w:color="auto" w:fill="FFFFFF"/>
-        <w:spacing w:before="0" w:beforeAutospacing="0" w:after="0" w:afterAutospacing="0" w:line="240" w:lineRule="auto"/>
-        <w:ind w:firstLine="720" w:firstLineChars="0"/>
-        <w:rPr>
-          <w:rFonts w:hint="default" w:ascii="Arial" w:hAnsi="Arial" w:cs="Arial"/>
-          <w:color w:val="1F1F1F"/>
-          <w:lang w:val="en-US"/>
-        </w:rPr>
-      </w:pPr>
-      <w:r>
-        <w:rPr>
-          <w:rFonts w:hint="default" w:ascii="Arial" w:hAnsi="Arial" w:cs="Arial"/>
-          <w:color w:val="1F1F1F"/>
-          <w:lang w:val="en-US"/>
-        </w:rPr>
-        <w:t>Imposter name</w:t>
-      </w:r>
-    </w:p>
-    <w:p>
-      <w:pPr>
-        <w:pStyle w:val="6"/>
-        <w:numPr>
-          <w:ilvl w:val="0"/>
-          <w:numId w:val="9"/>
-        </w:numPr>
-        <w:shd w:val="clear" w:color="auto" w:fill="FFFFFF"/>
-        <w:spacing w:before="0" w:beforeAutospacing="0" w:after="0" w:afterAutospacing="0" w:line="240" w:lineRule="auto"/>
-        <w:ind w:firstLine="720" w:firstLineChars="0"/>
-        <w:rPr>
-          <w:rFonts w:hint="default" w:ascii="Arial" w:hAnsi="Arial" w:cs="Arial"/>
-          <w:color w:val="1F1F1F"/>
-          <w:lang w:val="en-US"/>
-        </w:rPr>
-      </w:pPr>
-      <w:r>
-        <w:rPr>
-          <w:rFonts w:hint="default" w:ascii="Arial" w:hAnsi="Arial" w:cs="Arial"/>
-          <w:color w:val="1F1F1F"/>
-          <w:lang w:val="en-US"/>
-        </w:rPr>
-        <w:t>Reporter name</w:t>
-      </w:r>
-    </w:p>
-    <w:p>
-      <w:pPr>
-        <w:pStyle w:val="6"/>
-        <w:numPr>
-          <w:ilvl w:val="0"/>
-          <w:numId w:val="9"/>
-        </w:numPr>
-        <w:shd w:val="clear" w:color="auto" w:fill="FFFFFF"/>
-        <w:spacing w:before="0" w:beforeAutospacing="0" w:after="0" w:afterAutospacing="0" w:line="240" w:lineRule="auto"/>
-        <w:ind w:firstLine="720" w:firstLineChars="0"/>
-        <w:rPr>
-          <w:rFonts w:hint="default" w:ascii="Arial" w:hAnsi="Arial" w:cs="Arial"/>
-          <w:color w:val="1F1F1F"/>
-          <w:lang w:val="en-US"/>
-        </w:rPr>
-      </w:pPr>
-      <w:r>
-        <w:rPr>
-          <w:rFonts w:hint="default" w:ascii="Arial" w:hAnsi="Arial" w:cs="Arial"/>
-          <w:color w:val="1F1F1F"/>
-          <w:lang w:val="en-US"/>
-        </w:rPr>
-        <w:t>Approved admin name (implemented later, since admin panel is not created yet)</w:t>
-      </w:r>
-    </w:p>
-    <w:p>
-      <w:pPr>
-        <w:pStyle w:val="6"/>
-        <w:numPr>
-          <w:ilvl w:val="0"/>
-          <w:numId w:val="9"/>
-        </w:numPr>
-        <w:shd w:val="clear" w:color="auto" w:fill="FFFFFF"/>
-        <w:spacing w:before="0" w:beforeAutospacing="0" w:after="0" w:afterAutospacing="0" w:line="240" w:lineRule="auto"/>
-        <w:ind w:firstLine="720" w:firstLineChars="0"/>
-        <w:rPr>
-          <w:rFonts w:hint="default" w:ascii="Arial" w:hAnsi="Arial" w:cs="Arial"/>
-          <w:color w:val="1F1F1F"/>
-          <w:lang w:val="en-US"/>
-        </w:rPr>
-      </w:pPr>
-      <w:r>
-        <w:rPr>
-          <w:rFonts w:hint="default" w:ascii="Arial" w:hAnsi="Arial" w:cs="Arial"/>
-          <w:color w:val="1F1F1F"/>
-          <w:lang w:val="en-US"/>
-        </w:rPr>
-        <w:t>Event status</w:t>
-      </w:r>
-    </w:p>
-    <w:p>
-      <w:pPr>
-        <w:pStyle w:val="6"/>
-        <w:numPr>
-          <w:ilvl w:val="0"/>
-          <w:numId w:val="9"/>
-        </w:numPr>
-        <w:shd w:val="clear" w:color="auto" w:fill="FFFFFF"/>
-        <w:spacing w:before="0" w:beforeAutospacing="0" w:after="0" w:afterAutospacing="0" w:line="240" w:lineRule="auto"/>
-        <w:ind w:firstLine="720" w:firstLineChars="0"/>
-        <w:rPr>
-          <w:rFonts w:hint="default" w:ascii="Arial" w:hAnsi="Arial" w:cs="Arial"/>
-          <w:color w:val="1F1F1F"/>
-          <w:lang w:val="en-US"/>
-        </w:rPr>
-      </w:pPr>
-      <w:r>
-        <w:rPr>
-          <w:rFonts w:hint="default" w:ascii="Arial" w:hAnsi="Arial" w:cs="Arial"/>
-          <w:color w:val="1F1F1F"/>
-          <w:lang w:val="en-US"/>
-        </w:rPr>
-        <w:t>Button for delete the event</w:t>
-      </w:r>
-    </w:p>
-    <w:p>
-      <w:pPr>
-        <w:pStyle w:val="6"/>
-        <w:numPr>
-          <w:numId w:val="0"/>
-        </w:numPr>
-        <w:shd w:val="clear" w:color="auto" w:fill="FFFFFF"/>
-        <w:spacing w:before="0" w:beforeAutospacing="0" w:after="0" w:afterAutospacing="0" w:line="240" w:lineRule="auto"/>
-        <w:rPr>
-          <w:rFonts w:hint="default" w:ascii="Arial" w:hAnsi="Arial" w:cs="Arial"/>
-          <w:color w:val="1F1F1F"/>
-          <w:lang w:val="en-US"/>
-        </w:rPr>
-      </w:pPr>
-    </w:p>
-    <w:p>
-      <w:pPr>
-        <w:pStyle w:val="6"/>
-        <w:numPr>
-          <w:numId w:val="0"/>
-        </w:numPr>
-        <w:shd w:val="clear" w:color="auto" w:fill="FFFFFF"/>
-        <w:spacing w:before="0" w:beforeAutospacing="0" w:after="0" w:afterAutospacing="0" w:line="240" w:lineRule="auto"/>
-        <w:rPr>
-          <w:rFonts w:hint="default" w:ascii="Arial" w:hAnsi="Arial" w:cs="Arial"/>
-          <w:color w:val="1F1F1F"/>
-          <w:lang w:val="en-US"/>
-        </w:rPr>
-      </w:pPr>
-      <w:r>
-        <w:rPr>
-          <w:rFonts w:hint="default" w:ascii="Arial" w:hAnsi="Arial" w:cs="Arial"/>
-          <w:color w:val="1F1F1F"/>
-          <w:lang w:val="en-US"/>
-        </w:rPr>
-        <w:t xml:space="preserve">After clicking the card, it will show all the details about the event. All the submitted information by the reporter and also some additional information like - </w:t>
-      </w:r>
-    </w:p>
-    <w:p>
-      <w:pPr>
-        <w:pStyle w:val="6"/>
-        <w:numPr>
-          <w:ilvl w:val="0"/>
-          <w:numId w:val="10"/>
-        </w:numPr>
-        <w:shd w:val="clear" w:color="auto" w:fill="FFFFFF"/>
-        <w:spacing w:before="0" w:beforeAutospacing="0" w:after="0" w:afterAutospacing="0" w:line="240" w:lineRule="auto"/>
-        <w:ind w:firstLine="720" w:firstLineChars="0"/>
-        <w:rPr>
-          <w:rFonts w:hint="default" w:ascii="Arial" w:hAnsi="Arial" w:cs="Arial"/>
-          <w:color w:val="1F1F1F"/>
-          <w:lang w:val="en-US"/>
-        </w:rPr>
-      </w:pPr>
-      <w:r>
-        <w:rPr>
-          <w:rFonts w:hint="default" w:ascii="Arial" w:hAnsi="Arial" w:cs="Arial"/>
-          <w:color w:val="1F1F1F"/>
-          <w:lang w:val="en-US"/>
-        </w:rPr>
-        <w:t>Date of submission</w:t>
-      </w:r>
-    </w:p>
-    <w:p>
-      <w:pPr>
-        <w:pStyle w:val="6"/>
-        <w:numPr>
-          <w:ilvl w:val="0"/>
-          <w:numId w:val="10"/>
-        </w:numPr>
-        <w:shd w:val="clear" w:color="auto" w:fill="FFFFFF"/>
-        <w:spacing w:before="0" w:beforeAutospacing="0" w:after="0" w:afterAutospacing="0" w:line="240" w:lineRule="auto"/>
-        <w:ind w:firstLine="720" w:firstLineChars="0"/>
-        <w:rPr>
-          <w:rFonts w:hint="default" w:ascii="Arial" w:hAnsi="Arial" w:cs="Arial"/>
-          <w:color w:val="1F1F1F"/>
-          <w:lang w:val="en-US"/>
-        </w:rPr>
-      </w:pPr>
-      <w:r>
-        <w:rPr>
-          <w:rFonts w:hint="default" w:ascii="Arial" w:hAnsi="Arial" w:cs="Arial"/>
-          <w:color w:val="1F1F1F"/>
-          <w:lang w:val="en-US"/>
-        </w:rPr>
-        <w:t>Other fraud events of the imposter (if exists)</w:t>
-      </w:r>
-    </w:p>
-    <w:p>
-      <w:pPr>
-        <w:pStyle w:val="6"/>
-        <w:numPr>
-          <w:ilvl w:val="0"/>
-          <w:numId w:val="10"/>
-        </w:numPr>
-        <w:shd w:val="clear" w:color="auto" w:fill="FFFFFF"/>
-        <w:spacing w:before="0" w:beforeAutospacing="0" w:after="0" w:afterAutospacing="0" w:line="240" w:lineRule="auto"/>
-        <w:ind w:firstLine="720" w:firstLineChars="0"/>
-        <w:rPr>
-          <w:rFonts w:hint="default" w:ascii="Arial" w:hAnsi="Arial" w:cs="Arial"/>
-          <w:color w:val="1F1F1F"/>
-          <w:lang w:val="en-US"/>
-        </w:rPr>
-      </w:pPr>
-      <w:r>
-        <w:rPr>
-          <w:rFonts w:hint="default" w:ascii="Arial" w:hAnsi="Arial" w:cs="Arial"/>
-          <w:color w:val="1F1F1F"/>
-          <w:lang w:val="en-US"/>
-        </w:rPr>
-        <w:t>Approval details (will be implemented later)</w:t>
-      </w:r>
-    </w:p>
-    <w:p>
-      <w:pPr>
-        <w:pStyle w:val="6"/>
-        <w:numPr>
-          <w:numId w:val="0"/>
-        </w:numPr>
-        <w:shd w:val="clear" w:color="auto" w:fill="FFFFFF"/>
-        <w:spacing w:before="0" w:beforeAutospacing="0" w:after="0" w:afterAutospacing="0" w:line="240" w:lineRule="auto"/>
-        <w:rPr>
-          <w:rFonts w:hint="default" w:ascii="Arial" w:hAnsi="Arial" w:cs="Arial"/>
-          <w:color w:val="1F1F1F"/>
-          <w:lang w:val="en-US"/>
-        </w:rPr>
-      </w:pPr>
-    </w:p>
-    <w:p>
-      <w:pPr>
-        <w:pStyle w:val="6"/>
-        <w:numPr>
-          <w:numId w:val="0"/>
-        </w:numPr>
-        <w:shd w:val="clear" w:color="auto" w:fill="FFFFFF"/>
-        <w:spacing w:before="0" w:beforeAutospacing="0" w:after="0" w:afterAutospacing="0" w:line="240" w:lineRule="auto"/>
-        <w:rPr>
-          <w:rFonts w:hint="default" w:ascii="Arial" w:hAnsi="Arial" w:cs="Arial"/>
-          <w:color w:val="1F1F1F"/>
-          <w:lang w:val="en-US"/>
-        </w:rPr>
-      </w:pPr>
-      <w:r>
-        <w:rPr>
-          <w:rFonts w:hint="default" w:ascii="Arial" w:hAnsi="Arial" w:cs="Arial"/>
-          <w:color w:val="1F1F1F"/>
-          <w:lang w:val="en-US"/>
-        </w:rPr>
-        <w:t>The information in the details should be shown in organized way. Like-</w:t>
-      </w:r>
-    </w:p>
-    <w:p>
-      <w:pPr>
-        <w:pStyle w:val="6"/>
-        <w:numPr>
-          <w:ilvl w:val="0"/>
-          <w:numId w:val="11"/>
-        </w:numPr>
-        <w:shd w:val="clear" w:color="auto" w:fill="FFFFFF"/>
-        <w:spacing w:before="0" w:beforeAutospacing="0" w:after="0" w:afterAutospacing="0" w:line="240" w:lineRule="auto"/>
-        <w:ind w:firstLine="720" w:firstLineChars="0"/>
-        <w:rPr>
-          <w:rFonts w:hint="default" w:ascii="Arial" w:hAnsi="Arial" w:cs="Arial"/>
-          <w:color w:val="1F1F1F"/>
-          <w:lang w:val="en-US"/>
-        </w:rPr>
-      </w:pPr>
-      <w:r>
-        <w:rPr>
-          <w:rFonts w:hint="default" w:ascii="Arial" w:hAnsi="Arial" w:cs="Arial"/>
-          <w:color w:val="1F1F1F"/>
-          <w:lang w:val="en-US"/>
-        </w:rPr>
-        <w:t>Imposter details (With other live fraud events in short card)</w:t>
-      </w:r>
-    </w:p>
-    <w:p>
-      <w:pPr>
-        <w:pStyle w:val="6"/>
-        <w:numPr>
-          <w:ilvl w:val="0"/>
-          <w:numId w:val="11"/>
-        </w:numPr>
-        <w:shd w:val="clear" w:color="auto" w:fill="FFFFFF"/>
-        <w:spacing w:before="0" w:beforeAutospacing="0" w:after="0" w:afterAutospacing="0" w:line="240" w:lineRule="auto"/>
-        <w:ind w:firstLine="720" w:firstLineChars="0"/>
-        <w:rPr>
-          <w:rFonts w:hint="default" w:ascii="Arial" w:hAnsi="Arial" w:cs="Arial"/>
-          <w:color w:val="1F1F1F"/>
-          <w:lang w:val="en-US"/>
-        </w:rPr>
-      </w:pPr>
-      <w:r>
-        <w:rPr>
-          <w:rFonts w:hint="default" w:ascii="Arial" w:hAnsi="Arial" w:cs="Arial"/>
-          <w:color w:val="1F1F1F"/>
-          <w:lang w:val="en-US"/>
-        </w:rPr>
-        <w:t>Scam details</w:t>
-      </w:r>
-    </w:p>
-    <w:p>
-      <w:pPr>
-        <w:pStyle w:val="6"/>
-        <w:numPr>
-          <w:ilvl w:val="0"/>
-          <w:numId w:val="11"/>
-        </w:numPr>
-        <w:shd w:val="clear" w:color="auto" w:fill="FFFFFF"/>
-        <w:spacing w:before="0" w:beforeAutospacing="0" w:after="0" w:afterAutospacing="0" w:line="240" w:lineRule="auto"/>
-        <w:ind w:firstLine="720" w:firstLineChars="0"/>
-        <w:rPr>
-          <w:rFonts w:hint="default" w:ascii="Arial" w:hAnsi="Arial" w:cs="Arial"/>
-          <w:color w:val="1F1F1F"/>
-          <w:lang w:val="en-US"/>
-        </w:rPr>
-      </w:pPr>
-      <w:r>
-        <w:rPr>
-          <w:rFonts w:hint="default" w:ascii="Arial" w:hAnsi="Arial" w:cs="Arial"/>
-          <w:color w:val="1F1F1F"/>
-          <w:lang w:val="en-US"/>
-        </w:rPr>
-        <w:t>Reporter details</w:t>
-      </w:r>
-    </w:p>
-    <w:p>
-      <w:pPr>
-        <w:pStyle w:val="6"/>
-        <w:numPr>
-          <w:ilvl w:val="0"/>
-          <w:numId w:val="11"/>
-        </w:numPr>
-        <w:shd w:val="clear" w:color="auto" w:fill="FFFFFF"/>
-        <w:spacing w:before="0" w:beforeAutospacing="0" w:after="0" w:afterAutospacing="0" w:line="240" w:lineRule="auto"/>
-        <w:ind w:firstLine="720" w:firstLineChars="0"/>
-        <w:rPr>
-          <w:rFonts w:hint="default" w:ascii="Arial" w:hAnsi="Arial" w:cs="Arial"/>
-          <w:color w:val="1F1F1F"/>
-          <w:lang w:val="en-US"/>
-        </w:rPr>
-      </w:pPr>
-      <w:r>
-        <w:rPr>
-          <w:rFonts w:hint="default" w:ascii="Arial" w:hAnsi="Arial" w:cs="Arial"/>
-          <w:color w:val="1F1F1F"/>
-          <w:lang w:val="en-US"/>
-        </w:rPr>
-        <w:t>Apporval details (Implemented later)</w:t>
-      </w:r>
-    </w:p>
-    <w:p>
-      <w:pPr>
-        <w:pStyle w:val="6"/>
-        <w:numPr>
-          <w:numId w:val="0"/>
-        </w:numPr>
-        <w:shd w:val="clear" w:color="auto" w:fill="FFFFFF"/>
-        <w:spacing w:before="0" w:beforeAutospacing="0" w:after="0" w:afterAutospacing="0" w:line="240" w:lineRule="auto"/>
-        <w:rPr>
-          <w:rFonts w:hint="default" w:ascii="Arial" w:hAnsi="Arial" w:cs="Arial"/>
-          <w:color w:val="1F1F1F"/>
-          <w:lang w:val="en-US"/>
-        </w:rPr>
-      </w:pPr>
-      <w:r>
-        <w:rPr>
-          <w:rFonts w:hint="default" w:ascii="Arial" w:hAnsi="Arial" w:cs="Arial"/>
-          <w:color w:val="1F1F1F"/>
-          <w:lang w:val="en-US"/>
-        </w:rPr>
-        <w:t xml:space="preserve">Add button for delete the event or edit request button to send edit request to the reporter. </w:t>
-      </w:r>
-    </w:p>
-    <w:p>
-      <w:pPr>
-        <w:pStyle w:val="6"/>
-        <w:numPr>
-          <w:numId w:val="0"/>
-        </w:numPr>
-        <w:shd w:val="clear" w:color="auto" w:fill="FFFFFF"/>
-        <w:spacing w:before="0" w:beforeAutospacing="0" w:after="0" w:afterAutospacing="0" w:line="240" w:lineRule="auto"/>
-        <w:rPr>
-          <w:rFonts w:hint="default" w:ascii="Arial" w:hAnsi="Arial" w:cs="Arial"/>
-          <w:color w:val="1F1F1F"/>
-          <w:lang w:val="en-US"/>
-        </w:rPr>
-      </w:pPr>
-    </w:p>
-    <w:p>
-      <w:pPr>
-        <w:pStyle w:val="6"/>
-        <w:numPr>
-          <w:numId w:val="0"/>
-        </w:numPr>
-        <w:shd w:val="clear" w:color="auto" w:fill="FFFFFF"/>
-        <w:spacing w:before="0" w:beforeAutospacing="0" w:after="0" w:afterAutospacing="0" w:line="240" w:lineRule="auto"/>
-        <w:rPr>
-          <w:rFonts w:hint="default" w:ascii="Arial" w:hAnsi="Arial" w:cs="Arial"/>
-          <w:color w:val="1F1F1F"/>
-          <w:lang w:val="en-US"/>
-        </w:rPr>
-      </w:pPr>
-    </w:p>
-    <w:p>
-      <w:pPr>
-        <w:pStyle w:val="6"/>
-        <w:numPr>
-          <w:numId w:val="0"/>
-        </w:numPr>
-        <w:shd w:val="clear" w:color="auto" w:fill="FFFFFF"/>
-        <w:spacing w:before="0" w:beforeAutospacing="0" w:after="0" w:afterAutospacing="0" w:line="240" w:lineRule="auto"/>
-        <w:rPr>
-          <w:rFonts w:hint="default" w:ascii="Arial" w:hAnsi="Arial" w:cs="Arial"/>
-          <w:color w:val="1F1F1F"/>
-          <w:lang w:val="en-US"/>
-        </w:rPr>
-      </w:pPr>
-      <w:r>
-        <w:rPr>
-          <w:rFonts w:hint="default" w:ascii="Arial" w:hAnsi="Arial" w:cs="Arial"/>
-          <w:color w:val="1F1F1F"/>
-          <w:lang w:val="en-US"/>
-        </w:rPr>
-        <w:t xml:space="preserve">For the pending fraud events - All the pending events should be shown in a list with some important information - </w:t>
-      </w:r>
-    </w:p>
-    <w:p>
-      <w:pPr>
-        <w:pStyle w:val="6"/>
-        <w:numPr>
-          <w:ilvl w:val="0"/>
-          <w:numId w:val="12"/>
-        </w:numPr>
-        <w:shd w:val="clear" w:color="auto" w:fill="FFFFFF"/>
-        <w:spacing w:before="0" w:beforeAutospacing="0" w:after="0" w:afterAutospacing="0" w:line="240" w:lineRule="auto"/>
-        <w:ind w:firstLine="720" w:firstLineChars="0"/>
-        <w:rPr>
-          <w:rFonts w:hint="default" w:ascii="Arial" w:hAnsi="Arial" w:cs="Arial"/>
-          <w:color w:val="1F1F1F"/>
-          <w:lang w:val="en-US"/>
-        </w:rPr>
-      </w:pPr>
-      <w:r>
-        <w:rPr>
-          <w:rFonts w:hint="default" w:ascii="Arial" w:hAnsi="Arial" w:cs="Arial"/>
-          <w:color w:val="1F1F1F"/>
-          <w:lang w:val="en-US"/>
-        </w:rPr>
-        <w:t>Scam type as title of the event</w:t>
-      </w:r>
-    </w:p>
-    <w:p>
-      <w:pPr>
-        <w:pStyle w:val="6"/>
-        <w:numPr>
-          <w:ilvl w:val="0"/>
-          <w:numId w:val="12"/>
-        </w:numPr>
-        <w:shd w:val="clear" w:color="auto" w:fill="FFFFFF"/>
-        <w:spacing w:before="0" w:beforeAutospacing="0" w:after="0" w:afterAutospacing="0" w:line="240" w:lineRule="auto"/>
-        <w:ind w:firstLine="720" w:firstLineChars="0"/>
-        <w:rPr>
-          <w:rFonts w:hint="default" w:ascii="Arial" w:hAnsi="Arial" w:cs="Arial"/>
-          <w:color w:val="1F1F1F"/>
-          <w:lang w:val="en-US"/>
-        </w:rPr>
-      </w:pPr>
-      <w:r>
-        <w:rPr>
-          <w:rFonts w:hint="default" w:ascii="Arial" w:hAnsi="Arial" w:cs="Arial"/>
-          <w:color w:val="1F1F1F"/>
-          <w:lang w:val="en-US"/>
-        </w:rPr>
-        <w:t>Scam description (within 100 words)</w:t>
-      </w:r>
-    </w:p>
-    <w:p>
-      <w:pPr>
-        <w:pStyle w:val="6"/>
-        <w:numPr>
-          <w:ilvl w:val="0"/>
-          <w:numId w:val="12"/>
-        </w:numPr>
-        <w:shd w:val="clear" w:color="auto" w:fill="FFFFFF"/>
-        <w:spacing w:before="0" w:beforeAutospacing="0" w:after="0" w:afterAutospacing="0" w:line="240" w:lineRule="auto"/>
-        <w:ind w:firstLine="720" w:firstLineChars="0"/>
-        <w:rPr>
-          <w:rFonts w:hint="default" w:ascii="Arial" w:hAnsi="Arial" w:cs="Arial"/>
-          <w:color w:val="1F1F1F"/>
-          <w:lang w:val="en-US"/>
-        </w:rPr>
-      </w:pPr>
-      <w:r>
-        <w:rPr>
-          <w:rFonts w:hint="default" w:ascii="Arial" w:hAnsi="Arial" w:cs="Arial"/>
-          <w:color w:val="1F1F1F"/>
-          <w:lang w:val="en-US"/>
-        </w:rPr>
-        <w:t>Loss amount</w:t>
-      </w:r>
-    </w:p>
-    <w:p>
-      <w:pPr>
-        <w:pStyle w:val="6"/>
-        <w:numPr>
-          <w:ilvl w:val="0"/>
-          <w:numId w:val="12"/>
-        </w:numPr>
-        <w:shd w:val="clear" w:color="auto" w:fill="FFFFFF"/>
-        <w:spacing w:before="0" w:beforeAutospacing="0" w:after="0" w:afterAutospacing="0" w:line="240" w:lineRule="auto"/>
-        <w:ind w:firstLine="720" w:firstLineChars="0"/>
-        <w:rPr>
-          <w:rFonts w:hint="default" w:ascii="Arial" w:hAnsi="Arial" w:cs="Arial"/>
-          <w:color w:val="1F1F1F"/>
-          <w:lang w:val="en-US"/>
-        </w:rPr>
-      </w:pPr>
-      <w:r>
-        <w:rPr>
-          <w:rFonts w:hint="default" w:ascii="Arial" w:hAnsi="Arial" w:cs="Arial"/>
-          <w:color w:val="1F1F1F"/>
-          <w:lang w:val="en-US"/>
-        </w:rPr>
-        <w:t>Date and time of submission</w:t>
-      </w:r>
-    </w:p>
-    <w:p>
-      <w:pPr>
-        <w:pStyle w:val="6"/>
-        <w:numPr>
-          <w:ilvl w:val="0"/>
-          <w:numId w:val="12"/>
-        </w:numPr>
-        <w:shd w:val="clear" w:color="auto" w:fill="FFFFFF"/>
-        <w:spacing w:before="0" w:beforeAutospacing="0" w:after="0" w:afterAutospacing="0" w:line="240" w:lineRule="auto"/>
-        <w:ind w:firstLine="720" w:firstLineChars="0"/>
-        <w:rPr>
-          <w:rFonts w:hint="default" w:ascii="Arial" w:hAnsi="Arial" w:cs="Arial"/>
-          <w:color w:val="1F1F1F"/>
-          <w:lang w:val="en-US"/>
-        </w:rPr>
-      </w:pPr>
-      <w:r>
-        <w:rPr>
-          <w:rFonts w:hint="default" w:ascii="Arial" w:hAnsi="Arial" w:cs="Arial"/>
-          <w:color w:val="1F1F1F"/>
-          <w:lang w:val="en-US"/>
-        </w:rPr>
-        <w:t>Imposter name</w:t>
-      </w:r>
-    </w:p>
-    <w:p>
-      <w:pPr>
-        <w:pStyle w:val="6"/>
-        <w:numPr>
-          <w:ilvl w:val="0"/>
-          <w:numId w:val="12"/>
-        </w:numPr>
-        <w:shd w:val="clear" w:color="auto" w:fill="FFFFFF"/>
-        <w:spacing w:before="0" w:beforeAutospacing="0" w:after="0" w:afterAutospacing="0" w:line="240" w:lineRule="auto"/>
-        <w:ind w:firstLine="720" w:firstLineChars="0"/>
-        <w:rPr>
-          <w:rFonts w:hint="default" w:ascii="Arial" w:hAnsi="Arial" w:cs="Arial"/>
-          <w:color w:val="1F1F1F"/>
-          <w:lang w:val="en-US"/>
-        </w:rPr>
-      </w:pPr>
-      <w:r>
-        <w:rPr>
-          <w:rFonts w:hint="default" w:ascii="Arial" w:hAnsi="Arial" w:cs="Arial"/>
-          <w:color w:val="1F1F1F"/>
-          <w:lang w:val="en-US"/>
-        </w:rPr>
-        <w:t>Reporter name</w:t>
-      </w:r>
-    </w:p>
-    <w:p>
-      <w:pPr>
-        <w:pStyle w:val="6"/>
-        <w:numPr>
-          <w:ilvl w:val="0"/>
-          <w:numId w:val="12"/>
-        </w:numPr>
-        <w:shd w:val="clear" w:color="auto" w:fill="FFFFFF"/>
-        <w:spacing w:before="0" w:beforeAutospacing="0" w:after="0" w:afterAutospacing="0" w:line="240" w:lineRule="auto"/>
-        <w:ind w:firstLine="720" w:firstLineChars="0"/>
-        <w:rPr>
-          <w:rFonts w:hint="default" w:ascii="Arial" w:hAnsi="Arial" w:cs="Arial"/>
-          <w:color w:val="1F1F1F"/>
-          <w:lang w:val="en-US"/>
-        </w:rPr>
-      </w:pPr>
-      <w:r>
-        <w:rPr>
-          <w:rFonts w:hint="default" w:ascii="Arial" w:hAnsi="Arial" w:cs="Arial"/>
-          <w:color w:val="1F1F1F"/>
-          <w:lang w:val="en-US"/>
-        </w:rPr>
-        <w:t>Event status</w:t>
-      </w:r>
-    </w:p>
-    <w:p>
-      <w:pPr>
-        <w:pStyle w:val="6"/>
-        <w:numPr>
-          <w:ilvl w:val="0"/>
-          <w:numId w:val="12"/>
-        </w:numPr>
-        <w:shd w:val="clear" w:color="auto" w:fill="FFFFFF"/>
-        <w:spacing w:before="0" w:beforeAutospacing="0" w:after="0" w:afterAutospacing="0" w:line="240" w:lineRule="auto"/>
-        <w:ind w:firstLine="720" w:firstLineChars="0"/>
-        <w:rPr>
-          <w:rFonts w:hint="default" w:ascii="Arial" w:hAnsi="Arial" w:cs="Arial"/>
-          <w:color w:val="1F1F1F"/>
-          <w:lang w:val="en-US"/>
-        </w:rPr>
-      </w:pPr>
-      <w:r>
-        <w:rPr>
-          <w:rFonts w:hint="default" w:ascii="Arial" w:hAnsi="Arial" w:cs="Arial"/>
-          <w:color w:val="1F1F1F"/>
-          <w:lang w:val="en-US"/>
-        </w:rPr>
-        <w:t>Button for approve the event</w:t>
-      </w:r>
-    </w:p>
-    <w:p>
-      <w:pPr>
-        <w:pStyle w:val="6"/>
-        <w:numPr>
-          <w:numId w:val="0"/>
-        </w:numPr>
-        <w:shd w:val="clear" w:color="auto" w:fill="FFFFFF"/>
-        <w:spacing w:before="0" w:beforeAutospacing="0" w:after="0" w:afterAutospacing="0" w:line="240" w:lineRule="auto"/>
-        <w:rPr>
-          <w:rFonts w:hint="default" w:ascii="Arial" w:hAnsi="Arial" w:cs="Arial"/>
-          <w:color w:val="1F1F1F"/>
-          <w:lang w:val="en-US"/>
-        </w:rPr>
-      </w:pPr>
-      <w:r>
-        <w:rPr>
-          <w:rFonts w:hint="default" w:ascii="Arial" w:hAnsi="Arial" w:cs="Arial"/>
-          <w:color w:val="1F1F1F"/>
-          <w:lang w:val="en-US"/>
-        </w:rPr>
-        <w:t xml:space="preserve">After clicking the card, it will show all the details about the event.The information should be shown in a organized way - </w:t>
-      </w:r>
-    </w:p>
-    <w:p>
-      <w:pPr>
-        <w:pStyle w:val="6"/>
-        <w:numPr>
-          <w:ilvl w:val="0"/>
-          <w:numId w:val="13"/>
-        </w:numPr>
-        <w:shd w:val="clear" w:color="auto" w:fill="FFFFFF"/>
-        <w:spacing w:before="0" w:beforeAutospacing="0" w:after="0" w:afterAutospacing="0" w:line="240" w:lineRule="auto"/>
-        <w:ind w:firstLine="720" w:firstLineChars="0"/>
-        <w:rPr>
-          <w:rFonts w:hint="default" w:ascii="Arial" w:hAnsi="Arial" w:cs="Arial"/>
-          <w:color w:val="1F1F1F"/>
-          <w:lang w:val="en-US"/>
-        </w:rPr>
-      </w:pPr>
-      <w:r>
-        <w:rPr>
-          <w:rFonts w:hint="default" w:ascii="Arial" w:hAnsi="Arial" w:cs="Arial"/>
-          <w:color w:val="1F1F1F"/>
-          <w:lang w:val="en-US"/>
-        </w:rPr>
-        <w:t>Imposter details (With other live fraud events in short card)</w:t>
-      </w:r>
-    </w:p>
-    <w:p>
-      <w:pPr>
-        <w:pStyle w:val="6"/>
-        <w:numPr>
-          <w:ilvl w:val="0"/>
-          <w:numId w:val="13"/>
-        </w:numPr>
-        <w:shd w:val="clear" w:color="auto" w:fill="FFFFFF"/>
-        <w:spacing w:before="0" w:beforeAutospacing="0" w:after="0" w:afterAutospacing="0" w:line="240" w:lineRule="auto"/>
-        <w:ind w:firstLine="720" w:firstLineChars="0"/>
-        <w:rPr>
-          <w:rFonts w:hint="default" w:ascii="Arial" w:hAnsi="Arial" w:cs="Arial"/>
-          <w:color w:val="1F1F1F"/>
-          <w:lang w:val="en-US"/>
-        </w:rPr>
-      </w:pPr>
-      <w:r>
-        <w:rPr>
-          <w:rFonts w:hint="default" w:ascii="Arial" w:hAnsi="Arial" w:cs="Arial"/>
-          <w:color w:val="1F1F1F"/>
-          <w:lang w:val="en-US"/>
-        </w:rPr>
-        <w:t>Scam details</w:t>
-      </w:r>
-    </w:p>
-    <w:p>
-      <w:pPr>
-        <w:pStyle w:val="6"/>
-        <w:numPr>
-          <w:ilvl w:val="0"/>
-          <w:numId w:val="13"/>
-        </w:numPr>
-        <w:shd w:val="clear" w:color="auto" w:fill="FFFFFF"/>
-        <w:spacing w:before="0" w:beforeAutospacing="0" w:after="0" w:afterAutospacing="0" w:line="240" w:lineRule="auto"/>
-        <w:ind w:firstLine="720" w:firstLineChars="0"/>
-        <w:rPr>
-          <w:rFonts w:hint="default" w:ascii="Arial" w:hAnsi="Arial" w:cs="Arial"/>
-          <w:color w:val="1F1F1F"/>
-          <w:lang w:val="en-US"/>
-        </w:rPr>
-      </w:pPr>
-      <w:r>
-        <w:rPr>
-          <w:rFonts w:hint="default" w:ascii="Arial" w:hAnsi="Arial" w:cs="Arial"/>
-          <w:color w:val="1F1F1F"/>
-          <w:lang w:val="en-US"/>
-        </w:rPr>
-        <w:t>Reporter details (With submission date and time)</w:t>
-      </w:r>
-    </w:p>
-    <w:p>
-      <w:pPr>
-        <w:pStyle w:val="6"/>
-        <w:numPr>
-          <w:numId w:val="0"/>
-        </w:numPr>
-        <w:shd w:val="clear" w:color="auto" w:fill="FFFFFF"/>
-        <w:spacing w:before="0" w:beforeAutospacing="0" w:after="0" w:afterAutospacing="0" w:line="240" w:lineRule="auto"/>
-        <w:rPr>
-          <w:rFonts w:hint="default" w:ascii="Arial" w:hAnsi="Arial" w:cs="Arial"/>
-          <w:color w:val="1F1F1F"/>
-          <w:lang w:val="en-US"/>
-        </w:rPr>
-      </w:pPr>
-      <w:r>
-        <w:rPr>
-          <w:rFonts w:hint="default" w:ascii="Arial" w:hAnsi="Arial" w:cs="Arial"/>
-          <w:color w:val="1F1F1F"/>
-          <w:lang w:val="en-US"/>
-        </w:rPr>
-        <w:t>Button for apporval, edit request, and reject the event.</w:t>
-      </w:r>
-    </w:p>
-    <w:p>
-      <w:pPr>
-        <w:pStyle w:val="6"/>
-        <w:numPr>
-          <w:numId w:val="0"/>
-        </w:numPr>
-        <w:shd w:val="clear" w:color="auto" w:fill="FFFFFF"/>
-        <w:spacing w:before="0" w:beforeAutospacing="0" w:after="0" w:afterAutospacing="0" w:line="240" w:lineRule="auto"/>
-        <w:rPr>
-          <w:rFonts w:hint="default" w:ascii="Arial" w:hAnsi="Arial" w:cs="Arial"/>
-          <w:color w:val="1F1F1F"/>
-          <w:lang w:val="en-US"/>
-        </w:rPr>
-      </w:pPr>
-    </w:p>
-    <w:p>
-      <w:pPr>
-        <w:pStyle w:val="6"/>
-        <w:numPr>
-          <w:numId w:val="0"/>
-        </w:numPr>
-        <w:shd w:val="clear" w:color="auto" w:fill="FFFFFF"/>
-        <w:spacing w:before="0" w:beforeAutospacing="0" w:after="0" w:afterAutospacing="0" w:line="240" w:lineRule="auto"/>
-        <w:rPr>
-          <w:rFonts w:hint="default" w:ascii="Arial" w:hAnsi="Arial" w:cs="Arial"/>
-          <w:color w:val="1F1F1F"/>
-          <w:lang w:val="en-US"/>
-        </w:rPr>
-      </w:pPr>
-      <w:r>
-        <w:rPr>
-          <w:rFonts w:hint="default" w:ascii="Arial" w:hAnsi="Arial" w:cs="Arial"/>
-          <w:color w:val="1F1F1F"/>
-          <w:lang w:val="en-US"/>
-        </w:rPr>
-        <w:t xml:space="preserve">In deleted fraud events - All the deleted events from live fraud events or pending fraud events will be shown here. First all the events shown in a list with the following information - </w:t>
-      </w:r>
-    </w:p>
-    <w:p>
-      <w:pPr>
-        <w:pStyle w:val="6"/>
-        <w:numPr>
-          <w:numId w:val="0"/>
-        </w:numPr>
-        <w:shd w:val="clear" w:color="auto" w:fill="FFFFFF"/>
-        <w:spacing w:before="0" w:beforeAutospacing="0" w:after="0" w:afterAutospacing="0" w:line="240" w:lineRule="auto"/>
-        <w:rPr>
-          <w:rFonts w:hint="default" w:ascii="Arial" w:hAnsi="Arial" w:cs="Arial"/>
-          <w:color w:val="1F1F1F"/>
-          <w:lang w:val="en-US"/>
-        </w:rPr>
-      </w:pPr>
-    </w:p>
-    <w:p>
-      <w:pPr>
-        <w:pStyle w:val="6"/>
-        <w:numPr>
-          <w:ilvl w:val="0"/>
-          <w:numId w:val="14"/>
-        </w:numPr>
-        <w:shd w:val="clear" w:color="auto" w:fill="FFFFFF"/>
-        <w:spacing w:before="0" w:beforeAutospacing="0" w:after="0" w:afterAutospacing="0" w:line="240" w:lineRule="auto"/>
-        <w:ind w:firstLine="720" w:firstLineChars="0"/>
-        <w:rPr>
-          <w:rFonts w:hint="default" w:ascii="Arial" w:hAnsi="Arial" w:cs="Arial"/>
-          <w:color w:val="1F1F1F"/>
-          <w:lang w:val="en-US"/>
-        </w:rPr>
-      </w:pPr>
-      <w:r>
-        <w:rPr>
-          <w:rFonts w:hint="default" w:ascii="Arial" w:hAnsi="Arial" w:cs="Arial"/>
-          <w:color w:val="1F1F1F"/>
-          <w:lang w:val="en-US"/>
-        </w:rPr>
-        <w:t>Scam type as title of the event</w:t>
-      </w:r>
-    </w:p>
-    <w:p>
-      <w:pPr>
-        <w:pStyle w:val="6"/>
-        <w:numPr>
-          <w:ilvl w:val="0"/>
-          <w:numId w:val="14"/>
-        </w:numPr>
-        <w:shd w:val="clear" w:color="auto" w:fill="FFFFFF"/>
-        <w:spacing w:before="0" w:beforeAutospacing="0" w:after="0" w:afterAutospacing="0" w:line="240" w:lineRule="auto"/>
-        <w:ind w:firstLine="720" w:firstLineChars="0"/>
-        <w:rPr>
-          <w:rFonts w:hint="default" w:ascii="Arial" w:hAnsi="Arial" w:cs="Arial"/>
-          <w:color w:val="1F1F1F"/>
-          <w:lang w:val="en-US"/>
-        </w:rPr>
-      </w:pPr>
-      <w:r>
-        <w:rPr>
-          <w:rFonts w:hint="default" w:ascii="Arial" w:hAnsi="Arial" w:cs="Arial"/>
-          <w:color w:val="1F1F1F"/>
-          <w:lang w:val="en-US"/>
-        </w:rPr>
-        <w:t>Scam description (within 100 words)</w:t>
-      </w:r>
-    </w:p>
-    <w:p>
-      <w:pPr>
-        <w:pStyle w:val="6"/>
-        <w:numPr>
-          <w:ilvl w:val="0"/>
-          <w:numId w:val="14"/>
-        </w:numPr>
-        <w:shd w:val="clear" w:color="auto" w:fill="FFFFFF"/>
-        <w:spacing w:before="0" w:beforeAutospacing="0" w:after="0" w:afterAutospacing="0" w:line="240" w:lineRule="auto"/>
-        <w:ind w:firstLine="720" w:firstLineChars="0"/>
-        <w:rPr>
-          <w:rFonts w:hint="default" w:ascii="Arial" w:hAnsi="Arial" w:cs="Arial"/>
-          <w:color w:val="1F1F1F"/>
-          <w:lang w:val="en-US"/>
-        </w:rPr>
-      </w:pPr>
-      <w:r>
-        <w:rPr>
-          <w:rFonts w:hint="default" w:ascii="Arial" w:hAnsi="Arial" w:cs="Arial"/>
-          <w:color w:val="1F1F1F"/>
-          <w:lang w:val="en-US"/>
-        </w:rPr>
-        <w:t>Loss amount</w:t>
-      </w:r>
-    </w:p>
-    <w:p>
-      <w:pPr>
-        <w:pStyle w:val="6"/>
-        <w:numPr>
-          <w:ilvl w:val="0"/>
-          <w:numId w:val="14"/>
-        </w:numPr>
-        <w:shd w:val="clear" w:color="auto" w:fill="FFFFFF"/>
-        <w:spacing w:before="0" w:beforeAutospacing="0" w:after="0" w:afterAutospacing="0" w:line="240" w:lineRule="auto"/>
-        <w:ind w:firstLine="720" w:firstLineChars="0"/>
-        <w:rPr>
-          <w:rFonts w:hint="default" w:ascii="Arial" w:hAnsi="Arial" w:cs="Arial"/>
-          <w:color w:val="1F1F1F"/>
-          <w:lang w:val="en-US"/>
-        </w:rPr>
-      </w:pPr>
-      <w:r>
-        <w:rPr>
-          <w:rFonts w:hint="default" w:ascii="Arial" w:hAnsi="Arial" w:cs="Arial"/>
-          <w:color w:val="1F1F1F"/>
-          <w:lang w:val="en-US"/>
-        </w:rPr>
-        <w:t>Date and time of submission</w:t>
-      </w:r>
-    </w:p>
-    <w:p>
-      <w:pPr>
-        <w:pStyle w:val="6"/>
-        <w:numPr>
-          <w:ilvl w:val="0"/>
-          <w:numId w:val="14"/>
-        </w:numPr>
-        <w:shd w:val="clear" w:color="auto" w:fill="FFFFFF"/>
-        <w:spacing w:before="0" w:beforeAutospacing="0" w:after="0" w:afterAutospacing="0" w:line="240" w:lineRule="auto"/>
-        <w:ind w:firstLine="720" w:firstLineChars="0"/>
-        <w:rPr>
-          <w:rFonts w:hint="default" w:ascii="Arial" w:hAnsi="Arial" w:cs="Arial"/>
-          <w:color w:val="1F1F1F"/>
-          <w:lang w:val="en-US"/>
-        </w:rPr>
-      </w:pPr>
-      <w:r>
-        <w:rPr>
-          <w:rFonts w:hint="default" w:ascii="Arial" w:hAnsi="Arial" w:cs="Arial"/>
-          <w:color w:val="1F1F1F"/>
-          <w:lang w:val="en-US"/>
-        </w:rPr>
-        <w:t>Date and time of rejection</w:t>
-      </w:r>
-    </w:p>
-    <w:p>
-      <w:pPr>
-        <w:pStyle w:val="6"/>
-        <w:numPr>
-          <w:ilvl w:val="0"/>
-          <w:numId w:val="14"/>
-        </w:numPr>
-        <w:shd w:val="clear" w:color="auto" w:fill="FFFFFF"/>
-        <w:spacing w:before="0" w:beforeAutospacing="0" w:after="0" w:afterAutospacing="0" w:line="240" w:lineRule="auto"/>
-        <w:ind w:firstLine="720" w:firstLineChars="0"/>
-        <w:rPr>
-          <w:rFonts w:hint="default" w:ascii="Arial" w:hAnsi="Arial" w:cs="Arial"/>
-          <w:color w:val="1F1F1F"/>
-          <w:lang w:val="en-US"/>
-        </w:rPr>
-      </w:pPr>
-      <w:r>
-        <w:rPr>
-          <w:rFonts w:hint="default" w:ascii="Arial" w:hAnsi="Arial" w:cs="Arial"/>
-          <w:color w:val="1F1F1F"/>
-          <w:lang w:val="en-US"/>
-        </w:rPr>
-        <w:t>Total rejected day (since time of rejection)</w:t>
-      </w:r>
-    </w:p>
-    <w:p>
-      <w:pPr>
-        <w:pStyle w:val="6"/>
-        <w:numPr>
-          <w:ilvl w:val="0"/>
-          <w:numId w:val="14"/>
-        </w:numPr>
-        <w:shd w:val="clear" w:color="auto" w:fill="FFFFFF"/>
-        <w:spacing w:before="0" w:beforeAutospacing="0" w:after="0" w:afterAutospacing="0" w:line="240" w:lineRule="auto"/>
-        <w:ind w:firstLine="720" w:firstLineChars="0"/>
-        <w:rPr>
-          <w:rFonts w:hint="default" w:ascii="Arial" w:hAnsi="Arial" w:cs="Arial"/>
-          <w:color w:val="1F1F1F"/>
-          <w:lang w:val="en-US"/>
-        </w:rPr>
-      </w:pPr>
-      <w:r>
-        <w:rPr>
-          <w:rFonts w:hint="default" w:ascii="Arial" w:hAnsi="Arial" w:cs="Arial"/>
-          <w:color w:val="1F1F1F"/>
-          <w:lang w:val="en-US"/>
-        </w:rPr>
-        <w:t>Imposter name</w:t>
-      </w:r>
-    </w:p>
-    <w:p>
-      <w:pPr>
-        <w:pStyle w:val="6"/>
-        <w:numPr>
-          <w:ilvl w:val="0"/>
-          <w:numId w:val="14"/>
-        </w:numPr>
-        <w:shd w:val="clear" w:color="auto" w:fill="FFFFFF"/>
-        <w:spacing w:before="0" w:beforeAutospacing="0" w:after="0" w:afterAutospacing="0" w:line="240" w:lineRule="auto"/>
-        <w:ind w:firstLine="720" w:firstLineChars="0"/>
-        <w:rPr>
-          <w:rFonts w:hint="default" w:ascii="Arial" w:hAnsi="Arial" w:cs="Arial"/>
-          <w:color w:val="1F1F1F"/>
-          <w:lang w:val="en-US"/>
-        </w:rPr>
-      </w:pPr>
-      <w:r>
-        <w:rPr>
-          <w:rFonts w:hint="default" w:ascii="Arial" w:hAnsi="Arial" w:cs="Arial"/>
-          <w:color w:val="1F1F1F"/>
-          <w:lang w:val="en-US"/>
-        </w:rPr>
-        <w:t>Reporter name</w:t>
-      </w:r>
-    </w:p>
-    <w:p>
-      <w:pPr>
-        <w:pStyle w:val="6"/>
-        <w:numPr>
-          <w:ilvl w:val="0"/>
-          <w:numId w:val="14"/>
-        </w:numPr>
-        <w:shd w:val="clear" w:color="auto" w:fill="FFFFFF"/>
-        <w:spacing w:before="0" w:beforeAutospacing="0" w:after="0" w:afterAutospacing="0" w:line="240" w:lineRule="auto"/>
-        <w:ind w:firstLine="720" w:firstLineChars="0"/>
-        <w:rPr>
-          <w:rFonts w:hint="default" w:ascii="Arial" w:hAnsi="Arial" w:cs="Arial"/>
-          <w:color w:val="1F1F1F"/>
-          <w:lang w:val="en-US"/>
-        </w:rPr>
-      </w:pPr>
-      <w:r>
-        <w:rPr>
-          <w:rFonts w:hint="default" w:ascii="Arial" w:hAnsi="Arial" w:cs="Arial"/>
-          <w:color w:val="1F1F1F"/>
-          <w:lang w:val="en-US"/>
-        </w:rPr>
-        <w:t>Rejected admin name (implemented later, since admin panel is not created yet)</w:t>
-      </w:r>
-    </w:p>
-    <w:p>
-      <w:pPr>
-        <w:pStyle w:val="6"/>
-        <w:numPr>
-          <w:ilvl w:val="0"/>
-          <w:numId w:val="14"/>
-        </w:numPr>
-        <w:shd w:val="clear" w:color="auto" w:fill="FFFFFF"/>
-        <w:spacing w:before="0" w:beforeAutospacing="0" w:after="0" w:afterAutospacing="0" w:line="240" w:lineRule="auto"/>
-        <w:ind w:firstLine="720" w:firstLineChars="0"/>
-        <w:rPr>
-          <w:rFonts w:hint="default" w:ascii="Arial" w:hAnsi="Arial" w:cs="Arial"/>
-          <w:color w:val="1F1F1F"/>
-          <w:lang w:val="en-US"/>
-        </w:rPr>
-      </w:pPr>
-      <w:r>
-        <w:rPr>
-          <w:rFonts w:hint="default" w:ascii="Arial" w:hAnsi="Arial" w:cs="Arial"/>
-          <w:color w:val="1F1F1F"/>
-          <w:lang w:val="en-US"/>
-        </w:rPr>
-        <w:t>Rejected reason (submit by admin)</w:t>
-      </w:r>
-    </w:p>
-    <w:p>
-      <w:pPr>
-        <w:pStyle w:val="6"/>
-        <w:numPr>
-          <w:ilvl w:val="0"/>
-          <w:numId w:val="14"/>
-        </w:numPr>
-        <w:shd w:val="clear" w:color="auto" w:fill="FFFFFF"/>
-        <w:spacing w:before="0" w:beforeAutospacing="0" w:after="0" w:afterAutospacing="0" w:line="240" w:lineRule="auto"/>
-        <w:ind w:firstLine="720" w:firstLineChars="0"/>
-        <w:rPr>
-          <w:rFonts w:hint="default" w:ascii="Arial" w:hAnsi="Arial" w:cs="Arial"/>
-          <w:color w:val="1F1F1F"/>
-          <w:lang w:val="en-US"/>
-        </w:rPr>
-      </w:pPr>
-      <w:r>
-        <w:rPr>
-          <w:rFonts w:hint="default" w:ascii="Arial" w:hAnsi="Arial" w:cs="Arial"/>
-          <w:color w:val="1F1F1F"/>
-          <w:lang w:val="en-US"/>
-        </w:rPr>
-        <w:t>Event status (From where it is rejected)</w:t>
-      </w:r>
-    </w:p>
-    <w:p>
-      <w:pPr>
-        <w:pStyle w:val="6"/>
-        <w:numPr>
-          <w:ilvl w:val="0"/>
-          <w:numId w:val="14"/>
-        </w:numPr>
-        <w:shd w:val="clear" w:color="auto" w:fill="FFFFFF"/>
-        <w:spacing w:before="0" w:beforeAutospacing="0" w:after="0" w:afterAutospacing="0" w:line="240" w:lineRule="auto"/>
-        <w:ind w:firstLine="720" w:firstLineChars="0"/>
-        <w:rPr>
-          <w:rFonts w:hint="default" w:ascii="Arial" w:hAnsi="Arial" w:cs="Arial"/>
-          <w:color w:val="1F1F1F"/>
-          <w:lang w:val="en-US"/>
-        </w:rPr>
-      </w:pPr>
-      <w:r>
-        <w:rPr>
-          <w:rFonts w:hint="default" w:ascii="Arial" w:hAnsi="Arial" w:cs="Arial"/>
-          <w:color w:val="1F1F1F"/>
-          <w:lang w:val="en-US"/>
-        </w:rPr>
-        <w:t>Button for approve the event</w:t>
-      </w:r>
-    </w:p>
-    <w:p>
-      <w:pPr>
-        <w:pStyle w:val="6"/>
-        <w:numPr>
-          <w:numId w:val="0"/>
-        </w:numPr>
-        <w:shd w:val="clear" w:color="auto" w:fill="FFFFFF"/>
-        <w:spacing w:before="0" w:beforeAutospacing="0" w:after="0" w:afterAutospacing="0" w:line="240" w:lineRule="auto"/>
-        <w:rPr>
-          <w:rFonts w:hint="default" w:ascii="Arial" w:hAnsi="Arial" w:cs="Arial"/>
-          <w:color w:val="1F1F1F"/>
-          <w:lang w:val="en-US"/>
-        </w:rPr>
-      </w:pPr>
-      <w:r>
-        <w:rPr>
-          <w:rFonts w:hint="default" w:ascii="Arial" w:hAnsi="Arial" w:cs="Arial"/>
-          <w:color w:val="1F1F1F"/>
-          <w:lang w:val="en-US"/>
-        </w:rPr>
-        <w:t xml:space="preserve">After clicking the card, it will shows all the details about the deleted events and button for approve and edit request. </w:t>
-      </w:r>
-    </w:p>
-    <w:p>
-      <w:pPr>
-        <w:pStyle w:val="6"/>
-        <w:numPr>
-          <w:numId w:val="0"/>
-        </w:numPr>
-        <w:shd w:val="clear" w:color="auto" w:fill="FFFFFF"/>
-        <w:spacing w:before="0" w:beforeAutospacing="0" w:after="0" w:afterAutospacing="0" w:line="240" w:lineRule="auto"/>
-        <w:rPr>
-          <w:rFonts w:hint="default" w:ascii="Arial" w:hAnsi="Arial" w:cs="Arial"/>
-          <w:color w:val="1F1F1F"/>
-          <w:lang w:val="en-US"/>
-        </w:rPr>
-      </w:pPr>
-    </w:p>
-    <w:p>
-      <w:pPr>
-        <w:pStyle w:val="6"/>
-        <w:numPr>
-          <w:numId w:val="0"/>
-        </w:numPr>
-        <w:shd w:val="clear" w:color="auto" w:fill="FFFFFF"/>
-        <w:spacing w:before="0" w:beforeAutospacing="0" w:after="0" w:afterAutospacing="0" w:line="240" w:lineRule="auto"/>
-        <w:rPr>
-          <w:rFonts w:hint="default" w:ascii="Arial" w:hAnsi="Arial" w:cs="Arial"/>
-          <w:color w:val="1F1F1F"/>
-          <w:lang w:val="en-US"/>
-        </w:rPr>
-      </w:pPr>
-    </w:p>
-    <w:p>
-      <w:pPr>
-        <w:pStyle w:val="6"/>
-        <w:numPr>
-          <w:numId w:val="0"/>
-        </w:numPr>
-        <w:shd w:val="clear" w:color="auto" w:fill="FFFFFF"/>
-        <w:spacing w:before="0" w:beforeAutospacing="0" w:after="0" w:afterAutospacing="0" w:line="240" w:lineRule="auto"/>
-        <w:rPr>
-          <w:rFonts w:hint="default" w:ascii="Arial" w:hAnsi="Arial" w:cs="Arial"/>
-          <w:color w:val="1F1F1F"/>
-          <w:lang w:val="en-US"/>
-        </w:rPr>
-      </w:pPr>
-      <w:r>
-        <w:rPr>
-          <w:rFonts w:hint="default" w:ascii="Arial" w:hAnsi="Arial" w:cs="Arial"/>
-          <w:color w:val="1F1F1F"/>
-          <w:lang w:val="en-US"/>
-        </w:rPr>
-        <w:t xml:space="preserve">Make the changes in the admin.html page and make sure that the database schema is updated for holding all the changes in proper way. </w:t>
+        <w:t>Reporter name (if want show in public)</w:t>
       </w:r>
     </w:p>
     <w:p>
@@ -3409,72 +4165,69 @@
       <w:pPr>
         <w:pStyle w:val="6"/>
         <w:numPr>
-          <w:ilvl w:val="0"/>
-          <w:numId w:val="15"/>
-        </w:numPr>
-        <w:shd w:val="clear" w:color="auto" w:fill="FFFFFF"/>
-        <w:spacing w:before="0" w:beforeAutospacing="0" w:after="0" w:afterAutospacing="0" w:line="240" w:lineRule="auto"/>
-        <w:rPr>
-          <w:rFonts w:hint="default" w:ascii="Arial" w:hAnsi="Arial" w:cs="Arial"/>
-          <w:color w:val="1F1F1F"/>
-          <w:lang w:val="en-US"/>
-        </w:rPr>
-      </w:pPr>
-      <w:r>
-        <w:rPr>
-          <w:rFonts w:hint="default" w:ascii="Arial" w:hAnsi="Arial" w:cs="Arial"/>
-          <w:color w:val="1F1F1F"/>
-          <w:lang w:val="en-US"/>
-        </w:rPr>
-        <w:t>Make sure the admin homepage is enough user friendly for the admin panel</w:t>
-      </w:r>
-    </w:p>
-    <w:p>
-      <w:pPr>
-        <w:pStyle w:val="6"/>
-        <w:numPr>
-          <w:ilvl w:val="0"/>
-          <w:numId w:val="15"/>
-        </w:numPr>
-        <w:shd w:val="clear" w:color="auto" w:fill="FFFFFF"/>
-        <w:spacing w:before="0" w:beforeAutospacing="0" w:after="0" w:afterAutospacing="0" w:line="240" w:lineRule="auto"/>
-        <w:rPr>
-          <w:rFonts w:hint="default" w:ascii="Arial" w:hAnsi="Arial" w:cs="Arial"/>
-          <w:color w:val="1F1F1F"/>
-          <w:lang w:val="en-US"/>
-        </w:rPr>
-      </w:pPr>
-      <w:r>
-        <w:rPr>
-          <w:rFonts w:hint="default" w:ascii="Arial" w:hAnsi="Arial" w:cs="Arial"/>
-          <w:color w:val="1F1F1F"/>
-          <w:lang w:val="en-US"/>
-        </w:rPr>
-        <w:t>Make spaces for holding imposter list, reporter list and admin list.</w:t>
-      </w:r>
-    </w:p>
-    <w:p>
-      <w:pPr>
-        <w:pStyle w:val="6"/>
-        <w:numPr>
-          <w:ilvl w:val="0"/>
-          <w:numId w:val="15"/>
-        </w:numPr>
-        <w:shd w:val="clear" w:color="auto" w:fill="FFFFFF"/>
-        <w:spacing w:before="0" w:beforeAutospacing="0" w:after="0" w:afterAutospacing="0" w:line="240" w:lineRule="auto"/>
-        <w:rPr>
-          <w:rFonts w:hint="default" w:ascii="Arial" w:hAnsi="Arial" w:cs="Arial"/>
-          <w:color w:val="1F1F1F"/>
-          <w:lang w:val="en-US"/>
-        </w:rPr>
-      </w:pPr>
-      <w:r>
-        <w:rPr>
-          <w:rFonts w:hint="default" w:ascii="Arial" w:hAnsi="Arial" w:cs="Arial"/>
-          <w:color w:val="1F1F1F"/>
-          <w:lang w:val="en-US"/>
-        </w:rPr>
-        <w:t>Each item should be different with relevant color. Like  - light red for delete list, light green for live list and so on.</w:t>
+          <w:numId w:val="0"/>
+        </w:numPr>
+        <w:shd w:val="clear" w:color="auto" w:fill="FFFFFF"/>
+        <w:spacing w:before="0" w:beforeAutospacing="0" w:after="0" w:afterAutospacing="0" w:line="240" w:lineRule="auto"/>
+        <w:rPr>
+          <w:rFonts w:hint="default" w:ascii="Arial" w:hAnsi="Arial" w:cs="Arial"/>
+          <w:color w:val="1F1F1F"/>
+          <w:lang w:val="en-US"/>
+        </w:rPr>
+      </w:pPr>
+      <w:r>
+        <w:rPr>
+          <w:rFonts w:hint="default" w:ascii="Arial" w:hAnsi="Arial" w:cs="Arial"/>
+          <w:color w:val="1F1F1F"/>
+          <w:lang w:val="en-US"/>
+        </w:rPr>
+        <w:t>Fraud events page url must be unique for each events (user may share the link with others)</w:t>
+      </w:r>
+    </w:p>
+    <w:p>
+      <w:pPr>
+        <w:pStyle w:val="6"/>
+        <w:numPr>
+          <w:numId w:val="0"/>
+        </w:numPr>
+        <w:shd w:val="clear" w:color="auto" w:fill="FFFFFF"/>
+        <w:spacing w:before="0" w:beforeAutospacing="0" w:after="0" w:afterAutospacing="0" w:line="240" w:lineRule="auto"/>
+        <w:rPr>
+          <w:rFonts w:hint="default" w:ascii="Arial" w:hAnsi="Arial" w:cs="Arial"/>
+          <w:color w:val="1F1F1F"/>
+          <w:lang w:val="en-US"/>
+        </w:rPr>
+      </w:pPr>
+      <w:r>
+        <w:rPr>
+          <w:rFonts w:hint="default" w:ascii="Arial" w:hAnsi="Arial" w:cs="Arial"/>
+          <w:color w:val="1F1F1F"/>
+          <w:lang w:val="en-US"/>
+        </w:rPr>
+        <w:t>Imposter profile details url must be unique for each imposter</w:t>
+      </w:r>
+    </w:p>
+    <w:p>
+      <w:pPr>
+        <w:pStyle w:val="6"/>
+        <w:numPr>
+          <w:numId w:val="0"/>
+        </w:numPr>
+        <w:shd w:val="clear" w:color="auto" w:fill="FFFFFF"/>
+        <w:spacing w:before="0" w:beforeAutospacing="0" w:after="0" w:afterAutospacing="0" w:line="240" w:lineRule="auto"/>
+        <w:rPr>
+          <w:rFonts w:hint="default" w:ascii="Arial" w:hAnsi="Arial" w:cs="Arial"/>
+          <w:color w:val="1F1F1F"/>
+          <w:lang w:val="en-US"/>
+        </w:rPr>
+      </w:pPr>
+      <w:r>
+        <w:rPr>
+          <w:rFonts w:hint="default" w:ascii="Arial" w:hAnsi="Arial" w:cs="Arial"/>
+          <w:color w:val="1F1F1F"/>
+          <w:lang w:val="en-US"/>
+        </w:rPr>
+        <w:t xml:space="preserve">If no information is found, the helper message should be shown in the homepage with adding incident with the search item. </w:t>
       </w:r>
     </w:p>
     <w:sectPr>
@@ -3552,6 +4305,30 @@
     </w:lvl>
   </w:abstractNum>
   <w:abstractNum w:abstractNumId="1">
+    <w:nsid w:val="A869B64E"/>
+    <w:multiLevelType w:val="singleLevel"/>
+    <w:tmpl w:val="A869B64E"/>
+    <w:lvl w:ilvl="0" w:tentative="0">
+      <w:start w:val="1"/>
+      <w:numFmt w:val="upperLetter"/>
+      <w:suff w:val="space"/>
+      <w:lvlText w:val="%1."/>
+      <w:lvlJc w:val="left"/>
+    </w:lvl>
+  </w:abstractNum>
+  <w:abstractNum w:abstractNumId="2">
+    <w:nsid w:val="B3928AB1"/>
+    <w:multiLevelType w:val="singleLevel"/>
+    <w:tmpl w:val="B3928AB1"/>
+    <w:lvl w:ilvl="0" w:tentative="0">
+      <w:start w:val="1"/>
+      <w:numFmt w:val="upperLetter"/>
+      <w:suff w:val="space"/>
+      <w:lvlText w:val="%1."/>
+      <w:lvlJc w:val="left"/>
+    </w:lvl>
+  </w:abstractNum>
+  <w:abstractNum w:abstractNumId="3">
     <w:nsid w:val="B9B5C73F"/>
     <w:multiLevelType w:val="singleLevel"/>
     <w:tmpl w:val="B9B5C73F"/>
@@ -3563,7 +4340,7 @@
       <w:lvlJc w:val="left"/>
     </w:lvl>
   </w:abstractNum>
-  <w:abstractNum w:abstractNumId="2">
+  <w:abstractNum w:abstractNumId="4">
     <w:nsid w:val="DF8183C2"/>
     <w:multiLevelType w:val="singleLevel"/>
     <w:tmpl w:val="DF8183C2"/>
@@ -3575,7 +4352,7 @@
       <w:lvlJc w:val="left"/>
     </w:lvl>
   </w:abstractNum>
-  <w:abstractNum w:abstractNumId="3">
+  <w:abstractNum w:abstractNumId="5">
     <w:nsid w:val="F5F137AA"/>
     <w:multiLevelType w:val="singleLevel"/>
     <w:tmpl w:val="F5F137AA"/>
@@ -3587,7 +4364,7 @@
       <w:lvlJc w:val="left"/>
     </w:lvl>
   </w:abstractNum>
-  <w:abstractNum w:abstractNumId="4">
+  <w:abstractNum w:abstractNumId="6">
     <w:nsid w:val="037D6EA2"/>
     <w:multiLevelType w:val="multilevel"/>
     <w:tmpl w:val="037D6EA2"/>
@@ -3676,7 +4453,7 @@
       </w:pPr>
     </w:lvl>
   </w:abstractNum>
-  <w:abstractNum w:abstractNumId="5">
+  <w:abstractNum w:abstractNumId="7">
     <w:nsid w:val="04D1DF3B"/>
     <w:multiLevelType w:val="singleLevel"/>
     <w:tmpl w:val="04D1DF3B"/>
@@ -3688,7 +4465,7 @@
       <w:lvlJc w:val="left"/>
     </w:lvl>
   </w:abstractNum>
-  <w:abstractNum w:abstractNumId="6">
+  <w:abstractNum w:abstractNumId="8">
     <w:nsid w:val="0EAF9BE1"/>
     <w:multiLevelType w:val="singleLevel"/>
     <w:tmpl w:val="0EAF9BE1"/>
@@ -3700,7 +4477,7 @@
       <w:lvlJc w:val="left"/>
     </w:lvl>
   </w:abstractNum>
-  <w:abstractNum w:abstractNumId="7">
+  <w:abstractNum w:abstractNumId="9">
     <w:nsid w:val="105B1DA6"/>
     <w:multiLevelType w:val="multilevel"/>
     <w:tmpl w:val="105B1DA6"/>
@@ -3789,7 +4566,7 @@
       </w:pPr>
     </w:lvl>
   </w:abstractNum>
-  <w:abstractNum w:abstractNumId="8">
+  <w:abstractNum w:abstractNumId="10">
     <w:nsid w:val="3D60E1B1"/>
     <w:multiLevelType w:val="singleLevel"/>
     <w:tmpl w:val="3D60E1B1"/>
@@ -3801,7 +4578,7 @@
       <w:lvlJc w:val="left"/>
     </w:lvl>
   </w:abstractNum>
-  <w:abstractNum w:abstractNumId="9">
+  <w:abstractNum w:abstractNumId="11">
     <w:nsid w:val="47429A61"/>
     <w:multiLevelType w:val="singleLevel"/>
     <w:tmpl w:val="47429A61"/>
@@ -3813,7 +4590,7 @@
       <w:lvlJc w:val="left"/>
     </w:lvl>
   </w:abstractNum>
-  <w:abstractNum w:abstractNumId="10">
+  <w:abstractNum w:abstractNumId="12">
     <w:nsid w:val="6A409F4A"/>
     <w:multiLevelType w:val="singleLevel"/>
     <w:tmpl w:val="6A409F4A"/>
@@ -3825,7 +4602,7 @@
       <w:lvlJc w:val="left"/>
     </w:lvl>
   </w:abstractNum>
-  <w:abstractNum w:abstractNumId="11">
+  <w:abstractNum w:abstractNumId="13">
     <w:nsid w:val="6E572D43"/>
     <w:multiLevelType w:val="singleLevel"/>
     <w:tmpl w:val="6E572D43"/>
@@ -3840,7 +4617,7 @@
       </w:pPr>
     </w:lvl>
   </w:abstractNum>
-  <w:abstractNum w:abstractNumId="12">
+  <w:abstractNum w:abstractNumId="14">
     <w:nsid w:val="73420BB4"/>
     <w:multiLevelType w:val="multilevel"/>
     <w:tmpl w:val="73420BB4"/>
@@ -3929,7 +4706,7 @@
       </w:pPr>
     </w:lvl>
   </w:abstractNum>
-  <w:abstractNum w:abstractNumId="13">
+  <w:abstractNum w:abstractNumId="15">
     <w:nsid w:val="768D6D45"/>
     <w:multiLevelType w:val="singleLevel"/>
     <w:tmpl w:val="768D6D45"/>
@@ -3941,7 +4718,7 @@
       <w:lvlJc w:val="left"/>
     </w:lvl>
   </w:abstractNum>
-  <w:abstractNum w:abstractNumId="14">
+  <w:abstractNum w:abstractNumId="16">
     <w:nsid w:val="79492D55"/>
     <w:multiLevelType w:val="multilevel"/>
     <w:tmpl w:val="79492D55"/>
@@ -4031,49 +4808,55 @@
     </w:lvl>
   </w:abstractNum>
   <w:num w:numId="1">
-    <w:abstractNumId w:val="7"/>
+    <w:abstractNumId w:val="9"/>
   </w:num>
   <w:num w:numId="2">
+    <w:abstractNumId w:val="6"/>
+  </w:num>
+  <w:num w:numId="3">
+    <w:abstractNumId w:val="14"/>
+  </w:num>
+  <w:num w:numId="4">
+    <w:abstractNumId w:val="16"/>
+  </w:num>
+  <w:num w:numId="5">
+    <w:abstractNumId w:val="13"/>
+  </w:num>
+  <w:num w:numId="6">
+    <w:abstractNumId w:val="8"/>
+  </w:num>
+  <w:num w:numId="7">
+    <w:abstractNumId w:val="3"/>
+  </w:num>
+  <w:num w:numId="8">
+    <w:abstractNumId w:val="15"/>
+  </w:num>
+  <w:num w:numId="9">
     <w:abstractNumId w:val="4"/>
   </w:num>
-  <w:num w:numId="3">
-    <w:abstractNumId w:val="12"/>
+  <w:num w:numId="10">
+    <w:abstractNumId w:val="5"/>
   </w:num>
-  <w:num w:numId="4">
-    <w:abstractNumId w:val="14"/>
-  </w:num>
-  <w:num w:numId="5">
+  <w:num w:numId="11">
     <w:abstractNumId w:val="11"/>
   </w:num>
-  <w:num w:numId="6">
-    <w:abstractNumId w:val="6"/>
-  </w:num>
-  <w:num w:numId="7">
-    <w:abstractNumId w:val="1"/>
-  </w:num>
-  <w:num w:numId="8">
-    <w:abstractNumId w:val="13"/>
-  </w:num>
-  <w:num w:numId="9">
-    <w:abstractNumId w:val="2"/>
-  </w:num>
-  <w:num w:numId="10">
-    <w:abstractNumId w:val="3"/>
-  </w:num>
-  <w:num w:numId="11">
-    <w:abstractNumId w:val="9"/>
-  </w:num>
   <w:num w:numId="12">
-    <w:abstractNumId w:val="10"/>
+    <w:abstractNumId w:val="12"/>
   </w:num>
   <w:num w:numId="13">
     <w:abstractNumId w:val="0"/>
   </w:num>
   <w:num w:numId="14">
-    <w:abstractNumId w:val="8"/>
+    <w:abstractNumId w:val="10"/>
   </w:num>
   <w:num w:numId="15">
-    <w:abstractNumId w:val="5"/>
+    <w:abstractNumId w:val="7"/>
+  </w:num>
+  <w:num w:numId="16">
+    <w:abstractNumId w:val="2"/>
+  </w:num>
+  <w:num w:numId="17">
+    <w:abstractNumId w:val="1"/>
   </w:num>
 </w:numbering>
 </file>
@@ -4239,12 +5022,12 @@
     <w:lsdException w:uiPriority="99" w:name="Balloon Text"/>
     <w:lsdException w:unhideWhenUsed="0" w:uiPriority="39" w:semiHidden="0" w:name="Table Grid"/>
     <w:lsdException w:uiPriority="99" w:name="Table Theme"/>
-    <w:lsdException w:unhideWhenUsed="0" w:uiPriority="60" w:semiHidden="0" w:name="Light Shading"/>
+    <w:lsdException w:qFormat="1" w:unhideWhenUsed="0" w:uiPriority="60" w:semiHidden="0" w:name="Light Shading"/>
     <w:lsdException w:unhideWhenUsed="0" w:uiPriority="61" w:semiHidden="0" w:name="Light List"/>
     <w:lsdException w:unhideWhenUsed="0" w:uiPriority="62" w:semiHidden="0" w:name="Light Grid"/>
     <w:lsdException w:unhideWhenUsed="0" w:uiPriority="63" w:semiHidden="0" w:name="Medium Shading 1"/>
     <w:lsdException w:unhideWhenUsed="0" w:uiPriority="64" w:semiHidden="0" w:name="Medium Shading 2"/>
-    <w:lsdException w:unhideWhenUsed="0" w:uiPriority="65" w:semiHidden="0" w:name="Medium List 1"/>
+    <w:lsdException w:qFormat="1" w:unhideWhenUsed="0" w:uiPriority="65" w:semiHidden="0" w:name="Medium List 1"/>
     <w:lsdException w:unhideWhenUsed="0" w:uiPriority="66" w:semiHidden="0" w:name="Medium List 2"/>
     <w:lsdException w:unhideWhenUsed="0" w:uiPriority="67" w:semiHidden="0" w:name="Medium Grid 1"/>
     <w:lsdException w:unhideWhenUsed="0" w:uiPriority="68" w:semiHidden="0" w:name="Medium Grid 2"/>
@@ -4255,7 +5038,7 @@
     <w:lsdException w:unhideWhenUsed="0" w:uiPriority="73" w:semiHidden="0" w:name="Colorful Grid"/>
     <w:lsdException w:unhideWhenUsed="0" w:uiPriority="60" w:semiHidden="0" w:name="Light Shading Accent 1"/>
     <w:lsdException w:unhideWhenUsed="0" w:uiPriority="61" w:semiHidden="0" w:name="Light List Accent 1"/>
-    <w:lsdException w:unhideWhenUsed="0" w:uiPriority="62" w:semiHidden="0" w:name="Light Grid Accent 1"/>
+    <w:lsdException w:qFormat="1" w:unhideWhenUsed="0" w:uiPriority="62" w:semiHidden="0" w:name="Light Grid Accent 1"/>
     <w:lsdException w:unhideWhenUsed="0" w:uiPriority="63" w:semiHidden="0" w:name="Medium Shading 1 Accent 1"/>
     <w:lsdException w:unhideWhenUsed="0" w:uiPriority="64" w:semiHidden="0" w:name="Medium Shading 2 Accent 1"/>
     <w:lsdException w:unhideWhenUsed="0" w:uiPriority="65" w:semiHidden="0" w:name="Medium List 1 Accent 1"/>
@@ -4269,21 +5052,21 @@
     <w:lsdException w:unhideWhenUsed="0" w:uiPriority="72" w:semiHidden="0" w:name="Colorful List Accent 1"/>
     <w:lsdException w:unhideWhenUsed="0" w:uiPriority="73" w:semiHidden="0" w:name="Colorful Grid Accent 1"/>
     <w:lsdException w:unhideWhenUsed="0" w:uiPriority="60" w:semiHidden="0" w:name="Light Shading Accent 2"/>
-    <w:lsdException w:unhideWhenUsed="0" w:uiPriority="61" w:semiHidden="0" w:name="Light List Accent 2"/>
-    <w:lsdException w:unhideWhenUsed="0" w:uiPriority="62" w:semiHidden="0" w:name="Light Grid Accent 2"/>
+    <w:lsdException w:qFormat="1" w:unhideWhenUsed="0" w:uiPriority="61" w:semiHidden="0" w:name="Light List Accent 2"/>
+    <w:lsdException w:qFormat="1" w:unhideWhenUsed="0" w:uiPriority="62" w:semiHidden="0" w:name="Light Grid Accent 2"/>
     <w:lsdException w:unhideWhenUsed="0" w:uiPriority="63" w:semiHidden="0" w:name="Medium Shading 1 Accent 2"/>
     <w:lsdException w:unhideWhenUsed="0" w:uiPriority="64" w:semiHidden="0" w:name="Medium Shading 2 Accent 2"/>
-    <w:lsdException w:unhideWhenUsed="0" w:uiPriority="65" w:semiHidden="0" w:name="Medium List 1 Accent 2"/>
+    <w:lsdException w:qFormat="1" w:unhideWhenUsed="0" w:uiPriority="65" w:semiHidden="0" w:name="Medium List 1 Accent 2"/>
     <w:lsdException w:unhideWhenUsed="0" w:uiPriority="66" w:semiHidden="0" w:name="Medium List 2 Accent 2"/>
     <w:lsdException w:unhideWhenUsed="0" w:uiPriority="67" w:semiHidden="0" w:name="Medium Grid 1 Accent 2"/>
     <w:lsdException w:unhideWhenUsed="0" w:uiPriority="68" w:semiHidden="0" w:name="Medium Grid 2 Accent 2"/>
     <w:lsdException w:unhideWhenUsed="0" w:uiPriority="69" w:semiHidden="0" w:name="Medium Grid 3 Accent 2"/>
     <w:lsdException w:unhideWhenUsed="0" w:uiPriority="70" w:semiHidden="0" w:name="Dark List Accent 2"/>
     <w:lsdException w:unhideWhenUsed="0" w:uiPriority="71" w:semiHidden="0" w:name="Colorful Shading Accent 2"/>
-    <w:lsdException w:unhideWhenUsed="0" w:uiPriority="72" w:semiHidden="0" w:name="Colorful List Accent 2"/>
+    <w:lsdException w:qFormat="1" w:unhideWhenUsed="0" w:uiPriority="72" w:semiHidden="0" w:name="Colorful List Accent 2"/>
     <w:lsdException w:unhideWhenUsed="0" w:uiPriority="73" w:semiHidden="0" w:name="Colorful Grid Accent 2"/>
     <w:lsdException w:unhideWhenUsed="0" w:uiPriority="60" w:semiHidden="0" w:name="Light Shading Accent 3"/>
-    <w:lsdException w:unhideWhenUsed="0" w:uiPriority="61" w:semiHidden="0" w:name="Light List Accent 3"/>
+    <w:lsdException w:qFormat="1" w:unhideWhenUsed="0" w:uiPriority="61" w:semiHidden="0" w:name="Light List Accent 3"/>
     <w:lsdException w:unhideWhenUsed="0" w:uiPriority="62" w:semiHidden="0" w:name="Light Grid Accent 3"/>
     <w:lsdException w:unhideWhenUsed="0" w:uiPriority="63" w:semiHidden="0" w:name="Medium Shading 1 Accent 3"/>
     <w:lsdException w:unhideWhenUsed="0" w:uiPriority="64" w:semiHidden="0" w:name="Medium Shading 2 Accent 3"/>
@@ -4298,7 +5081,7 @@
     <w:lsdException w:unhideWhenUsed="0" w:uiPriority="73" w:semiHidden="0" w:name="Colorful Grid Accent 3"/>
     <w:lsdException w:unhideWhenUsed="0" w:uiPriority="60" w:semiHidden="0" w:name="Light Shading Accent 4"/>
     <w:lsdException w:unhideWhenUsed="0" w:uiPriority="61" w:semiHidden="0" w:name="Light List Accent 4"/>
-    <w:lsdException w:unhideWhenUsed="0" w:uiPriority="62" w:semiHidden="0" w:name="Light Grid Accent 4"/>
+    <w:lsdException w:qFormat="1" w:unhideWhenUsed="0" w:uiPriority="62" w:semiHidden="0" w:name="Light Grid Accent 4"/>
     <w:lsdException w:unhideWhenUsed="0" w:uiPriority="63" w:semiHidden="0" w:name="Medium Shading 1 Accent 4"/>
     <w:lsdException w:unhideWhenUsed="0" w:uiPriority="64" w:semiHidden="0" w:name="Medium Shading 2 Accent 4"/>
     <w:lsdException w:unhideWhenUsed="0" w:uiPriority="65" w:semiHidden="0" w:name="Medium List 1 Accent 4"/>
@@ -4324,10 +5107,10 @@
     <w:lsdException w:unhideWhenUsed="0" w:uiPriority="71" w:semiHidden="0" w:name="Colorful Shading Accent 5"/>
     <w:lsdException w:unhideWhenUsed="0" w:uiPriority="72" w:semiHidden="0" w:name="Colorful List Accent 5"/>
     <w:lsdException w:unhideWhenUsed="0" w:uiPriority="73" w:semiHidden="0" w:name="Colorful Grid Accent 5"/>
-    <w:lsdException w:unhideWhenUsed="0" w:uiPriority="60" w:semiHidden="0" w:name="Light Shading Accent 6"/>
+    <w:lsdException w:qFormat="1" w:unhideWhenUsed="0" w:uiPriority="60" w:semiHidden="0" w:name="Light Shading Accent 6"/>
     <w:lsdException w:unhideWhenUsed="0" w:uiPriority="61" w:semiHidden="0" w:name="Light List Accent 6"/>
-    <w:lsdException w:unhideWhenUsed="0" w:uiPriority="62" w:semiHidden="0" w:name="Light Grid Accent 6"/>
-    <w:lsdException w:unhideWhenUsed="0" w:uiPriority="63" w:semiHidden="0" w:name="Medium Shading 1 Accent 6"/>
+    <w:lsdException w:qFormat="1" w:unhideWhenUsed="0" w:uiPriority="62" w:semiHidden="0" w:name="Light Grid Accent 6"/>
+    <w:lsdException w:qFormat="1" w:unhideWhenUsed="0" w:uiPriority="63" w:semiHidden="0" w:name="Medium Shading 1 Accent 6"/>
     <w:lsdException w:unhideWhenUsed="0" w:uiPriority="64" w:semiHidden="0" w:name="Medium Shading 2 Accent 6"/>
     <w:lsdException w:unhideWhenUsed="0" w:uiPriority="65" w:semiHidden="0" w:name="Medium List 1 Accent 6"/>
     <w:lsdException w:unhideWhenUsed="0" w:uiPriority="66" w:semiHidden="0" w:name="Medium List 2 Accent 6"/>
@@ -4431,6 +5214,7 @@
     <w:name w:val="Footer Char"/>
     <w:basedOn w:val="2"/>
     <w:link w:val="4"/>
+    <w:qFormat/>
     <w:uiPriority w:val="99"/>
   </w:style>
   <w:style w:type="paragraph" w:styleId="9">

</xml_diff>